<commit_message>
refator: docs fix: openSet.includes(neighbor) logic
</commit_message>
<xml_diff>
--- a/8-PuzzleGameandSolver/Documentation/8-Puzzle Project.docx
+++ b/8-PuzzleGameandSolver/Documentation/8-Puzzle Project.docx
@@ -1,6 +1,6 @@
 
 <file path=word/document.xml><?xml version="1.0" encoding="utf-8"?>
-<w:document xmlns:wpc="http://schemas.microsoft.com/office/word/2010/wordprocessingCanvas" xmlns:cx="http://schemas.microsoft.com/office/drawing/2014/chartex" xmlns:cx1="http://schemas.microsoft.com/office/drawing/2015/9/8/chartex" xmlns:cx2="http://schemas.microsoft.com/office/drawing/2015/10/21/chartex" xmlns:cx3="http://schemas.microsoft.com/office/drawing/2016/5/9/chartex" xmlns:cx4="http://schemas.microsoft.com/office/drawing/2016/5/10/chartex" xmlns:cx5="http://schemas.microsoft.com/office/drawing/2016/5/11/chartex" xmlns:cx6="http://schemas.microsoft.com/office/drawing/2016/5/12/chartex" xmlns:cx7="http://schemas.microsoft.com/office/drawing/2016/5/13/chartex" xmlns:cx8="http://schemas.microsoft.com/office/drawing/2016/5/14/chartex" xmlns:mc="http://schemas.openxmlformats.org/markup-compatibility/2006" xmlns:aink="http://schemas.microsoft.com/office/drawing/2016/ink" xmlns:am3d="http://schemas.microsoft.com/office/drawing/2017/model3d" xmlns:o="urn:schemas-microsoft-com:office:office" xmlns:oel="http://schemas.microsoft.com/office/2019/extlst" xmlns:r="http://schemas.openxmlformats.org/officeDocument/2006/relationships" xmlns:m="http://schemas.openxmlformats.org/officeDocument/2006/math" xmlns:v="urn:schemas-microsoft-com:vml" xmlns:wp14="http://schemas.microsoft.com/office/word/2010/wordprocessingDrawing" xmlns:wp="http://schemas.openxmlformats.org/drawingml/2006/wordprocessingDrawing" xmlns:w10="urn:schemas-microsoft-com:office:word" xmlns:w="http://schemas.openxmlformats.org/wordprocessingml/2006/main" xmlns:w14="http://schemas.microsoft.com/office/word/2010/wordml" xmlns:w15="http://schemas.microsoft.com/office/word/2012/wordml" xmlns:w16cex="http://schemas.microsoft.com/office/word/2018/wordml/cex" xmlns:w16cid="http://schemas.microsoft.com/office/word/2016/wordml/cid" xmlns:w16="http://schemas.microsoft.com/office/word/2018/wordml" xmlns:w16du="http://schemas.microsoft.com/office/word/2023/wordml/word16du" xmlns:w16sdtdh="http://schemas.microsoft.com/office/word/2020/wordml/sdtdatahash" xmlns:w16se="http://schemas.microsoft.com/office/word/2015/wordml/symex" xmlns:wpg="http://schemas.microsoft.com/office/word/2010/wordprocessingGroup" xmlns:wpi="http://schemas.microsoft.com/office/word/2010/wordprocessingInk" xmlns:wne="http://schemas.microsoft.com/office/word/2006/wordml" xmlns:wps="http://schemas.microsoft.com/office/word/2010/wordprocessingShape" mc:Ignorable="w14 w15 w16se w16cid w16 w16cex w16sdtdh w16du wp14">
+<w:document xmlns:wpc="http://schemas.microsoft.com/office/word/2010/wordprocessingCanvas" xmlns:cx="http://schemas.microsoft.com/office/drawing/2014/chartex" xmlns:cx1="http://schemas.microsoft.com/office/drawing/2015/9/8/chartex" xmlns:cx2="http://schemas.microsoft.com/office/drawing/2015/10/21/chartex" xmlns:cx3="http://schemas.microsoft.com/office/drawing/2016/5/9/chartex" xmlns:cx4="http://schemas.microsoft.com/office/drawing/2016/5/10/chartex" xmlns:cx5="http://schemas.microsoft.com/office/drawing/2016/5/11/chartex" xmlns:cx6="http://schemas.microsoft.com/office/drawing/2016/5/12/chartex" xmlns:cx7="http://schemas.microsoft.com/office/drawing/2016/5/13/chartex" xmlns:cx8="http://schemas.microsoft.com/office/drawing/2016/5/14/chartex" xmlns:mc="http://schemas.openxmlformats.org/markup-compatibility/2006" xmlns:m="http://schemas.openxmlformats.org/officeDocument/2006/math" xmlns:aink="http://schemas.microsoft.com/office/drawing/2016/ink" xmlns:am3d="http://schemas.microsoft.com/office/drawing/2017/model3d" xmlns:oel="http://schemas.microsoft.com/office/2019/extlst" xmlns:r="http://schemas.openxmlformats.org/officeDocument/2006/relationships" xmlns:wp14="http://schemas.microsoft.com/office/word/2010/wordprocessingDrawing" xmlns:wp="http://schemas.openxmlformats.org/drawingml/2006/wordprocessingDrawing" xmlns:wpg="http://schemas.microsoft.com/office/word/2010/wordprocessingGroup" xmlns:wpi="http://schemas.microsoft.com/office/word/2010/wordprocessingInk" xmlns:wps="http://schemas.microsoft.com/office/word/2010/wordprocessingShape" xmlns:o="urn:schemas-microsoft-com:office:office" xmlns:v="urn:schemas-microsoft-com:vml" xmlns:w10="urn:schemas-microsoft-com:office:word" xmlns:w="http://schemas.openxmlformats.org/wordprocessingml/2006/main" xmlns:w14="http://schemas.microsoft.com/office/word/2010/wordml" xmlns:w15="http://schemas.microsoft.com/office/word/2012/wordml" xmlns:w16cei="http://schemas.microsoft.com/office/word/2026/wordml/cei" xmlns:w16cex="http://schemas.microsoft.com/office/word/2018/wordml/cex" xmlns:w16cid="http://schemas.microsoft.com/office/word/2016/wordml/cid" xmlns:w16="http://schemas.microsoft.com/office/word/2018/wordml" xmlns:w16sdtdh="http://schemas.microsoft.com/office/word/2020/wordml/sdtdatahash" xmlns:w16sdtfl="http://schemas.microsoft.com/office/word/2024/wordml/sdtformatlock" xmlns:w16se="http://schemas.microsoft.com/office/word/2015/wordml/symex" xmlns:w16du="http://schemas.microsoft.com/office/word/2023/wordml/word16du" xmlns:wne="http://schemas.microsoft.com/office/word/2006/wordml" mc:Ignorable="w14 w15 w16se w16cid w16 w16cex w16sdtdh w16sdtfl w16du wp14">
   <w:body>
     <w:p>
       <w:pPr>
@@ -651,7 +651,15 @@
           <w:b/>
           <w:i/>
         </w:rPr>
-        <w:t>Bachelors</w:t>
+        <w:t>Bachelor</w:t>
+      </w:r>
+      <w:r>
+        <w:rPr>
+          <w:rFonts w:eastAsia="Calibri"/>
+          <w:b/>
+          <w:i/>
+        </w:rPr>
+        <w:t>s</w:t>
       </w:r>
       <w:r>
         <w:rPr>
@@ -1297,6 +1305,9 @@
         <w:t>project</w:t>
       </w:r>
       <w:r>
+        <w:t>,</w:t>
+      </w:r>
+      <w:r>
         <w:rPr>
           <w:spacing w:val="1"/>
         </w:rPr>
@@ -1376,7 +1387,19 @@
         <w:t xml:space="preserve"> </w:t>
       </w:r>
       <w:r>
-        <w:t>requirements for the degree of Bachelor of Computer Application is recommended for the final</w:t>
+        <w:t>requirements for the degree of Bachelor</w:t>
+      </w:r>
+      <w:r>
+        <w:t>s</w:t>
+      </w:r>
+      <w:r>
+        <w:t xml:space="preserve"> of Computer Application </w:t>
+      </w:r>
+      <w:r>
+        <w:t>be</w:t>
+      </w:r>
+      <w:r>
+        <w:t xml:space="preserve"> recommended for the final</w:t>
       </w:r>
       <w:r>
         <w:rPr>
@@ -1457,7 +1480,13 @@
         <w:ind w:left="220"/>
       </w:pPr>
       <w:r>
-        <w:t xml:space="preserve"> Bachelors in Computer Application</w:t>
+        <w:t xml:space="preserve"> Bachelor</w:t>
+      </w:r>
+      <w:r>
+        <w:t>s</w:t>
+      </w:r>
+      <w:r>
+        <w:t xml:space="preserve"> in Computer Application</w:t>
       </w:r>
     </w:p>
     <w:p>
@@ -1816,7 +1845,19 @@
         <w:t xml:space="preserve"> </w:t>
       </w:r>
       <w:r>
-        <w:t>Bachelor in Computer Application has been evaluated. In our opinion it is satisfactory in the</w:t>
+        <w:t>Bachelor</w:t>
+      </w:r>
+      <w:r>
+        <w:t>s</w:t>
+      </w:r>
+      <w:r>
+        <w:t xml:space="preserve"> in Computer Application has been evaluated. In our opinion</w:t>
+      </w:r>
+      <w:r>
+        <w:t>,</w:t>
+      </w:r>
+      <w:r>
+        <w:t xml:space="preserve"> it is satisfactory in the</w:t>
       </w:r>
       <w:r>
         <w:rPr>
@@ -1982,7 +2023,19 @@
               <w:rPr>
                 <w:sz w:val="24"/>
               </w:rPr>
-              <w:t>Bachelors in Computer Application</w:t>
+              <w:t>Bachelor</w:t>
+            </w:r>
+            <w:r>
+              <w:rPr>
+                <w:sz w:val="24"/>
+              </w:rPr>
+              <w:t>s</w:t>
+            </w:r>
+            <w:r>
+              <w:rPr>
+                <w:sz w:val="24"/>
+              </w:rPr>
+              <w:t xml:space="preserve"> in Computer Application</w:t>
             </w:r>
           </w:p>
           <w:p>
@@ -2401,7 +2454,6 @@
           <w:szCs w:val="32"/>
         </w:rPr>
         <w:sectPr>
-          <w:footerReference w:type="default" r:id="rId10"/>
           <w:pgSz w:w="11906" w:h="16838" w:code="9"/>
           <w:pgMar w:top="1440" w:right="1440" w:bottom="1440" w:left="1800" w:header="720" w:footer="720" w:gutter="0"/>
           <w:pgNumType w:fmt="lowerRoman" w:start="1"/>
@@ -2447,7 +2499,16 @@
         <w:jc w:val="both"/>
       </w:pPr>
       <w:r>
-        <w:t>In the pursuit of project completion, numerous individuals have extended their benevolent blessings and unwavering support. It is with sincere appreciation that I seize this moment to extend my heartfelt gratitude to each contributor.</w:t>
+        <w:t>During the completion of this project, many individuals provided valuable guidance and support</w:t>
+      </w:r>
+      <w:r>
+        <w:t xml:space="preserve">. </w:t>
+      </w:r>
+      <w:r>
+        <w:t>I would like to express my sincere gratitude to everyone who contributed to this project</w:t>
+      </w:r>
+      <w:r>
+        <w:t>.</w:t>
       </w:r>
     </w:p>
     <w:p>
@@ -2456,7 +2517,10 @@
         <w:jc w:val="both"/>
       </w:pPr>
       <w:r>
-        <w:t>I am profoundly indebted to Tribhuvan University for affording this remarkable opportunity. My gratitude extends to D</w:t>
+        <w:t>I am grateful to Tribhuvan University for providing this opportunity</w:t>
+      </w:r>
+      <w:r>
+        <w:t>. My gratitude extends to D</w:t>
       </w:r>
       <w:r>
         <w:t>.</w:t>
@@ -2543,6 +2607,13 @@
           <w:bCs/>
         </w:rPr>
         <w:t>With Regards</w:t>
+      </w:r>
+      <w:r>
+        <w:rPr>
+          <w:b/>
+          <w:bCs/>
+        </w:rPr>
+        <w:t>,</w:t>
       </w:r>
     </w:p>
     <w:p>
@@ -4074,7 +4145,10 @@
                 <w:rStyle w:val="Hyperlink"/>
                 <w:noProof/>
               </w:rPr>
-              <w:t>3.1.3 Data Modeling</w:t>
+              <w:t xml:space="preserve">3.1.3 </w:t>
+            </w:r>
+            <w:r>
+              <w:t>System Flow</w:t>
             </w:r>
             <w:r>
               <w:rPr>
@@ -5103,7 +5177,31 @@
                 <w:rFonts w:eastAsia="Times New Roman"/>
                 <w:noProof/>
               </w:rPr>
-              <w:t>CHAPTER 5: CONCLUSION AND FUTURE RECOMMENDATION</w:t>
+              <w:t>CHAP</w:t>
+            </w:r>
+            <w:r>
+              <w:rPr>
+                <w:rStyle w:val="Hyperlink"/>
+                <w:rFonts w:eastAsia="Times New Roman"/>
+                <w:noProof/>
+              </w:rPr>
+              <w:t>T</w:t>
+            </w:r>
+            <w:r>
+              <w:rPr>
+                <w:rStyle w:val="Hyperlink"/>
+                <w:rFonts w:eastAsia="Times New Roman"/>
+                <w:noProof/>
+              </w:rPr>
+              <w:t>ER 5: CONCLUSION AND FUTURE RECOMMENDATION</w:t>
+            </w:r>
+            <w:r>
+              <w:rPr>
+                <w:rStyle w:val="Hyperlink"/>
+                <w:rFonts w:eastAsia="Times New Roman"/>
+                <w:noProof/>
+              </w:rPr>
+              <w:t>S</w:t>
             </w:r>
             <w:r>
               <w:rPr>
@@ -5251,7 +5349,14 @@
                 <w:rStyle w:val="Hyperlink"/>
                 <w:noProof/>
               </w:rPr>
-              <w:t>5.2 Lesson Learnt</w:t>
+              <w:t>5.2 Lesson Learn</w:t>
+            </w:r>
+            <w:r>
+              <w:rPr>
+                <w:rStyle w:val="Hyperlink"/>
+                <w:noProof/>
+              </w:rPr>
+              <w:t>ed</w:t>
             </w:r>
             <w:r>
               <w:rPr>
@@ -5279,20 +5384,16 @@
                 <w:noProof/>
                 <w:webHidden/>
               </w:rPr>
-            </w:r>
-            <w:r>
-              <w:rPr>
-                <w:noProof/>
-                <w:webHidden/>
-              </w:rPr>
               <w:fldChar w:fldCharType="separate"/>
             </w:r>
             <w:r>
               <w:rPr>
-                <w:noProof/>
-                <w:webHidden/>
-              </w:rPr>
-              <w:t>28</w:t>
+                <w:b/>
+                <w:bCs/>
+                <w:noProof/>
+                <w:webHidden/>
+              </w:rPr>
+              <w:t>Error! Bookmark not defined.</w:t>
             </w:r>
             <w:r>
               <w:rPr>
@@ -5329,6 +5430,13 @@
             </w:r>
             <w:r>
               <w:rPr>
+                <w:rStyle w:val="Hyperlink"/>
+                <w:noProof/>
+              </w:rPr>
+              <w:t>s</w:t>
+            </w:r>
+            <w:r>
+              <w:rPr>
                 <w:noProof/>
                 <w:webHidden/>
               </w:rPr>
@@ -5722,7 +5830,10 @@
         <w:t xml:space="preserve">           </w:t>
       </w:r>
       <w:r>
-        <w:t>Standard Query Language</w:t>
+        <w:t>Structured</w:t>
+      </w:r>
+      <w:r>
+        <w:t xml:space="preserve"> Query Language</w:t>
       </w:r>
     </w:p>
     <w:p>
@@ -5743,6 +5854,9 @@
       </w:r>
       <w:r>
         <w:t>Visual Studio</w:t>
+      </w:r>
+      <w:r>
+        <w:t xml:space="preserve"> Code</w:t>
       </w:r>
     </w:p>
     <w:p>
@@ -6479,7 +6593,21 @@
             <w:rStyle w:val="Hyperlink"/>
             <w:noProof/>
           </w:rPr>
-          <w:t>8-puzzle Game and Solver</w:t>
+          <w:t>8-</w:t>
+        </w:r>
+        <w:r>
+          <w:rPr>
+            <w:rStyle w:val="Hyperlink"/>
+            <w:noProof/>
+          </w:rPr>
+          <w:t>P</w:t>
+        </w:r>
+        <w:r>
+          <w:rPr>
+            <w:rStyle w:val="Hyperlink"/>
+            <w:noProof/>
+          </w:rPr>
+          <w:t>uzzle Game and Solver</w:t>
         </w:r>
         <w:r>
           <w:rPr>
@@ -7217,6 +7345,9 @@
           <w:fldChar w:fldCharType="end"/>
         </w:r>
       </w:hyperlink>
+      <w:r>
+        <w:t>7</w:t>
+      </w:r>
     </w:p>
     <w:p>
       <w:pPr>
@@ -7249,7 +7380,7 @@
         <w:pStyle w:val="Heading1"/>
         <w:spacing w:before="0" w:after="200"/>
         <w:sectPr>
-          <w:footerReference w:type="default" r:id="rId11"/>
+          <w:footerReference w:type="default" r:id="rId10"/>
           <w:pgSz w:w="11906" w:h="16838" w:code="9"/>
           <w:pgMar w:top="1440" w:right="1440" w:bottom="1440" w:left="1800" w:header="720" w:footer="720" w:gutter="0"/>
           <w:pgNumType w:fmt="lowerRoman" w:start="1"/>
@@ -7349,7 +7480,19 @@
         <w:jc w:val="both"/>
       </w:pPr>
       <w:r>
-        <w:t>The 8-Puzzle Game and Solver web application addresses these challenges by providing an interactive platform where users can play the game as well as solve it with ease and precision. Leveraging the powerful A* algorithm, the solver component of the application ensures that any puzzle configuration is solved efficiently and accurately. This eliminates the risk of frustration due to incorrect moves and offers an optimal solution every time. Additionally, the web-based nature of the application provides the convenience of solving puzzles from any device with a web browser and internet connection. The intuitive user interface and structured solving approach make it accessible and enjoyable for puzzle enthusiasts of all skill levels, enhancing both the gameplay and learning experience.</w:t>
+        <w:t>The 8-Puzzle Game and Solver web application addresses these challenges by providing an interactive platform where users can play the game as well as solve it with ease and precision. Leveraging the powerful A* algorithm, the solver component of the application ensures that any</w:t>
+      </w:r>
+      <w:r>
+        <w:t xml:space="preserve"> solvable</w:t>
+      </w:r>
+      <w:r>
+        <w:t xml:space="preserve"> puzzle configuration is solved efficiently and accurately. This eliminates the risk of frustration due to incorrect mo</w:t>
+      </w:r>
+      <w:r>
+        <w:t>ves</w:t>
+      </w:r>
+      <w:r>
+        <w:t>. Additionally, the web-based nature of the application provides the convenience of solving puzzles from any device with a web browser and internet connection. The intuitive user interface and structured solving approach make it accessible and enjoyable for puzzle enthusiasts of all skill levels, enhancing both the gameplay and learning experience.</w:t>
       </w:r>
     </w:p>
     <w:p>
@@ -7380,7 +7523,13 @@
         <w:t>T</w:t>
       </w:r>
       <w:r>
-        <w:t xml:space="preserve">he developed project helps users to </w:t>
+        <w:t xml:space="preserve">he developed project </w:t>
+      </w:r>
+      <w:r>
+        <w:t>allows</w:t>
+      </w:r>
+      <w:r>
+        <w:t xml:space="preserve"> users to </w:t>
       </w:r>
       <w:r>
         <w:t xml:space="preserve">play and </w:t>
@@ -7398,7 +7547,13 @@
         <w:t>es</w:t>
       </w:r>
       <w:r>
-        <w:t xml:space="preserve"> the challenges associated with manual solving. So, the main objective of this project is</w:t>
+        <w:t xml:space="preserve"> the challenges associated with manual solving.</w:t>
+      </w:r>
+      <w:r>
+        <w:t>T</w:t>
+      </w:r>
+      <w:r>
+        <w:t>he main objective of this project is</w:t>
       </w:r>
       <w:r>
         <w:t>:</w:t>
@@ -7616,7 +7771,13 @@
         <w:jc w:val="both"/>
       </w:pPr>
       <w:r>
-        <w:t>To ensure the development of an effective and user-friendly 8-puzzle game and solver application, it is important to consider the perspectives of both puzzle enthusiasts and researchers. Gathering insights from their experiences with traditional, manual puzzle-solving methods, including their expectations, preferences, and pain points, can inform the design and functionality of both the game and solver components. Factors such as ease of use, gameplay experience, algorithm efficiency, solution accuracy, and user interface design are taken into consideration to create a system that caters to the needs of all users involved.</w:t>
+        <w:t xml:space="preserve">To ensure the development of an effective and user-friendly 8-puzzle game and solver application, it is important to consider the perspectives of both puzzle enthusiasts and researchers. Gathering insights from their experiences with traditional manual puzzle-solving methods, including their expectations, preferences, and pain points, can inform the design and functionality of both the game and solver components. Factors such as ease of use, gameplay experience, algorithm efficiency, solution accuracy, and user interface design are taken into consideration to create a system that caters to the needs of </w:t>
+      </w:r>
+      <w:r>
+        <w:t>different types of</w:t>
+      </w:r>
+      <w:r>
+        <w:t xml:space="preserve"> users involved.</w:t>
       </w:r>
     </w:p>
     <w:p>
@@ -7669,7 +7830,7 @@
             <w:fldChar w:fldCharType="begin"/>
           </w:r>
           <w:r>
-            <w:instrText xml:space="preserve"> CITATION Che23 \l 1033 </w:instrText>
+            <w:instrText xml:space="preserve">CITATION Che23 \l 1033 </w:instrText>
           </w:r>
           <w:r>
             <w:fldChar w:fldCharType="separate"/>
@@ -7698,19 +7859,10 @@
         <w:t>published</w:t>
       </w:r>
       <w:r>
-        <w:t xml:space="preserve"> in the Journal of Applied Technology and Innovation, explores the application of </w:t>
-      </w:r>
-      <w:r>
-        <w:t>G</w:t>
-      </w:r>
-      <w:r>
-        <w:t xml:space="preserve">enetic </w:t>
-      </w:r>
-      <w:r>
-        <w:t>A</w:t>
-      </w:r>
-      <w:r>
-        <w:t xml:space="preserve">lgorithms (GA) to solve the 8-puzzle problem, a well-known problem in artificial intelligence and mathematics. The authors provide a comprehensive approach by implementing genetic algorithms, inspired by Charles Darwin's theory of natural evolution, to generate, evaluate, and evolve populations of potential solutions. Through modifying parameters such as crossover rate, mutation chance, and population size, the study demonstrates that higher crossover rates and mutation chances generally lead to faster problem-solving, while larger population sizes tend to increase the time required to find solutions. The research highlights the efficacy of genetic algorithms in finding optimal solutions for the 8-puzzle problem, </w:t>
+        <w:t xml:space="preserve"> in the Journal of Applied Technology and Innovation, explores the application of Genetic Algorithms (GA) to solve the 8-puzzle problem, a well-known problem in artificial intelligence and mathematics. The authors provide a comprehensive approach by implementing</w:t>
+      </w:r>
+      <w:r>
+        <w:t xml:space="preserve"> genetic algorithms, inspired by Charles Darwin's theory of natural evolution, to generate, evaluate, and evolve populations of potential solutions. Through modifying parameters such as crossover rate, mutation chance, and population size, the study demonstrates that higher crossover rates and mutation chances generally lead to faster problem-solving, while larger population sizes tend to increase the time required to find solutions. The research highlights the efficacy of genetic algorithms in finding optimal solutions for the 8-puzzle problem, </w:t>
       </w:r>
       <w:r>
         <w:lastRenderedPageBreak/>
@@ -7723,10 +7875,10 @@
         <w:jc w:val="both"/>
       </w:pPr>
       <w:r>
-        <w:t>Complete Solution of the Eight-Puzzle and the Benet of Node Ordering in ID</w:t>
-      </w:r>
-      <w:r>
-        <w:t>A</w:t>
+        <w:t>Complete Solution of the Eight-Puzzle and the Benefit of Node Ordering in IDA</w:t>
+      </w:r>
+      <w:r>
+        <w:t>*</w:t>
       </w:r>
       <w:r>
         <w:t xml:space="preserve"> </w:t>
@@ -7741,7 +7893,7 @@
             <w:fldChar w:fldCharType="begin"/>
           </w:r>
           <w:r>
-            <w:instrText xml:space="preserve"> CITATION Rei24 \l 1033 </w:instrText>
+            <w:instrText xml:space="preserve">CITATION Rei24 \l 1033 </w:instrText>
           </w:r>
           <w:r>
             <w:fldChar w:fldCharType="separate"/>
@@ -7761,7 +7913,13 @@
         <w:t>.</w:t>
       </w:r>
       <w:r>
-        <w:t>This paper presents exhaustive statistical data from evaluating all possible configurations, providing insights into solution lengths, the easiest and hardest configurations, and the distribution of solution nodes. Additionally, the paper examines the benefits of node ordering in the IDA* algorithm. The findings highlight that common IDA* implementations with fixed node ordering perform worse compared to a simple random ordering of operators</w:t>
+        <w:t xml:space="preserve"> </w:t>
+      </w:r>
+      <w:r>
+        <w:t>This</w:t>
+      </w:r>
+      <w:r>
+        <w:t xml:space="preserve"> paper presents exhaustive statistical data from evaluating all possible configurations, providing insights into solution lengths, the easiest and hardest configurations, and the distribution of solution nodes. Additionally, the paper examines the benefits of node ordering in the IDA* algorithm. The findings highlight that common IDA* implementations with fixed node ordering perform worse compared to a simple random ordering of operators</w:t>
       </w:r>
       <w:r>
         <w:t>.</w:t>
@@ -7796,7 +7954,7 @@
             <w:fldChar w:fldCharType="begin"/>
           </w:r>
           <w:r>
-            <w:instrText xml:space="preserve"> CITATION Vin24 \l 1033 </w:instrText>
+            <w:instrText xml:space="preserve">CITATION Vin24 \l 1033 </w:instrText>
           </w:r>
           <w:r>
             <w:fldChar w:fldCharType="separate"/>
@@ -7816,7 +7974,25 @@
         <w:t>.</w:t>
       </w:r>
       <w:r>
-        <w:t>The research conducted by Vinay Menon and colleagues at Vellore Institute of Technology concluded that the A* algorithm is the most efficient for solving the 8-puzzle problem. By comparing various search strategies including Breadth First Search (BFS), Depth First Search (DFS), Hill Climbing, and Steepest Ascent Hill Climbing, they found that A* consistently required fewer node explorations and moves to reach the goal state. This efficiency is attributed to A*'s use of a combined heuristic that optimally balances the cost already incurred and the estimated cost to the goal. Their experiments demonstrated that while other algorithms sometimes failed to find a solution or took longer, A* reliably provided the best performance across different test cases</w:t>
+        <w:t xml:space="preserve"> </w:t>
+      </w:r>
+      <w:r>
+        <w:t>The research conducted by Vinay Menon and colleagues at Vellore Institute of Technology concluded that the A* algorithm is the most efficient for solving the 8-puzzle problem. By comparing various search</w:t>
+      </w:r>
+      <w:r>
+        <w:t xml:space="preserve"> strategies including Breadth</w:t>
+      </w:r>
+      <w:r>
+        <w:t>-</w:t>
+      </w:r>
+      <w:r>
+        <w:t>First Search (BFS), Depth</w:t>
+      </w:r>
+      <w:r>
+        <w:t>-</w:t>
+      </w:r>
+      <w:r>
+        <w:t>First Search (DFS), Hill Climbing, and Steepest Ascent Hill Climbing, they found that A* consistently required fewer node explorations and moves to reach the goal state. This efficiency is attributed to A*'s use of a combined heuristic that optimally balances the cost already incurred and the estimated cost to the goal. Their experiments demonstrated that while other algorithms sometimes failed to find a solution or took longer, A* reliably provided the best performance across different test cases</w:t>
       </w:r>
       <w:r>
         <w:t>.</w:t>
@@ -7921,7 +8097,7 @@
         <w:t>Requirement analysis encompasses the identification and documentation of both functional requirements, which define the system's desired functionality, and non-functional requirements, which specify the system's performance, usability, and other quality attributes.</w:t>
       </w:r>
       <w:r>
-        <w:t xml:space="preserve"> It also includes various diagrammatic figures that lets us understand the core backbone of the system and how it functions</w:t>
+        <w:t xml:space="preserve"> It also includes various diagrammatic figures that let us understand the core backbone of the system and how it functions</w:t>
       </w:r>
       <w:r>
         <w:t>.</w:t>
@@ -8024,7 +8200,13 @@
         <w:t xml:space="preserve">: To </w:t>
       </w:r>
       <w:r>
-        <w:t>validate user and to track their progress.</w:t>
+        <w:t>validate user</w:t>
+      </w:r>
+      <w:r>
+        <w:t>s</w:t>
+      </w:r>
+      <w:r>
+        <w:t xml:space="preserve"> and to track their progress.</w:t>
       </w:r>
     </w:p>
     <w:p>
@@ -8038,6 +8220,9 @@
       <w:r>
         <w:t>Puzzle Solving: To solve the given puzzle</w:t>
       </w:r>
+      <w:r>
+        <w:t>.</w:t>
+      </w:r>
     </w:p>
     <w:p>
       <w:pPr>
@@ -8045,7 +8230,25 @@
         <w:jc w:val="both"/>
       </w:pPr>
       <w:r>
-        <w:t>iii. Solution Visualization: Showing step by step solution of the puzzle.</w:t>
+        <w:t xml:space="preserve">iii. Solution Visualization: </w:t>
+      </w:r>
+      <w:r>
+        <w:t>To display</w:t>
+      </w:r>
+      <w:r>
+        <w:t xml:space="preserve"> step</w:t>
+      </w:r>
+      <w:r>
+        <w:t>-</w:t>
+      </w:r>
+      <w:r>
+        <w:t>by</w:t>
+      </w:r>
+      <w:r>
+        <w:t>-</w:t>
+      </w:r>
+      <w:r>
+        <w:t>step solution of the puzzle.</w:t>
       </w:r>
     </w:p>
     <w:p>
@@ -8075,7 +8278,7 @@
                     <pic:cNvPicPr/>
                   </pic:nvPicPr>
                   <pic:blipFill rotWithShape="1">
-                    <a:blip r:embed="rId12"/>
+                    <a:blip r:embed="rId11"/>
                     <a:srcRect l="5032" t="6413" r="1772" b="11516"/>
                     <a:stretch/>
                   </pic:blipFill>
@@ -8265,10 +8468,25 @@
         <w:jc w:val="both"/>
       </w:pPr>
       <w:r>
-        <w:t xml:space="preserve">Non-Functional Requirement specifies criteria that can be used to judge the operation of the system. Unlike functional requirement these are non- lethal but having these requirements will make the project more </w:t>
-      </w:r>
-      <w:r>
-        <w:t>successful.</w:t>
+        <w:t>Non-Functional Requirement</w:t>
+      </w:r>
+      <w:r>
+        <w:t>s</w:t>
+      </w:r>
+      <w:r>
+        <w:t xml:space="preserve"> </w:t>
+      </w:r>
+      <w:r>
+        <w:t>specify</w:t>
+      </w:r>
+      <w:r>
+        <w:t xml:space="preserve"> criteria that can be used to judge the operation of the system. </w:t>
+      </w:r>
+      <w:r>
+        <w:t>Unlike functional requirements, non-functional requirements describe quality attributes and constraints of the system</w:t>
+      </w:r>
+      <w:r>
+        <w:t>.</w:t>
       </w:r>
       <w:r>
         <w:t xml:space="preserve"> The non-functional requirement</w:t>
@@ -8340,7 +8558,13 @@
         <w:jc w:val="both"/>
       </w:pPr>
       <w:r>
-        <w:t>Performance: The system should be able to solve puzzle in reasonable time frame</w:t>
+        <w:t xml:space="preserve">Performance: The system should be able to solve puzzle </w:t>
+      </w:r>
+      <w:r>
+        <w:t>within a</w:t>
+      </w:r>
+      <w:r>
+        <w:t xml:space="preserve"> reasonable time frame</w:t>
       </w:r>
       <w:r>
         <w:t>.</w:t>
@@ -8470,7 +8694,19 @@
         <w:rPr>
           <w:u w:val="single"/>
         </w:rPr>
-        <w:t>d use:</w:t>
+        <w:t xml:space="preserve">d </w:t>
+      </w:r>
+      <w:r>
+        <w:rPr>
+          <w:u w:val="single"/>
+        </w:rPr>
+        <w:t>development</w:t>
+      </w:r>
+      <w:r>
+        <w:rPr>
+          <w:u w:val="single"/>
+        </w:rPr>
+        <w:t>:</w:t>
       </w:r>
     </w:p>
     <w:p>
@@ -8510,6 +8746,24 @@
       </w:pPr>
       <w:r>
         <w:t>CSS</w:t>
+      </w:r>
+    </w:p>
+    <w:p>
+      <w:pPr>
+        <w:pStyle w:val="ListParagraph"/>
+        <w:widowControl w:val="0"/>
+        <w:numPr>
+          <w:ilvl w:val="0"/>
+          <w:numId w:val="26"/>
+        </w:numPr>
+        <w:autoSpaceDE w:val="0"/>
+        <w:autoSpaceDN w:val="0"/>
+        <w:spacing w:line="360" w:lineRule="auto"/>
+        <w:contextualSpacing w:val="0"/>
+        <w:jc w:val="both"/>
+      </w:pPr>
+      <w:r>
+        <w:t>JavaScript</w:t>
       </w:r>
     </w:p>
     <w:p>
@@ -8568,24 +8822,6 @@
         <w:spacing w:line="360" w:lineRule="auto"/>
         <w:contextualSpacing w:val="0"/>
         <w:jc w:val="both"/>
-      </w:pPr>
-      <w:r>
-        <w:t>JavaScript</w:t>
-      </w:r>
-    </w:p>
-    <w:p>
-      <w:pPr>
-        <w:pStyle w:val="ListParagraph"/>
-        <w:widowControl w:val="0"/>
-        <w:numPr>
-          <w:ilvl w:val="0"/>
-          <w:numId w:val="27"/>
-        </w:numPr>
-        <w:autoSpaceDE w:val="0"/>
-        <w:autoSpaceDN w:val="0"/>
-        <w:spacing w:line="360" w:lineRule="auto"/>
-        <w:contextualSpacing w:val="0"/>
-        <w:jc w:val="both"/>
         <w:rPr>
           <w:u w:val="single"/>
         </w:rPr>
@@ -8600,7 +8836,19 @@
         <w:jc w:val="both"/>
       </w:pPr>
       <w:r>
-        <w:t>As the above mention technology is easily available and are more than enough for the project’s need. This project is technically feasible.</w:t>
+        <w:t xml:space="preserve">As the above mention technology is </w:t>
+      </w:r>
+      <w:r>
+        <w:t>readily</w:t>
+      </w:r>
+      <w:r>
+        <w:t xml:space="preserve"> available and </w:t>
+      </w:r>
+      <w:r>
+        <w:t>sufficient</w:t>
+      </w:r>
+      <w:r>
+        <w:t xml:space="preserve"> for the project’s need. This project is technically feasible.</w:t>
       </w:r>
     </w:p>
     <w:p>
@@ -8861,11 +9109,11 @@
                     <pic:cNvPicPr/>
                   </pic:nvPicPr>
                   <pic:blipFill>
-                    <a:blip r:embed="rId13">
+                    <a:blip r:embed="rId12">
                       <a:extLst>
                         <a:ext uri="{BEBA8EAE-BF5A-486C-A8C5-ECC9F3942E4B}">
                           <a14:imgProps xmlns:a14="http://schemas.microsoft.com/office/drawing/2010/main">
-                            <a14:imgLayer r:embed="rId14">
+                            <a14:imgLayer r:embed="rId13">
                               <a14:imgEffect>
                                 <a14:sharpenSoften amount="14000"/>
                               </a14:imgEffect>
@@ -9092,7 +9340,7 @@
                 <v:stroke joinstyle="miter"/>
                 <v:path gradientshapeok="t" o:connecttype="rect"/>
               </v:shapetype>
-              <v:shape id="Text Box 1" o:spid="_x0000_s1026" type="#_x0000_t202" style="position:absolute;left:0;text-align:left;margin-left:-31.45pt;margin-top:200.25pt;width:501pt;height:.05pt;z-index:-251630592;visibility:visible;mso-wrap-style:square;mso-wrap-distance-left:9pt;mso-wrap-distance-top:0;mso-wrap-distance-right:9pt;mso-wrap-distance-bottom:0;mso-position-horizontal:absolute;mso-position-horizontal-relative:text;mso-position-vertical:absolute;mso-position-vertical-relative:text;v-text-anchor:top" o:gfxdata="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" stroked="f">
+              <v:shape id="Text Box 1" o:spid="_x0000_s1026" type="#_x0000_t202" style="position:absolute;left:0;text-align:left;margin-left:-31.45pt;margin-top:200.25pt;width:501pt;height:.05pt;z-index:-251630592;visibility:visible;mso-wrap-style:square;mso-wrap-distance-left:9pt;mso-wrap-distance-top:0;mso-wrap-distance-right:9pt;mso-wrap-distance-bottom:0;mso-position-horizontal:absolute;mso-position-horizontal-relative:text;mso-position-vertical:absolute;mso-position-vertical-relative:text;v-text-anchor:top" o:gfxdata="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" stroked="f">
                 <v:textbox style="mso-fit-shape-to-text:t" inset="0,0,0,0">
                   <w:txbxContent>
                     <w:p>
@@ -9268,11 +9516,11 @@
                     </pic:cNvPicPr>
                   </pic:nvPicPr>
                   <pic:blipFill>
-                    <a:blip r:embed="rId15">
+                    <a:blip r:embed="rId14">
                       <a:extLst>
                         <a:ext uri="{BEBA8EAE-BF5A-486C-A8C5-ECC9F3942E4B}">
                           <a14:imgProps xmlns:a14="http://schemas.microsoft.com/office/drawing/2010/main">
-                            <a14:imgLayer r:embed="rId16">
+                            <a14:imgLayer r:embed="rId15">
                               <a14:imgEffect>
                                 <a14:sharpenSoften amount="17000"/>
                               </a14:imgEffect>
@@ -9320,10 +9568,13 @@
         </w:drawing>
       </w:r>
       <w:r>
-        <w:t>3.1.3 Data Modeling</w:t>
+        <w:t xml:space="preserve">3.1.3 </w:t>
       </w:r>
       <w:bookmarkEnd w:id="53"/>
       <w:bookmarkEnd w:id="54"/>
+      <w:r>
+        <w:t>System Flow</w:t>
+      </w:r>
     </w:p>
     <w:p>
       <w:pPr>
@@ -9505,7 +9756,7 @@
           </mc:Choice>
           <mc:Fallback>
             <w:pict>
-              <v:shape w14:anchorId="0653662A" id="_x0000_s1027" type="#_x0000_t202" style="position:absolute;left:0;text-align:left;margin-left:0;margin-top:256.5pt;width:487.6pt;height:.05pt;z-index:-251628544;visibility:visible;mso-wrap-style:square;mso-wrap-distance-left:9pt;mso-wrap-distance-top:0;mso-wrap-distance-right:9pt;mso-wrap-distance-bottom:0;mso-position-horizontal:center;mso-position-horizontal-relative:margin;mso-position-vertical:absolute;mso-position-vertical-relative:text;v-text-anchor:top" o:gfxdata="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" stroked="f">
+              <v:shape w14:anchorId="0653662A" id="_x0000_s1027" type="#_x0000_t202" style="position:absolute;left:0;text-align:left;margin-left:0;margin-top:256.5pt;width:487.6pt;height:.05pt;z-index:-251628544;visibility:visible;mso-wrap-style:square;mso-wrap-distance-left:9pt;mso-wrap-distance-top:0;mso-wrap-distance-right:9pt;mso-wrap-distance-bottom:0;mso-position-horizontal:center;mso-position-horizontal-relative:margin;mso-position-vertical:absolute;mso-position-vertical-relative:text;v-text-anchor:top" o:gfxdata="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" stroked="f">
                 <v:textbox style="mso-fit-shape-to-text:t" inset="0,0,0,0">
                   <w:txbxContent>
                     <w:p>
@@ -9696,7 +9947,7 @@
           </mc:Choice>
           <mc:Fallback>
             <w:pict>
-              <v:shape w14:anchorId="53901B8B" id="Text Box 2" o:spid="_x0000_s1028" type="#_x0000_t202" style="position:absolute;left:0;text-align:left;margin-left:293pt;margin-top:263.15pt;width:29.2pt;height:16.2pt;z-index:251674624;visibility:visible;mso-wrap-style:square;mso-width-percent:0;mso-height-percent:0;mso-wrap-distance-left:9pt;mso-wrap-distance-top:3.6pt;mso-wrap-distance-right:9pt;mso-wrap-distance-bottom:3.6pt;mso-position-horizontal:absolute;mso-position-horizontal-relative:text;mso-position-vertical:absolute;mso-position-vertical-relative:text;mso-width-percent:0;mso-height-percent:0;mso-width-relative:margin;mso-height-relative:margin;v-text-anchor:top" o:gfxdata="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" strokecolor="white [3212]">
+              <v:shape w14:anchorId="53901B8B" id="Text Box 2" o:spid="_x0000_s1028" type="#_x0000_t202" style="position:absolute;left:0;text-align:left;margin-left:293pt;margin-top:263.15pt;width:29.2pt;height:16.2pt;z-index:251674624;visibility:visible;mso-wrap-style:square;mso-width-percent:0;mso-height-percent:0;mso-wrap-distance-left:9pt;mso-wrap-distance-top:3.6pt;mso-wrap-distance-right:9pt;mso-wrap-distance-bottom:3.6pt;mso-position-horizontal:absolute;mso-position-horizontal-relative:text;mso-position-vertical:absolute;mso-position-vertical-relative:text;mso-width-percent:0;mso-height-percent:0;mso-width-relative:margin;mso-height-relative:margin;v-text-anchor:top" o:gfxdata="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" strokecolor="white [3212]">
                 <v:textbox>
                   <w:txbxContent>
                     <w:p/>
@@ -10105,7 +10356,7 @@
                     </pic:cNvPicPr>
                   </pic:nvPicPr>
                   <pic:blipFill>
-                    <a:blip r:embed="rId17">
+                    <a:blip r:embed="rId16">
                       <a:extLst>
                         <a:ext uri="{28A0092B-C50C-407E-A947-70E740481C1C}">
                           <a14:useLocalDpi xmlns:a14="http://schemas.microsoft.com/office/drawing/2010/main" val="0"/>
@@ -10280,7 +10531,13 @@
         <w:t xml:space="preserve">play the puzzle game or </w:t>
       </w:r>
       <w:r>
-        <w:t xml:space="preserve">input puzzle data which the 8 Puzzle Solver process and gives an appropriate response back. 8 Puzzle </w:t>
+        <w:t>input puzzle data</w:t>
+      </w:r>
+      <w:r>
+        <w:t>,</w:t>
+      </w:r>
+      <w:r>
+        <w:t xml:space="preserve"> which the 8 Puzzle Solver process and gives an appropriate response back. 8 Puzzle </w:t>
       </w:r>
       <w:r>
         <w:t>Game</w:t>
@@ -10301,7 +10558,13 @@
         <w:t>ser</w:t>
       </w:r>
       <w:r>
-        <w:t xml:space="preserve"> that had completed the puzzle in the shortest of time</w:t>
+        <w:t xml:space="preserve"> </w:t>
+      </w:r>
+      <w:r>
+        <w:t>who</w:t>
+      </w:r>
+      <w:r>
+        <w:t xml:space="preserve"> completed the puzzle in the shortest of time</w:t>
       </w:r>
       <w:r>
         <w:t>. The user is also able to delete their account if they choose to do so</w:t>
@@ -10327,7 +10590,7 @@
         </w:rPr>
         <w:lastRenderedPageBreak/>
         <w:drawing>
-          <wp:inline distT="0" distB="0" distL="0" distR="0" wp14:anchorId="6CE558B6" wp14:editId="24626349">
+          <wp:inline distT="0" distB="0" distL="0" distR="0" wp14:anchorId="6CE558B6" wp14:editId="64D33A94">
             <wp:extent cx="5502910" cy="4636135"/>
             <wp:effectExtent l="0" t="0" r="0" b="0"/>
             <wp:docPr id="888746300" name="Picture 8"/>
@@ -10344,7 +10607,7 @@
                     </pic:cNvPicPr>
                   </pic:nvPicPr>
                   <pic:blipFill>
-                    <a:blip r:embed="rId18" cstate="print">
+                    <a:blip r:embed="rId17" cstate="print">
                       <a:extLst>
                         <a:ext uri="{28A0092B-C50C-407E-A947-70E740481C1C}">
                           <a14:useLocalDpi xmlns:a14="http://schemas.microsoft.com/office/drawing/2010/main" val="0"/>
@@ -10513,7 +10776,31 @@
         <w:jc w:val="both"/>
       </w:pPr>
       <w:r>
-        <w:t>The level 1 DFD shows the various processes inside the 8 Puzzle Solver in detail. It shows how the data flows throughout the system and how each and every process communicate with each other and the database for the system as a whole to function properly and complete its intended use</w:t>
+        <w:t xml:space="preserve">The level 1 DFD shows the various processes inside the 8 Puzzle Solver in detail. It shows how the data flows throughout the system and how each and every process communicate with </w:t>
+      </w:r>
+      <w:r>
+        <w:t>the</w:t>
+      </w:r>
+      <w:r>
+        <w:t xml:space="preserve"> other</w:t>
+      </w:r>
+      <w:r>
+        <w:t xml:space="preserve"> processes</w:t>
+      </w:r>
+      <w:r>
+        <w:t xml:space="preserve"> and the database </w:t>
+      </w:r>
+      <w:r>
+        <w:t>so</w:t>
+      </w:r>
+      <w:r>
+        <w:t xml:space="preserve"> the system as a whole </w:t>
+      </w:r>
+      <w:r>
+        <w:t>can</w:t>
+      </w:r>
+      <w:r>
+        <w:t xml:space="preserve"> function properly and complete its intended use</w:t>
       </w:r>
       <w:r>
         <w:t>.</w:t>
@@ -10573,7 +10860,7 @@
                     </pic:cNvPicPr>
                   </pic:nvPicPr>
                   <pic:blipFill>
-                    <a:blip r:embed="rId19">
+                    <a:blip r:embed="rId18">
                       <a:extLst>
                         <a:ext uri="{28A0092B-C50C-407E-A947-70E740481C1C}">
                           <a14:useLocalDpi xmlns:a14="http://schemas.microsoft.com/office/drawing/2010/main" val="0"/>
@@ -10730,7 +11017,16 @@
         <w:jc w:val="both"/>
       </w:pPr>
       <w:r>
-        <w:t>Coding will be carried out using Visual Studio Code, with unit testing conducted to ensure thorough testing of all project modules. The integration and system testing phase will evaluate inter-module interactions, gameplay mechanics, and the overall performance of the game and solver. As a practical environment often reveals errors in each development phase, the iterative waterfall model is employed, allowing for error correction in earlier stages and providing a structured approach for the project’s development. Consequently, the iterative waterfall model was selected for the 8-Puzzle Game and Solver project</w:t>
+        <w:t>Coding was carried out using Visual Studio Code, and unit testing was conducted to ensure thorough testing of all project modules.</w:t>
+      </w:r>
+      <w:r>
+        <w:t xml:space="preserve"> </w:t>
+      </w:r>
+      <w:r>
+        <w:t xml:space="preserve">The integration and system testing phase evaluated </w:t>
+      </w:r>
+      <w:r>
+        <w:t>inter-module interactions, gameplay mechanics, and the overall performance of the game and solver. As a practical environment often reveals errors in each development phase, the iterative waterfall model is employed, allowing for error correction in earlier stages and providing a structured approach for the project’s development. Consequently, the iterative waterfall model was selected for the 8-Puzzle Game and Solver project</w:t>
       </w:r>
       <w:r>
         <w:t>.</w:t>
@@ -10793,11 +11089,11 @@
                     </pic:cNvPicPr>
                   </pic:nvPicPr>
                   <pic:blipFill>
-                    <a:blip r:embed="rId20">
+                    <a:blip r:embed="rId19">
                       <a:extLst>
                         <a:ext uri="{BEBA8EAE-BF5A-486C-A8C5-ECC9F3942E4B}">
                           <a14:imgProps xmlns:a14="http://schemas.microsoft.com/office/drawing/2010/main">
-                            <a14:imgLayer r:embed="rId21">
+                            <a14:imgLayer r:embed="rId20">
                               <a14:imgEffect>
                                 <a14:sharpenSoften amount="14000"/>
                               </a14:imgEffect>
@@ -10993,7 +11289,7 @@
                     <pic:cNvPicPr/>
                   </pic:nvPicPr>
                   <pic:blipFill rotWithShape="1">
-                    <a:blip r:embed="rId22"/>
+                    <a:blip r:embed="rId21"/>
                     <a:srcRect b="11720"/>
                     <a:stretch/>
                   </pic:blipFill>
@@ -11127,7 +11423,7 @@
           <w:sz w:val="24"/>
           <w:szCs w:val="24"/>
         </w:rPr>
-        <w:t xml:space="preserve">of 8-puzzle </w:t>
+        <w:t xml:space="preserve">of </w:t>
       </w:r>
       <w:r>
         <w:rPr>
@@ -11137,7 +11433,7 @@
           <w:sz w:val="24"/>
           <w:szCs w:val="24"/>
         </w:rPr>
-        <w:t xml:space="preserve">of </w:t>
+        <w:t>8-</w:t>
       </w:r>
       <w:r>
         <w:rPr>
@@ -11147,6 +11443,36 @@
           <w:sz w:val="24"/>
           <w:szCs w:val="24"/>
         </w:rPr>
+        <w:t>P</w:t>
+      </w:r>
+      <w:r>
+        <w:rPr>
+          <w:i w:val="0"/>
+          <w:iCs w:val="0"/>
+          <w:color w:val="auto"/>
+          <w:sz w:val="24"/>
+          <w:szCs w:val="24"/>
+        </w:rPr>
+        <w:t>uzzle</w:t>
+      </w:r>
+      <w:r>
+        <w:rPr>
+          <w:i w:val="0"/>
+          <w:iCs w:val="0"/>
+          <w:color w:val="auto"/>
+          <w:sz w:val="24"/>
+          <w:szCs w:val="24"/>
+        </w:rPr>
+        <w:t xml:space="preserve"> </w:t>
+      </w:r>
+      <w:r>
+        <w:rPr>
+          <w:i w:val="0"/>
+          <w:iCs w:val="0"/>
+          <w:color w:val="auto"/>
+          <w:sz w:val="24"/>
+          <w:szCs w:val="24"/>
+        </w:rPr>
         <w:t>Game and Solver</w:t>
       </w:r>
     </w:p>
@@ -11197,7 +11523,13 @@
         <w:t xml:space="preserve">. The various interface </w:t>
       </w:r>
       <w:r>
-        <w:t xml:space="preserve">design </w:t>
+        <w:t>design</w:t>
+      </w:r>
+      <w:r>
+        <w:t>s</w:t>
+      </w:r>
+      <w:r>
+        <w:t xml:space="preserve"> </w:t>
       </w:r>
       <w:r>
         <w:t>for this project are:</w:t>
@@ -11229,7 +11561,7 @@
                     <pic:cNvPicPr/>
                   </pic:nvPicPr>
                   <pic:blipFill>
-                    <a:blip r:embed="rId23"/>
+                    <a:blip r:embed="rId22"/>
                     <a:stretch>
                       <a:fillRect/>
                     </a:stretch>
@@ -11386,7 +11718,7 @@
                     <pic:cNvPicPr/>
                   </pic:nvPicPr>
                   <pic:blipFill>
-                    <a:blip r:embed="rId24"/>
+                    <a:blip r:embed="rId23"/>
                     <a:stretch>
                       <a:fillRect/>
                     </a:stretch>
@@ -11479,7 +11811,7 @@
                     <pic:cNvPicPr/>
                   </pic:nvPicPr>
                   <pic:blipFill>
-                    <a:blip r:embed="rId25">
+                    <a:blip r:embed="rId24">
                       <a:extLst>
                         <a:ext uri="{28A0092B-C50C-407E-A947-70E740481C1C}">
                           <a14:useLocalDpi xmlns:a14="http://schemas.microsoft.com/office/drawing/2010/main" val="0"/>
@@ -11622,16 +11954,7 @@
         <w:jc w:val="both"/>
       </w:pPr>
       <w:r>
-        <w:t>The algorithm for solving the 8-puzzle leverages the A* search strategy, combining the current state of the puzzle with a heuristic approach to find the optimal solution efficiently. Initially, the algorithm assesses the puzzle's current configuration and generates neighboring states by sliding tiles into the empty space. It calculates a score for each state based on the cost to reach that state and an estimated cost to reach the goal state, using the Manhattan distance as the heuristic. The algorithm maintains a priority queue of states to explore, selecting the one with the lowest score for further evaluation. This process continues iteratively until the algorithm finds the solution or exhausts the maximum iteration limit, ensuring an effective and systematic resolution of the puzzle.</w:t>
-      </w:r>
-      <w:r>
-        <w:t xml:space="preserve"> The </w:t>
-      </w:r>
-      <w:r>
-        <w:t>step-by-step</w:t>
-      </w:r>
-      <w:r>
-        <w:t xml:space="preserve"> procedure of 8-puzzle solver are:</w:t>
+        <w:t>The algorithm for solving the 8-puzzle uses the A* search strategy, combining the cost of reaching the current state with a heuristic estimate of the cost required to reach the goal state. Initially, the algorithm evaluates the current puzzle configuration and generates neighboring states by moving the blank tile to valid adjacent positions. It calculates a score for each state using f(n) = g(n) + h(n), where g(n) represents the number of moves from the initial state and h(n) represents the Manhattan distance from the current state to the goal state. The algorithm maintains an open set of states to be explored and selects the state with the lowest f(n) value for further evaluation. This process continues until the goal state is found or the maximum iteration limit is reached. The step-by-step procedure of the 8-puzzle solver is as follows:</w:t>
       </w:r>
     </w:p>
     <w:p>
@@ -11640,46 +11963,86 @@
         <w:jc w:val="both"/>
       </w:pPr>
       <w:r>
-        <w:t>Step 1:</w:t>
-      </w:r>
-      <w:r>
-        <w:t xml:space="preserve"> The function existSolution calculates whether a given permutation is solvable based on the </w:t>
-      </w:r>
-      <w:r>
-        <w:t>inversion count</w:t>
-      </w:r>
-      <w:r>
-        <w:t xml:space="preserve">. An inversion occurs when a pair of tiles are in the wrong order relative to each </w:t>
-      </w:r>
-      <w:r>
-        <w:t>other</w:t>
-      </w:r>
-      <w:r>
-        <w:t xml:space="preserve"> </w:t>
+        <w:rPr>
+          <w:b/>
+          <w:bCs/>
+        </w:rPr>
+        <w:t>Step 1</w:t>
+      </w:r>
+      <w:r>
+        <w:t>:</w:t>
+      </w:r>
+      <w:r>
+        <w:t xml:space="preserve"> The </w:t>
+      </w:r>
+      <w:r>
+        <w:t>existSolution</w:t>
+      </w:r>
+      <w:r>
+        <w:t xml:space="preserve"> function checks whether the puzzle configuration is solvable by calculating its inversion count. The blank tile (0) is ignored. If the inversion count is even, the puzzle is considered solvable</w:t>
       </w:r>
       <w:r>
         <w:t>.</w:t>
       </w:r>
-      <w:r>
-        <w:t>i.e.</w:t>
-      </w:r>
-      <w:r>
-        <w:t xml:space="preserve"> in a pair of tile a,</w:t>
-      </w:r>
-      <w:r>
-        <w:t xml:space="preserve"> </w:t>
-      </w:r>
-      <w:r>
-        <w:t>b such that a&gt;b but a appears before b in the list</w:t>
-      </w:r>
-      <w:r>
-        <w:t xml:space="preserve">. If the number of inversions is </w:t>
-      </w:r>
-      <w:r>
-        <w:t>even</w:t>
-      </w:r>
-      <w:r>
-        <w:t>, the puzzle is solvable.</w:t>
+    </w:p>
+    <w:p>
+      <w:pPr>
+        <w:spacing w:line="360" w:lineRule="auto"/>
+        <w:jc w:val="both"/>
+      </w:pPr>
+      <w:r>
+        <w:rPr>
+          <w:b/>
+          <w:bCs/>
+        </w:rPr>
+        <w:t xml:space="preserve">Step 2: </w:t>
+      </w:r>
+      <w:r>
+        <w:t>When</w:t>
+      </w:r>
+      <w:r>
+        <w:t xml:space="preserve"> a random puzzle is generated, the system repeatedly generates new </w:t>
+      </w:r>
+      <w:r>
+        <w:t>permutations until a solvable configuration is obtained</w:t>
+      </w:r>
+      <w:r>
+        <w:t>.</w:t>
+      </w:r>
+    </w:p>
+    <w:p>
+      <w:pPr>
+        <w:spacing w:line="360" w:lineRule="auto"/>
+        <w:jc w:val="both"/>
+      </w:pPr>
+      <w:r>
+        <w:rPr>
+          <w:b/>
+          <w:bCs/>
+        </w:rPr>
+        <w:t>Step 3:</w:t>
+      </w:r>
+      <w:r>
+        <w:t xml:space="preserve"> The A* algorithm evaluates </w:t>
+      </w:r>
+      <w:r>
+        <w:t>each state using f(n) = g(n) + h(n), where g(n) is the number of moves from the initial state to the current state and h(n) is the Manhattan distance from the current state to the goal state.</w:t>
+      </w:r>
+    </w:p>
+    <w:p>
+      <w:pPr>
+        <w:spacing w:line="360" w:lineRule="auto"/>
+        <w:jc w:val="both"/>
+      </w:pPr>
+      <w:r>
+        <w:rPr>
+          <w:b/>
+          <w:bCs/>
+        </w:rPr>
+        <w:t>Step 4:</w:t>
+      </w:r>
+      <w:r>
+        <w:t xml:space="preserve"> The initial puzzle state is added to the open set. Its initial g(n) value is set to 0, and its f(n) value is calculated using the Manhattan-distance heuristic.</w:t>
       </w:r>
     </w:p>
     <w:p>
@@ -11688,7 +12051,14 @@
         <w:jc w:val="both"/>
       </w:pPr>
       <w:r>
-        <w:t>Step 2: If the inversion count is odd, a new permutation is generated, and the process repeats until a solvable permutation is obtained.</w:t>
+        <w:rPr>
+          <w:b/>
+          <w:bCs/>
+        </w:rPr>
+        <w:t>Step 5:</w:t>
+      </w:r>
+      <w:r>
+        <w:t xml:space="preserve"> During each iteration, the algorithm selects the state with the lowest f(n) value from the open set.</w:t>
       </w:r>
     </w:p>
     <w:p>
@@ -11697,35 +12067,249 @@
         <w:jc w:val="both"/>
       </w:pPr>
       <w:r>
-        <w:t>Step 3: The A* algorithm uses the formula to calculate the f(n) value for each state</w:t>
-      </w:r>
-      <w:r>
-        <w:t xml:space="preserve">. </w:t>
-      </w:r>
-      <w:r>
-        <w:t>Formula for A* algorithm is f(n) = g(n) + h(n)</w:t>
-      </w:r>
-      <w:r>
-        <w:t>,</w:t>
-      </w:r>
+        <w:rPr>
+          <w:b/>
+          <w:bCs/>
+        </w:rPr>
+        <w:t>Step 6:</w:t>
+      </w:r>
+      <w:r>
+        <w:t xml:space="preserve"> If the selected state matches the goal state [1, 2, 3, 4, 5, 6, 7, 8, 0], the algorithm reconstructs the solution path and returns the sequence of puzzle states.</w:t>
+      </w:r>
+    </w:p>
+    <w:p>
+      <w:pPr>
+        <w:spacing w:before="240" w:line="360" w:lineRule="auto"/>
+        <w:jc w:val="both"/>
+      </w:pPr>
+      <w:r>
+        <w:rPr>
+          <w:b/>
+          <w:bCs/>
+        </w:rPr>
+        <w:t>Step 7:</w:t>
+      </w:r>
+      <w:r>
+        <w:t xml:space="preserve"> If the goal has not been reached, the current state is removed from the open set and added to the closed set.</w:t>
+      </w:r>
+    </w:p>
+    <w:p>
+      <w:pPr>
+        <w:spacing w:before="240" w:line="360" w:lineRule="auto"/>
+        <w:jc w:val="both"/>
+      </w:pPr>
+      <w:r>
+        <w:rPr>
+          <w:b/>
+          <w:bCs/>
+        </w:rPr>
+        <w:lastRenderedPageBreak/>
+        <w:t>Step 8:</w:t>
+      </w:r>
+      <w:r>
+        <w:t xml:space="preserve"> The algorithm generates neighboring states by moving the blank tile (0) to each valid adjacent position: left, right, up, or down.</w:t>
+      </w:r>
+    </w:p>
+    <w:p>
+      <w:pPr>
+        <w:spacing w:before="240" w:line="360" w:lineRule="auto"/>
+        <w:jc w:val="both"/>
+      </w:pPr>
+      <w:r>
+        <w:rPr>
+          <w:b/>
+          <w:bCs/>
+        </w:rPr>
+        <w:t>Step 9:</w:t>
+      </w:r>
+      <w:r>
+        <w:t xml:space="preserve"> Neighboring states that are already present in the closed set are skipped. For the remaining states, a tentative g(n) value is calculated as the current state's g(n) value plus 1</w:t>
+      </w:r>
+      <w:r>
+        <w:t>.</w:t>
+      </w:r>
+    </w:p>
+    <w:p>
+      <w:pPr>
+        <w:spacing w:before="240" w:line="360" w:lineRule="auto"/>
+        <w:jc w:val="both"/>
+      </w:pPr>
+      <w:r>
+        <w:rPr>
+          <w:b/>
+          <w:bCs/>
+        </w:rPr>
+        <w:t>Step 10:</w:t>
+      </w:r>
+      <w:r>
+        <w:t xml:space="preserve"> For each accepted neighboring state, the algorithm records its parent state, updates its g(n) value, and calculates its f(n) value by adding the Manhattan-distance heuristic.</w:t>
+      </w:r>
+    </w:p>
+    <w:p>
+      <w:pPr>
+        <w:spacing w:before="240" w:line="360" w:lineRule="auto"/>
+        <w:jc w:val="both"/>
+      </w:pPr>
+      <w:r>
+        <w:rPr>
+          <w:b/>
+          <w:bCs/>
+        </w:rPr>
+        <w:t>Step 11</w:t>
+      </w:r>
+      <w:r>
+        <w:t>: The heuristic value h(n) is calculated using the Manhattan-distance heuristic. For each numbered tile, the algorithm identifies the tile's current row and column and its goal row and column. The distance for that tile is calculated as:</w:t>
+      </w:r>
+    </w:p>
+    <w:p>
+      <w:pPr>
+        <w:spacing w:before="240" w:line="360" w:lineRule="auto"/>
+        <w:jc w:val="both"/>
+      </w:pPr>
+      <w:r>
+        <w:t>|goal row − current row| + |goal column − current column|</w:t>
+      </w:r>
+    </w:p>
+    <w:p>
+      <w:pPr>
+        <w:spacing w:before="240" w:line="360" w:lineRule="auto"/>
+        <w:jc w:val="both"/>
+      </w:pPr>
+      <w:r>
+        <w:t>The distances of all numbered tiles are then added together to obtain the total h(n) value. The blank tile (0) is excluded from the calculation.</w:t>
+      </w:r>
+    </w:p>
+    <w:p>
+      <w:pPr>
+        <w:pStyle w:val="pdq2pgselectionanchorcontainer"/>
+      </w:pPr>
+      <w:r>
+        <w:t xml:space="preserve">For example, if tile </w:t>
+      </w:r>
+      <w:r>
+        <w:rPr>
+          <w:rStyle w:val="Strong"/>
+          <w:b w:val="0"/>
+          <w:bCs w:val="0"/>
+        </w:rPr>
+        <w:t>2</w:t>
+      </w:r>
+      <w:r>
+        <w:t xml:space="preserve"> is one position away from its goal position and tile </w:t>
+      </w:r>
+      <w:r>
+        <w:rPr>
+          <w:rStyle w:val="Strong"/>
+          <w:b w:val="0"/>
+          <w:bCs w:val="0"/>
+        </w:rPr>
+        <w:t>3</w:t>
+      </w:r>
+      <w:r>
+        <w:t xml:space="preserve"> is two position away, while all other tiles are correctly positioned, then:</w:t>
+      </w:r>
+    </w:p>
+    <w:p>
+      <w:pPr>
+        <w:pStyle w:val="NormalWeb"/>
+      </w:pPr>
+      <w:r>
+        <w:rPr>
+          <w:rStyle w:val="Strong"/>
+          <w:b w:val="0"/>
+          <w:bCs w:val="0"/>
+        </w:rPr>
+        <w:t>h(n) = 1 + 2 = 3</w:t>
+      </w:r>
+    </w:p>
+    <w:p>
+      <w:pPr>
+        <w:spacing w:before="240" w:line="360" w:lineRule="auto"/>
+        <w:jc w:val="both"/>
+      </w:pPr>
+      <w:r>
+        <w:t>Step 12: The search continues until the goal state is found or the maximum iteration limit of 10,000 iterations is reached.</w:t>
+      </w:r>
+    </w:p>
+    <w:p>
+      <w:pPr>
+        <w:spacing w:before="240" w:line="360" w:lineRule="auto"/>
+        <w:jc w:val="both"/>
+      </w:pPr>
+      <w:r>
+        <w:rPr>
+          <w:b/>
+          <w:bCs/>
+        </w:rPr>
+        <w:t>Step 13:</w:t>
+      </w:r>
+      <w:r>
+        <w:t xml:space="preserve"> If the goal state is found, the reconstructPath function follows the recorded parent states from the goal back to the initial state and produces the complete solution path. The solution is then displayed step by step and animated on the puzzle grid.</w:t>
+      </w:r>
+    </w:p>
+    <w:p>
+      <w:pPr>
+        <w:spacing w:before="240" w:line="360" w:lineRule="auto"/>
+        <w:jc w:val="both"/>
+      </w:pPr>
+      <w:r>
+        <w:rPr>
+          <w:b/>
+          <w:bCs/>
+        </w:rPr>
+        <w:t>Step 14:</w:t>
+      </w:r>
+      <w:r>
+        <w:t xml:space="preserve"> If the solution is not found before the maximum iteration limit is reached, the system displays a message stating that the solution was not found within the iteration limit.</w:t>
+      </w:r>
+      <w:r>
+        <w:br w:type="page"/>
+      </w:r>
+    </w:p>
+    <w:p>
+      <w:pPr>
+        <w:pStyle w:val="Heading1"/>
+        <w:spacing w:before="0" w:after="200"/>
+      </w:pPr>
+      <w:bookmarkStart w:id="92" w:name="_Toc178930686"/>
+      <w:r>
+        <w:lastRenderedPageBreak/>
+        <w:t>CHAPTER 4: IMPLEMENTATION AND TESTING</w:t>
+      </w:r>
+      <w:bookmarkEnd w:id="83"/>
+      <w:bookmarkEnd w:id="92"/>
       <w:r>
         <w:t xml:space="preserve"> </w:t>
       </w:r>
-      <w:r>
-        <w:t>w</w:t>
-      </w:r>
-      <w:r>
-        <w:t>here g(n) = depth of node</w:t>
-      </w:r>
-      <w:r>
-        <w:t xml:space="preserve"> and</w:t>
-      </w:r>
-      <w:r>
-        <w:t xml:space="preserve"> h(n) = Number of misplaced tiles</w:t>
-      </w:r>
-      <w:r>
-        <w:t>.</w:t>
-      </w:r>
+    </w:p>
+    <w:p/>
+    <w:p>
+      <w:pPr>
+        <w:pStyle w:val="Heading2"/>
+        <w:spacing w:before="0" w:after="200" w:line="360" w:lineRule="auto"/>
+      </w:pPr>
+      <w:bookmarkStart w:id="93" w:name="_Toc139172986"/>
+      <w:bookmarkStart w:id="94" w:name="_Toc178930687"/>
+      <w:r>
+        <w:t>4.1 I</w:t>
+      </w:r>
+      <w:r>
+        <w:t>mplementation</w:t>
+      </w:r>
+      <w:bookmarkEnd w:id="93"/>
+      <w:bookmarkEnd w:id="94"/>
+    </w:p>
+    <w:p>
+      <w:pPr>
+        <w:pStyle w:val="Heading3"/>
+      </w:pPr>
+      <w:bookmarkStart w:id="95" w:name="_Toc139172987"/>
+      <w:bookmarkStart w:id="96" w:name="_Toc178930688"/>
+      <w:r>
+        <w:t>4.1.1 Tools Used</w:t>
+      </w:r>
+      <w:bookmarkEnd w:id="95"/>
+      <w:bookmarkEnd w:id="96"/>
     </w:p>
     <w:p>
       <w:pPr>
@@ -11733,174 +12317,38 @@
         <w:jc w:val="both"/>
       </w:pPr>
       <w:r>
-        <w:t xml:space="preserve">Step 4: </w:t>
-      </w:r>
-      <w:r>
-        <w:t>For every step the tiles are moved the value of f(n) is recalculated. And move which gives out the lowest value of f(n) is selected.</w:t>
-      </w:r>
-      <w:r>
-        <w:t xml:space="preserve"> If two state gives the same value of f(n) then both the solutions are explored.</w:t>
-      </w:r>
-    </w:p>
-    <w:p>
-      <w:pPr>
-        <w:spacing w:before="240" w:line="360" w:lineRule="auto"/>
-        <w:jc w:val="both"/>
-      </w:pPr>
-      <w:r>
-        <w:t>Step 5: If the current state matches the goal state, the solution path is reconstructed, and the process ends.</w:t>
-      </w:r>
-    </w:p>
-    <w:p>
-      <w:pPr>
-        <w:spacing w:before="240" w:line="360" w:lineRule="auto"/>
-        <w:jc w:val="both"/>
-      </w:pPr>
-      <w:r>
-        <w:t xml:space="preserve">Step 6: For each current state, its neighbors are generated by moving the blank tile </w:t>
-      </w:r>
-      <w:r>
-        <w:t>i.e.</w:t>
-      </w:r>
-      <w:r>
-        <w:t xml:space="preserve"> </w:t>
-      </w:r>
-      <w:r>
-        <w:t>0</w:t>
-      </w:r>
-      <w:r>
-        <w:t xml:space="preserve"> </w:t>
-      </w:r>
-      <w:r>
-        <w:t xml:space="preserve">which </w:t>
-      </w:r>
-      <w:r>
-        <w:t>is moved</w:t>
-      </w:r>
-      <w:r>
-        <w:t xml:space="preserve"> in valid directions.</w:t>
-      </w:r>
-    </w:p>
-    <w:p>
-      <w:pPr>
-        <w:spacing w:before="240" w:line="360" w:lineRule="auto"/>
-        <w:jc w:val="both"/>
-      </w:pPr>
-      <w:r>
-        <w:lastRenderedPageBreak/>
-        <w:t>Step 7: The heuristic function, h(n), is calculated using the Manhattan Distance</w:t>
-      </w:r>
-      <w:r>
-        <w:t>. It</w:t>
-      </w:r>
-      <w:r>
-        <w:t xml:space="preserve"> measures the distance between the current position of each tile and its goal position</w:t>
-      </w:r>
-      <w:r>
-        <w:t xml:space="preserve"> by comparing the tiles that are not in their correct pos</w:t>
-      </w:r>
-      <w:r>
-        <w:t>i</w:t>
-      </w:r>
-      <w:r>
-        <w:t>tion</w:t>
-      </w:r>
-      <w:r>
-        <w:t>.</w:t>
-      </w:r>
-    </w:p>
-    <w:p>
-      <w:pPr>
-        <w:spacing w:before="240" w:line="360" w:lineRule="auto"/>
-        <w:jc w:val="both"/>
-      </w:pPr>
-      <w:r>
-        <w:t>Step 8: For each neighbor, if it offers a better path than previously known, it is added to the open set, and its g(n) and f(n) are updated.</w:t>
-      </w:r>
-      <w:r>
-        <w:t xml:space="preserve"> If a state is completely explored that it is added to closed set, after which no further exploration is done.</w:t>
-      </w:r>
-    </w:p>
-    <w:p>
-      <w:pPr>
-        <w:spacing w:before="240" w:line="360" w:lineRule="auto"/>
-        <w:jc w:val="both"/>
-      </w:pPr>
-      <w:r>
-        <w:t>Step 9: The algorithm continues exploring states</w:t>
-      </w:r>
-      <w:r>
-        <w:t xml:space="preserve"> with lower f(n) score inside the openset</w:t>
-      </w:r>
-      <w:r>
-        <w:t xml:space="preserve"> until the goal state is found or the maximum iteration limit is reached.</w:t>
-      </w:r>
-    </w:p>
-    <w:p>
-      <w:pPr>
-        <w:spacing w:before="240" w:line="360" w:lineRule="auto"/>
-        <w:jc w:val="both"/>
-      </w:pPr>
-      <w:r>
-        <w:t>Step 10: If a solution is found, the reconstructPath function traces the steps back to the initial state, and the solution is animated on the grid.</w:t>
-      </w:r>
-    </w:p>
-    <w:p>
-      <w:pPr>
-        <w:spacing w:before="240" w:line="360" w:lineRule="auto"/>
-        <w:jc w:val="both"/>
-      </w:pPr>
-      <w:r>
-        <w:t>Step 11: If no solution is found within the iteration limit, a failure message is displayed.</w:t>
-      </w:r>
-      <w:r>
-        <w:br w:type="page"/>
-      </w:r>
-    </w:p>
-    <w:p>
-      <w:pPr>
-        <w:pStyle w:val="Heading1"/>
-        <w:spacing w:before="0" w:after="200"/>
-      </w:pPr>
-      <w:bookmarkStart w:id="92" w:name="_Toc178930686"/>
-      <w:r>
-        <w:lastRenderedPageBreak/>
-        <w:t>CHAPTER 4: IMPLEMENTATION AND TESTING</w:t>
-      </w:r>
-      <w:bookmarkEnd w:id="83"/>
-      <w:bookmarkEnd w:id="92"/>
-      <w:r>
-        <w:t xml:space="preserve"> </w:t>
-      </w:r>
-    </w:p>
-    <w:p/>
-    <w:p>
-      <w:pPr>
-        <w:pStyle w:val="Heading2"/>
-        <w:spacing w:before="0" w:after="200" w:line="360" w:lineRule="auto"/>
-      </w:pPr>
-      <w:bookmarkStart w:id="93" w:name="_Toc139172986"/>
-      <w:bookmarkStart w:id="94" w:name="_Toc178930687"/>
-      <w:r>
-        <w:t>4.1 I</w:t>
-      </w:r>
-      <w:r>
-        <w:t>mplementation</w:t>
-      </w:r>
-      <w:bookmarkEnd w:id="93"/>
-      <w:bookmarkEnd w:id="94"/>
-    </w:p>
-    <w:p>
-      <w:pPr>
-        <w:pStyle w:val="Heading3"/>
-      </w:pPr>
-      <w:bookmarkStart w:id="95" w:name="_Toc139172987"/>
-      <w:bookmarkStart w:id="96" w:name="_Toc178930688"/>
-      <w:r>
-        <w:t>4.1.1 Tools Used</w:t>
-      </w:r>
-      <w:bookmarkEnd w:id="95"/>
-      <w:bookmarkEnd w:id="96"/>
+        <w:t>Various tools that have been used in this project is listed below:</w:t>
+      </w:r>
+    </w:p>
+    <w:p>
+      <w:pPr>
+        <w:spacing w:line="360" w:lineRule="auto"/>
+        <w:rPr>
+          <w:b/>
+          <w:bCs/>
+        </w:rPr>
+      </w:pPr>
+      <w:r>
+        <w:rPr>
+          <w:b/>
+          <w:bCs/>
+        </w:rPr>
+        <w:t xml:space="preserve">i) </w:t>
+      </w:r>
+      <w:r>
+        <w:rPr>
+          <w:b/>
+          <w:bCs/>
+        </w:rPr>
+        <w:t>Visual Studio Code</w:t>
+      </w:r>
+      <w:r>
+        <w:rPr>
+          <w:b/>
+          <w:bCs/>
+        </w:rPr>
+        <w:t>:</w:t>
+      </w:r>
     </w:p>
     <w:p>
       <w:pPr>
@@ -11908,42 +12356,10 @@
         <w:jc w:val="both"/>
       </w:pPr>
       <w:r>
-        <w:t>Various tools that have been used in this project is listed below:</w:t>
-      </w:r>
-    </w:p>
-    <w:p>
-      <w:pPr>
-        <w:spacing w:line="360" w:lineRule="auto"/>
-        <w:rPr>
-          <w:b/>
-          <w:bCs/>
-        </w:rPr>
-      </w:pPr>
-      <w:r>
-        <w:rPr>
-          <w:b/>
-          <w:bCs/>
-        </w:rPr>
-        <w:t xml:space="preserve">i) </w:t>
-      </w:r>
-      <w:r>
-        <w:rPr>
-          <w:b/>
-          <w:bCs/>
-        </w:rPr>
-        <w:t>Microsoft Visual Studio:</w:t>
-      </w:r>
-    </w:p>
-    <w:p>
-      <w:pPr>
-        <w:spacing w:line="360" w:lineRule="auto"/>
-        <w:jc w:val="both"/>
-      </w:pPr>
-      <w:r>
-        <w:t>Microsoft Visual Studio is a robust and feature-rich integrated development environment (IDE) that facilitates efficient software development across multiple platforms. It offers a comprehensive suite of tools and resources for coding, debugging, and testing applications</w:t>
-      </w:r>
-      <w:r>
-        <w:t>. As visual studio is user-friendly and supports all programming language that is used in this project. It is used as an IDE for this project.</w:t>
+        <w:t>Visual Studio Code is a source-code editor used for writing and managing the HTML, CSS, JavaScript, and PHP code used in this project</w:t>
+      </w:r>
+      <w:r>
+        <w:t>.</w:t>
       </w:r>
     </w:p>
     <w:p>
@@ -12077,11 +12493,7 @@
         <w:jc w:val="both"/>
       </w:pPr>
       <w:r>
-        <w:t xml:space="preserve">This is the primary module where users can engage in playing the 8-Puzzle. The module </w:t>
-      </w:r>
-      <w:r>
-        <w:lastRenderedPageBreak/>
-        <w:t>provides an interactive interface for users to rearrange puzzle pieces to achieve the goal state. Key features within the game module include</w:t>
+        <w:t>This is the primary module where users can engage in playing the 8-Puzzle. The module provides an interactive interface for users to rearrange puzzle pieces to achieve the goal state. Key features within the game module include</w:t>
       </w:r>
       <w:r>
         <w:t>:</w:t>
@@ -12107,7 +12519,11 @@
         <w:t>The</w:t>
       </w:r>
       <w:r>
-        <w:t xml:space="preserve"> timer runs continuously while users solve the puzzle. Upon successful completion of the puzzle, the elapsed time is recorded along with the user's username in the database. This feature not only adds a challenge to the game but also tracks performance for competitive rankings</w:t>
+        <w:t xml:space="preserve"> timer runs continuously while users solve the puzzle. Upon successful </w:t>
+      </w:r>
+      <w:r>
+        <w:lastRenderedPageBreak/>
+        <w:t>completion of the puzzle, the elapsed time is recorded along with the user's username in the database. This feature not only adds a challenge to the game but also tracks performance for competitive rankings</w:t>
       </w:r>
       <w:r>
         <w:t xml:space="preserve">. </w:t>
@@ -12222,6 +12638,9 @@
         <w:t xml:space="preserve">Reset: </w:t>
       </w:r>
       <w:r>
+        <w:t>T</w:t>
+      </w:r>
+      <w:r>
         <w:t>he reset feature allows users to restart the puzzle with a new configuration of tiles. This is useful when users want to challenge themselves with different puzzle data or simply start over after being stuck</w:t>
       </w:r>
       <w:r>
@@ -12311,11 +12730,7 @@
         <w:t xml:space="preserve">Reset: </w:t>
       </w:r>
       <w:r>
-        <w:t xml:space="preserve">Clears the current puzzle data, allowing users to input their custom puzzle to be </w:t>
-      </w:r>
-      <w:r>
-        <w:lastRenderedPageBreak/>
-        <w:t>solved. This feature is especially useful for users who wish to test specific configurations and see how the solver tackles different challenges</w:t>
+        <w:t>Clears the current puzzle data, allowing users to input their custom puzzle to be solved. This feature is especially useful for users who wish to test specific configurations and see how the solver tackles different challenges</w:t>
       </w:r>
       <w:r>
         <w:t xml:space="preserve">. </w:t>
@@ -12335,7 +12750,11 @@
         <w:jc w:val="both"/>
       </w:pPr>
       <w:r>
-        <w:t>Generates a random solvable puzzle configuration, allowing users to see the solver in action on a variety of puzzles. This feature adds variety and unpredictability to the puzzle-solving experience, making the game more engaging</w:t>
+        <w:t xml:space="preserve">Generates a random solvable puzzle configuration, allowing users to see the solver in action on a variety of puzzles. This feature adds variety and unpredictability to the </w:t>
+      </w:r>
+      <w:r>
+        <w:lastRenderedPageBreak/>
+        <w:t>puzzle-solving experience, making the game more engaging</w:t>
       </w:r>
       <w:r>
         <w:t xml:space="preserve">. </w:t>
@@ -14282,13 +14701,11 @@
           </w:tcPr>
           <w:p>
             <w:pPr>
-              <w:pStyle w:val="ListParagraph"/>
-              <w:numPr>
-                <w:ilvl w:val="0"/>
-                <w:numId w:val="24"/>
-              </w:numPr>
               <w:spacing w:line="360" w:lineRule="auto"/>
             </w:pPr>
+            <w:r>
+              <w:t>6.</w:t>
+            </w:r>
           </w:p>
         </w:tc>
         <w:tc>
@@ -14369,13 +14786,11 @@
           </w:tcPr>
           <w:p>
             <w:pPr>
-              <w:pStyle w:val="ListParagraph"/>
-              <w:numPr>
-                <w:ilvl w:val="0"/>
-                <w:numId w:val="24"/>
-              </w:numPr>
               <w:spacing w:line="360" w:lineRule="auto"/>
             </w:pPr>
+            <w:r>
+              <w:t>7.</w:t>
+            </w:r>
           </w:p>
         </w:tc>
         <w:tc>
@@ -14451,13 +14866,11 @@
           </w:tcPr>
           <w:p>
             <w:pPr>
-              <w:pStyle w:val="ListParagraph"/>
-              <w:numPr>
-                <w:ilvl w:val="0"/>
-                <w:numId w:val="24"/>
-              </w:numPr>
               <w:spacing w:line="360" w:lineRule="auto"/>
             </w:pPr>
+            <w:r>
+              <w:t>8.</w:t>
+            </w:r>
           </w:p>
         </w:tc>
         <w:tc>
@@ -14541,13 +14954,11 @@
           </w:tcPr>
           <w:p>
             <w:pPr>
-              <w:pStyle w:val="ListParagraph"/>
-              <w:numPr>
-                <w:ilvl w:val="0"/>
-                <w:numId w:val="24"/>
-              </w:numPr>
               <w:spacing w:line="360" w:lineRule="auto"/>
             </w:pPr>
+            <w:r>
+              <w:t>9.</w:t>
+            </w:r>
           </w:p>
         </w:tc>
         <w:tc>
@@ -14629,13 +15040,11 @@
           </w:tcPr>
           <w:p>
             <w:pPr>
-              <w:pStyle w:val="ListParagraph"/>
-              <w:numPr>
-                <w:ilvl w:val="0"/>
-                <w:numId w:val="24"/>
-              </w:numPr>
               <w:spacing w:line="360" w:lineRule="auto"/>
             </w:pPr>
+            <w:r>
+              <w:t>10.</w:t>
+            </w:r>
           </w:p>
         </w:tc>
         <w:tc>
@@ -14720,13 +15129,11 @@
           </w:tcPr>
           <w:p>
             <w:pPr>
-              <w:pStyle w:val="ListParagraph"/>
-              <w:numPr>
-                <w:ilvl w:val="0"/>
-                <w:numId w:val="24"/>
-              </w:numPr>
               <w:spacing w:line="360" w:lineRule="auto"/>
             </w:pPr>
+            <w:r>
+              <w:t>11.</w:t>
+            </w:r>
           </w:p>
         </w:tc>
         <w:tc>
@@ -14805,13 +15212,11 @@
           </w:tcPr>
           <w:p>
             <w:pPr>
-              <w:pStyle w:val="ListParagraph"/>
-              <w:numPr>
-                <w:ilvl w:val="0"/>
-                <w:numId w:val="24"/>
-              </w:numPr>
               <w:spacing w:line="360" w:lineRule="auto"/>
             </w:pPr>
+            <w:r>
+              <w:t>12.</w:t>
+            </w:r>
           </w:p>
         </w:tc>
         <w:tc>
@@ -14890,13 +15295,11 @@
           </w:tcPr>
           <w:p>
             <w:pPr>
-              <w:pStyle w:val="ListParagraph"/>
-              <w:numPr>
-                <w:ilvl w:val="0"/>
-                <w:numId w:val="24"/>
-              </w:numPr>
               <w:spacing w:line="360" w:lineRule="auto"/>
             </w:pPr>
+            <w:r>
+              <w:t>13.</w:t>
+            </w:r>
           </w:p>
         </w:tc>
         <w:tc>
@@ -16559,6 +16962,12 @@
         <w:t>CONCLUSION AND FUTURE RECOMMENDATION</w:t>
       </w:r>
       <w:bookmarkEnd w:id="106"/>
+      <w:r>
+        <w:rPr>
+          <w:rFonts w:eastAsia="Times New Roman"/>
+        </w:rPr>
+        <w:t>S</w:t>
+      </w:r>
     </w:p>
     <w:p/>
     <w:p>
@@ -16595,7 +17004,6 @@
         <w:pStyle w:val="Heading2"/>
         <w:spacing w:before="0" w:after="200" w:line="360" w:lineRule="auto"/>
       </w:pPr>
-      <w:bookmarkStart w:id="108" w:name="_Toc178930695"/>
       <w:r>
         <w:t>5.</w:t>
       </w:r>
@@ -16603,9 +17011,11 @@
         <w:t>2</w:t>
       </w:r>
       <w:r>
-        <w:t xml:space="preserve"> Lesson Learnt</w:t>
-      </w:r>
-      <w:bookmarkEnd w:id="108"/>
+        <w:t xml:space="preserve"> Lesson Learn</w:t>
+      </w:r>
+      <w:r>
+        <w:t>ed</w:t>
+      </w:r>
     </w:p>
     <w:p>
       <w:pPr>
@@ -16730,12 +17140,15 @@
         <w:pStyle w:val="Heading2"/>
         <w:spacing w:before="0" w:after="200" w:line="360" w:lineRule="auto"/>
       </w:pPr>
-      <w:bookmarkStart w:id="109" w:name="_Toc178930696"/>
+      <w:bookmarkStart w:id="108" w:name="_Toc178930696"/>
       <w:r>
         <w:lastRenderedPageBreak/>
         <w:t>5.3 Future Recommendation</w:t>
       </w:r>
-      <w:bookmarkEnd w:id="109"/>
+      <w:bookmarkEnd w:id="108"/>
+      <w:r>
+        <w:t>s</w:t>
+      </w:r>
     </w:p>
     <w:p>
       <w:pPr>
@@ -16870,7 +17283,7 @@
         <w:br w:type="page"/>
       </w:r>
     </w:p>
-    <w:bookmarkStart w:id="110" w:name="_Toc178930697" w:displacedByCustomXml="next"/>
+    <w:bookmarkStart w:id="109" w:name="_Toc178930697" w:displacedByCustomXml="next"/>
     <w:sdt>
       <w:sdtPr>
         <w:rPr>
@@ -16895,7 +17308,7 @@
           <w:r>
             <w:t>REFERENCE</w:t>
           </w:r>
-          <w:bookmarkEnd w:id="110"/>
+          <w:bookmarkEnd w:id="109"/>
         </w:p>
         <w:sdt>
           <w:sdtPr>
@@ -16926,7 +17339,6 @@
               <w:tblPr>
                 <w:tblW w:w="5000" w:type="pct"/>
                 <w:tblCellSpacing w:w="15" w:type="dxa"/>
-                <w:tblLayout w:type="fixed"/>
                 <w:tblCellMar>
                   <w:top w:w="15" w:type="dxa"/>
                   <w:left w:w="15" w:type="dxa"/>
@@ -16936,22 +17348,22 @@
                 <w:tblLook w:val="04A0" w:firstRow="1" w:lastRow="0" w:firstColumn="1" w:lastColumn="0" w:noHBand="0" w:noVBand="1"/>
               </w:tblPr>
               <w:tblGrid>
-                <w:gridCol w:w="450"/>
-                <w:gridCol w:w="8216"/>
+                <w:gridCol w:w="355"/>
+                <w:gridCol w:w="8311"/>
               </w:tblGrid>
               <w:tr>
                 <w:trPr>
+                  <w:divId w:val="1076439043"/>
                   <w:tblCellSpacing w:w="15" w:type="dxa"/>
                 </w:trPr>
                 <w:tc>
                   <w:tcPr>
-                    <w:tcW w:w="234" w:type="pct"/>
+                    <w:tcW w:w="50" w:type="pct"/>
                     <w:hideMark/>
                   </w:tcPr>
                   <w:p>
                     <w:pPr>
                       <w:pStyle w:val="Bibliography"/>
-                      <w:ind w:right="-105"/>
                       <w:rPr>
                         <w:noProof/>
                       </w:rPr>
@@ -16966,14 +17378,12 @@
                 </w:tc>
                 <w:tc>
                   <w:tcPr>
-                    <w:tcW w:w="4714" w:type="pct"/>
+                    <w:tcW w:w="0" w:type="auto"/>
                     <w:hideMark/>
                   </w:tcPr>
                   <w:p>
                     <w:pPr>
                       <w:pStyle w:val="Bibliography"/>
-                      <w:spacing w:line="360" w:lineRule="auto"/>
-                      <w:jc w:val="both"/>
                       <w:rPr>
                         <w:noProof/>
                       </w:rPr>
@@ -16982,18 +17392,33 @@
                       <w:rPr>
                         <w:noProof/>
                       </w:rPr>
-                      <w:t>V. P. S. H. L. T. C. w. Z. A. A. S. Cheng Min Yang, "Solver of 8-Puzzle with Genetic Algorithm," Asia Pacific University of Technology, 2023. [Online]. Available: https://jati.sites.apiit.edu.my/files/2022/12/Volume7_Issue1_Paper6_2023.pdf. [Accessed 1 August 2024].</w:t>
+                      <w:t xml:space="preserve">C. M. Yang, V. Pek, S. H. Ling, T. C. Wei and Z. A. A. Salam, "Solver of 8-Puzzle with Genetic Algorithm," </w:t>
+                    </w:r>
+                    <w:r>
+                      <w:rPr>
+                        <w:i/>
+                        <w:iCs/>
+                        <w:noProof/>
+                      </w:rPr>
+                      <w:t xml:space="preserve">Journal of Applied Technology and Innovation, </w:t>
+                    </w:r>
+                    <w:r>
+                      <w:rPr>
+                        <w:noProof/>
+                      </w:rPr>
+                      <w:t xml:space="preserve">vol. 7, no. 1, pp. 28-32, 1 March 2023. </w:t>
                     </w:r>
                   </w:p>
                 </w:tc>
               </w:tr>
               <w:tr>
                 <w:trPr>
+                  <w:divId w:val="1076439043"/>
                   <w:tblCellSpacing w:w="15" w:type="dxa"/>
                 </w:trPr>
                 <w:tc>
                   <w:tcPr>
-                    <w:tcW w:w="234" w:type="pct"/>
+                    <w:tcW w:w="50" w:type="pct"/>
                     <w:hideMark/>
                   </w:tcPr>
                   <w:p>
@@ -17013,14 +17438,12 @@
                 </w:tc>
                 <w:tc>
                   <w:tcPr>
-                    <w:tcW w:w="4714" w:type="pct"/>
+                    <w:tcW w:w="0" w:type="auto"/>
                     <w:hideMark/>
                   </w:tcPr>
                   <w:p>
                     <w:pPr>
                       <w:pStyle w:val="Bibliography"/>
-                      <w:spacing w:line="360" w:lineRule="auto"/>
-                      <w:jc w:val="both"/>
                       <w:rPr>
                         <w:noProof/>
                       </w:rPr>
@@ -17029,18 +17452,33 @@
                       <w:rPr>
                         <w:noProof/>
                       </w:rPr>
-                      <w:t>A. Reinefeld, Paderborn Center for Parallel Computing, [Online]. Available: https://citeseerx.ist.psu.edu/document?repid=rep1&amp;type=pdf&amp;doi=f74460d8130a5e580e16f671d4fcf227d26790ab. [Accessed 1 August 2024].</w:t>
+                      <w:t xml:space="preserve">A. Reinefeld, "Complete Solution of the Eight-Puzzle and the Benefit of Node Ordering in IDA*," in </w:t>
+                    </w:r>
+                    <w:r>
+                      <w:rPr>
+                        <w:i/>
+                        <w:iCs/>
+                        <w:noProof/>
+                      </w:rPr>
+                      <w:t>Thirteenth International Joint Conference on Artificial Intelligence</w:t>
+                    </w:r>
+                    <w:r>
+                      <w:rPr>
+                        <w:noProof/>
+                      </w:rPr>
+                      <w:t xml:space="preserve">, Chambéry, France, 1993. </w:t>
                     </w:r>
                   </w:p>
                 </w:tc>
               </w:tr>
               <w:tr>
                 <w:trPr>
+                  <w:divId w:val="1076439043"/>
                   <w:tblCellSpacing w:w="15" w:type="dxa"/>
                 </w:trPr>
                 <w:tc>
                   <w:tcPr>
-                    <w:tcW w:w="234" w:type="pct"/>
+                    <w:tcW w:w="50" w:type="pct"/>
                     <w:hideMark/>
                   </w:tcPr>
                   <w:p>
@@ -17060,15 +17498,12 @@
                 </w:tc>
                 <w:tc>
                   <w:tcPr>
-                    <w:tcW w:w="4714" w:type="pct"/>
+                    <w:tcW w:w="0" w:type="auto"/>
                     <w:hideMark/>
                   </w:tcPr>
                   <w:p>
                     <w:pPr>
                       <w:pStyle w:val="Bibliography"/>
-                      <w:spacing w:line="360" w:lineRule="auto"/>
-                      <w:ind w:left="47"/>
-                      <w:jc w:val="both"/>
                       <w:rPr>
                         <w:noProof/>
                       </w:rPr>
@@ -17077,7 +17512,21 @@
                       <w:rPr>
                         <w:noProof/>
                       </w:rPr>
-                      <w:t>G. B. A. G. H. P. Vinay Menon, Vellore Institute of Technology, [Online]. Available: https://wwjmrd.com/upload/performance-analysis-of-various-uninformed-and-informed-search-strategies-on-8-puzzle-problems---a-case-study_1546243350.pdf. [Accessed 1 August 2024].</w:t>
+                      <w:t xml:space="preserve">V. Menon, G. B. Amali.D, G. Gopichand, H. Santhi and P. Gayatri, "Performance Analysis of Various Uninformed and Informed Search Strategies on 8 Puzzle Problems - A Case Study," </w:t>
+                    </w:r>
+                    <w:r>
+                      <w:rPr>
+                        <w:i/>
+                        <w:iCs/>
+                        <w:noProof/>
+                      </w:rPr>
+                      <w:t xml:space="preserve">World Wide Journal of Multidisciplinary Research and Development, </w:t>
+                    </w:r>
+                    <w:r>
+                      <w:rPr>
+                        <w:noProof/>
+                      </w:rPr>
+                      <w:t xml:space="preserve">vol. 4, no. 12, pp. 96-99, 2018. </w:t>
                     </w:r>
                   </w:p>
                 </w:tc>
@@ -17085,6 +17534,7 @@
             </w:tbl>
             <w:p>
               <w:pPr>
+                <w:divId w:val="1076439043"/>
                 <w:rPr>
                   <w:rFonts w:eastAsia="Times New Roman"/>
                   <w:noProof/>
@@ -17092,6 +17542,9 @@
               </w:pPr>
             </w:p>
             <w:p>
+              <w:pPr>
+                <w:jc w:val="both"/>
+              </w:pPr>
               <w:r>
                 <w:rPr>
                   <w:b/>
@@ -17120,10 +17573,25 @@
     </w:p>
     <w:p>
       <w:pPr>
+        <w:rPr>
+          <w:rFonts w:eastAsiaTheme="majorEastAsia"/>
+          <w:b/>
+          <w:bCs/>
+          <w:color w:val="000000" w:themeColor="text1"/>
+          <w:sz w:val="32"/>
+          <w:szCs w:val="32"/>
+        </w:rPr>
+      </w:pPr>
+      <w:bookmarkStart w:id="110" w:name="_Toc178930698"/>
+      <w:r>
+        <w:br w:type="page"/>
+      </w:r>
+    </w:p>
+    <w:p>
+      <w:pPr>
         <w:pStyle w:val="Heading1"/>
         <w:spacing w:before="0" w:after="200"/>
       </w:pPr>
-      <w:bookmarkStart w:id="111" w:name="_Toc178930698"/>
       <w:r>
         <w:lastRenderedPageBreak/>
         <w:t>A</w:t>
@@ -17131,7 +17599,7 @@
       <w:r>
         <w:t>PPENDICES</w:t>
       </w:r>
-      <w:bookmarkEnd w:id="111"/>
+      <w:bookmarkEnd w:id="110"/>
     </w:p>
     <w:p>
       <w:r>
@@ -17139,7 +17607,7 @@
           <w:noProof/>
         </w:rPr>
         <w:drawing>
-          <wp:anchor distT="0" distB="0" distL="114300" distR="114300" simplePos="0" relativeHeight="251689984" behindDoc="1" locked="0" layoutInCell="1" allowOverlap="1" wp14:anchorId="4FBC15E0" wp14:editId="06E899D6">
+          <wp:anchor distT="0" distB="0" distL="114300" distR="114300" simplePos="0" relativeHeight="251689984" behindDoc="1" locked="0" layoutInCell="1" allowOverlap="1" wp14:anchorId="4FBC15E0" wp14:editId="32C9050B">
             <wp:simplePos x="0" y="0"/>
             <wp:positionH relativeFrom="margin">
               <wp:align>center</wp:align>
@@ -17170,7 +17638,7 @@
                     <pic:cNvPicPr/>
                   </pic:nvPicPr>
                   <pic:blipFill>
-                    <a:blip r:embed="rId26" cstate="print">
+                    <a:blip r:embed="rId25" cstate="print">
                       <a:extLst>
                         <a:ext uri="{28A0092B-C50C-407E-A947-70E740481C1C}">
                           <a14:useLocalDpi xmlns:a14="http://schemas.microsoft.com/office/drawing/2010/main" val="0"/>
@@ -17355,7 +17823,7 @@
           <w:noProof/>
         </w:rPr>
         <w:drawing>
-          <wp:anchor distT="0" distB="0" distL="114300" distR="114300" simplePos="0" relativeHeight="251691008" behindDoc="1" locked="0" layoutInCell="1" allowOverlap="1" wp14:anchorId="0B601700" wp14:editId="1DF97ACC">
+          <wp:anchor distT="0" distB="0" distL="114300" distR="114300" simplePos="0" relativeHeight="251691008" behindDoc="1" locked="0" layoutInCell="1" allowOverlap="1" wp14:anchorId="0B601700" wp14:editId="2A484D44">
             <wp:simplePos x="0" y="0"/>
             <wp:positionH relativeFrom="margin">
               <wp:align>center</wp:align>
@@ -17386,7 +17854,7 @@
                     <pic:cNvPicPr/>
                   </pic:nvPicPr>
                   <pic:blipFill>
-                    <a:blip r:embed="rId27" cstate="print">
+                    <a:blip r:embed="rId26" cstate="print">
                       <a:extLst>
                         <a:ext uri="{28A0092B-C50C-407E-A947-70E740481C1C}">
                           <a14:useLocalDpi xmlns:a14="http://schemas.microsoft.com/office/drawing/2010/main" val="0"/>
@@ -17758,7 +18226,7 @@
                     <pic:cNvPicPr/>
                   </pic:nvPicPr>
                   <pic:blipFill>
-                    <a:blip r:embed="rId28">
+                    <a:blip r:embed="rId27">
                       <a:extLst>
                         <a:ext uri="{28A0092B-C50C-407E-A947-70E740481C1C}">
                           <a14:useLocalDpi xmlns:a14="http://schemas.microsoft.com/office/drawing/2010/main" val="0"/>
@@ -18036,7 +18504,7 @@
                     <pic:cNvPicPr/>
                   </pic:nvPicPr>
                   <pic:blipFill>
-                    <a:blip r:embed="rId29"/>
+                    <a:blip r:embed="rId28"/>
                     <a:stretch>
                       <a:fillRect/>
                     </a:stretch>
@@ -18189,7 +18657,7 @@
                     <pic:cNvPicPr/>
                   </pic:nvPicPr>
                   <pic:blipFill>
-                    <a:blip r:embed="rId30"/>
+                    <a:blip r:embed="rId29"/>
                     <a:stretch>
                       <a:fillRect/>
                     </a:stretch>
@@ -18251,7 +18719,7 @@
                     <pic:cNvPicPr/>
                   </pic:nvPicPr>
                   <pic:blipFill>
-                    <a:blip r:embed="rId31">
+                    <a:blip r:embed="rId30">
                       <a:extLst>
                         <a:ext uri="{28A0092B-C50C-407E-A947-70E740481C1C}">
                           <a14:useLocalDpi xmlns:a14="http://schemas.microsoft.com/office/drawing/2010/main" val="0"/>
@@ -18377,7 +18845,7 @@
         </w:rPr>
         <w:lastRenderedPageBreak/>
         <w:drawing>
-          <wp:anchor distT="0" distB="0" distL="114300" distR="114300" simplePos="0" relativeHeight="251693056" behindDoc="1" locked="0" layoutInCell="1" allowOverlap="1" wp14:anchorId="6681BA2E" wp14:editId="3DA27F46">
+          <wp:anchor distT="0" distB="0" distL="114300" distR="114300" simplePos="0" relativeHeight="251693056" behindDoc="1" locked="0" layoutInCell="1" allowOverlap="1" wp14:anchorId="6681BA2E" wp14:editId="6879F8BD">
             <wp:simplePos x="0" y="0"/>
             <wp:positionH relativeFrom="margin">
               <wp:posOffset>1280160</wp:posOffset>
@@ -18408,7 +18876,7 @@
                     <pic:cNvPicPr/>
                   </pic:nvPicPr>
                   <pic:blipFill>
-                    <a:blip r:embed="rId32" cstate="print">
+                    <a:blip r:embed="rId31" cstate="print">
                       <a:extLst>
                         <a:ext uri="{28A0092B-C50C-407E-A947-70E740481C1C}">
                           <a14:useLocalDpi xmlns:a14="http://schemas.microsoft.com/office/drawing/2010/main" val="0"/>
@@ -18477,7 +18945,7 @@
                     <pic:cNvPicPr/>
                   </pic:nvPicPr>
                   <pic:blipFill>
-                    <a:blip r:embed="rId33"/>
+                    <a:blip r:embed="rId32"/>
                     <a:stretch>
                       <a:fillRect/>
                     </a:stretch>
@@ -18533,7 +19001,7 @@
         </w:rPr>
         <w:lastRenderedPageBreak/>
         <w:drawing>
-          <wp:anchor distT="0" distB="0" distL="114300" distR="114300" simplePos="0" relativeHeight="251694080" behindDoc="1" locked="0" layoutInCell="1" allowOverlap="1" wp14:anchorId="15B59A6A" wp14:editId="1B985285">
+          <wp:anchor distT="0" distB="0" distL="114300" distR="114300" simplePos="0" relativeHeight="251694080" behindDoc="1" locked="0" layoutInCell="1" allowOverlap="1" wp14:anchorId="15B59A6A" wp14:editId="1247D318">
             <wp:simplePos x="0" y="0"/>
             <wp:positionH relativeFrom="column">
               <wp:posOffset>1082040</wp:posOffset>
@@ -18564,7 +19032,7 @@
                     <pic:cNvPicPr/>
                   </pic:nvPicPr>
                   <pic:blipFill>
-                    <a:blip r:embed="rId34" cstate="print">
+                    <a:blip r:embed="rId33" cstate="print">
                       <a:extLst>
                         <a:ext uri="{28A0092B-C50C-407E-A947-70E740481C1C}">
                           <a14:useLocalDpi xmlns:a14="http://schemas.microsoft.com/office/drawing/2010/main" val="0"/>
@@ -18664,7 +19132,7 @@
                     <pic:cNvPicPr/>
                   </pic:nvPicPr>
                   <pic:blipFill>
-                    <a:blip r:embed="rId35"/>
+                    <a:blip r:embed="rId34"/>
                     <a:stretch>
                       <a:fillRect/>
                     </a:stretch>
@@ -18710,7 +19178,7 @@
                     <pic:cNvPicPr/>
                   </pic:nvPicPr>
                   <pic:blipFill>
-                    <a:blip r:embed="rId36"/>
+                    <a:blip r:embed="rId35"/>
                     <a:stretch>
                       <a:fillRect/>
                     </a:stretch>
@@ -18742,14 +19210,6 @@
       <w:r>
         <w:t>8</w:t>
       </w:r>
-      <w:fldSimple w:instr=" SEQ Figure \* ARABIC ">
-        <w:r>
-          <w:rPr>
-            <w:noProof/>
-          </w:rPr>
-          <w:t>6</w:t>
-        </w:r>
-      </w:fldSimple>
       <w:r>
         <w:t xml:space="preserve">: Test Case for </w:t>
       </w:r>
@@ -18787,7 +19247,7 @@
                     <pic:cNvPicPr/>
                   </pic:nvPicPr>
                   <pic:blipFill>
-                    <a:blip r:embed="rId37"/>
+                    <a:blip r:embed="rId36"/>
                     <a:stretch>
                       <a:fillRect/>
                     </a:stretch>
@@ -18834,7 +19294,7 @@
                     <pic:cNvPicPr/>
                   </pic:nvPicPr>
                   <pic:blipFill>
-                    <a:blip r:embed="rId38"/>
+                    <a:blip r:embed="rId37"/>
                     <a:stretch>
                       <a:fillRect/>
                     </a:stretch>
@@ -18881,7 +19341,7 @@
                     <pic:cNvPicPr/>
                   </pic:nvPicPr>
                   <pic:blipFill>
-                    <a:blip r:embed="rId39"/>
+                    <a:blip r:embed="rId38"/>
                     <a:stretch>
                       <a:fillRect/>
                     </a:stretch>
@@ -18950,7 +19410,7 @@
                     <pic:cNvPicPr/>
                   </pic:nvPicPr>
                   <pic:blipFill>
-                    <a:blip r:embed="rId40"/>
+                    <a:blip r:embed="rId39"/>
                     <a:stretch>
                       <a:fillRect/>
                     </a:stretch>
@@ -18997,7 +19457,7 @@
                     <pic:cNvPicPr/>
                   </pic:nvPicPr>
                   <pic:blipFill>
-                    <a:blip r:embed="rId41"/>
+                    <a:blip r:embed="rId40"/>
                     <a:stretch>
                       <a:fillRect/>
                     </a:stretch>
@@ -19065,7 +19525,7 @@
                     <pic:cNvPicPr/>
                   </pic:nvPicPr>
                   <pic:blipFill>
-                    <a:blip r:embed="rId42"/>
+                    <a:blip r:embed="rId41"/>
                     <a:stretch>
                       <a:fillRect/>
                     </a:stretch>
@@ -19140,7 +19600,7 @@
                     <pic:cNvPicPr/>
                   </pic:nvPicPr>
                   <pic:blipFill>
-                    <a:blip r:embed="rId43"/>
+                    <a:blip r:embed="rId42"/>
                     <a:stretch>
                       <a:fillRect/>
                     </a:stretch>
@@ -19187,7 +19647,7 @@
                     <pic:cNvPicPr/>
                   </pic:nvPicPr>
                   <pic:blipFill>
-                    <a:blip r:embed="rId44"/>
+                    <a:blip r:embed="rId43"/>
                     <a:stretch>
                       <a:fillRect/>
                     </a:stretch>
@@ -19240,7 +19700,7 @@
         <w:spacing w:line="360" w:lineRule="auto"/>
         <w:jc w:val="center"/>
       </w:pPr>
-      <w:bookmarkStart w:id="112" w:name="_Toc143166109"/>
+      <w:bookmarkStart w:id="111" w:name="_Toc143166109"/>
     </w:p>
     <w:p>
       <w:pPr>
@@ -19253,7 +19713,7 @@
         </w:rPr>
         <w:lastRenderedPageBreak/>
         <w:drawing>
-          <wp:anchor distT="0" distB="0" distL="114300" distR="114300" simplePos="0" relativeHeight="251695104" behindDoc="1" locked="0" layoutInCell="1" allowOverlap="1" wp14:anchorId="7CE6C7D0" wp14:editId="43291F08">
+          <wp:anchor distT="0" distB="0" distL="114300" distR="114300" simplePos="0" relativeHeight="251695104" behindDoc="1" locked="0" layoutInCell="1" allowOverlap="1" wp14:anchorId="7CE6C7D0" wp14:editId="78D80514">
             <wp:simplePos x="0" y="0"/>
             <wp:positionH relativeFrom="column">
               <wp:posOffset>1554480</wp:posOffset>
@@ -19284,7 +19744,7 @@
                     <pic:cNvPicPr/>
                   </pic:nvPicPr>
                   <pic:blipFill>
-                    <a:blip r:embed="rId45" cstate="print">
+                    <a:blip r:embed="rId44" cstate="print">
                       <a:extLst>
                         <a:ext uri="{28A0092B-C50C-407E-A947-70E740481C1C}">
                           <a14:useLocalDpi xmlns:a14="http://schemas.microsoft.com/office/drawing/2010/main" val="0"/>
@@ -19382,7 +19842,7 @@
       <w:r>
         <w:t xml:space="preserve">: Test Case for </w:t>
       </w:r>
-      <w:bookmarkEnd w:id="112"/>
+      <w:bookmarkEnd w:id="111"/>
       <w:r>
         <w:t>Invalid and Duplicate input</w:t>
       </w:r>
@@ -19428,7 +19888,7 @@
                     <pic:cNvPicPr/>
                   </pic:nvPicPr>
                   <pic:blipFill>
-                    <a:blip r:embed="rId46">
+                    <a:blip r:embed="rId45">
                       <a:extLst>
                         <a:ext uri="{28A0092B-C50C-407E-A947-70E740481C1C}">
                           <a14:useLocalDpi xmlns:a14="http://schemas.microsoft.com/office/drawing/2010/main" val="0"/>
@@ -19466,7 +19926,7 @@
         <w:spacing w:line="360" w:lineRule="auto"/>
         <w:jc w:val="center"/>
       </w:pPr>
-      <w:bookmarkStart w:id="113" w:name="_Toc143166110"/>
+      <w:bookmarkStart w:id="112" w:name="_Toc143166110"/>
     </w:p>
     <w:p>
       <w:pPr>
@@ -19533,7 +19993,7 @@
       <w:r>
         <w:t xml:space="preserve">: Test Case for </w:t>
       </w:r>
-      <w:bookmarkEnd w:id="113"/>
+      <w:bookmarkEnd w:id="112"/>
       <w:r>
         <w:t>Reset Button</w:t>
       </w:r>
@@ -19549,7 +20009,7 @@
         </w:rPr>
         <w:lastRenderedPageBreak/>
         <w:drawing>
-          <wp:anchor distT="0" distB="0" distL="114300" distR="114300" simplePos="0" relativeHeight="251697152" behindDoc="1" locked="0" layoutInCell="1" allowOverlap="1" wp14:anchorId="1E7F54BA" wp14:editId="0BC5ED31">
+          <wp:anchor distT="0" distB="0" distL="114300" distR="114300" simplePos="0" relativeHeight="251697152" behindDoc="1" locked="0" layoutInCell="1" allowOverlap="1" wp14:anchorId="1E7F54BA" wp14:editId="5F8E802C">
             <wp:simplePos x="0" y="0"/>
             <wp:positionH relativeFrom="page">
               <wp:posOffset>2709545</wp:posOffset>
@@ -19580,7 +20040,7 @@
                     <pic:cNvPicPr/>
                   </pic:nvPicPr>
                   <pic:blipFill>
-                    <a:blip r:embed="rId47" cstate="print">
+                    <a:blip r:embed="rId46" cstate="print">
                       <a:extLst>
                         <a:ext uri="{28A0092B-C50C-407E-A947-70E740481C1C}">
                           <a14:useLocalDpi xmlns:a14="http://schemas.microsoft.com/office/drawing/2010/main" val="0"/>
@@ -19612,7 +20072,7 @@
           </wp:anchor>
         </w:drawing>
       </w:r>
-      <w:bookmarkStart w:id="114" w:name="_Toc143166111"/>
+      <w:bookmarkStart w:id="113" w:name="_Toc143166111"/>
     </w:p>
     <w:p>
       <w:pPr>
@@ -19646,7 +20106,7 @@
                     <pic:cNvPicPr/>
                   </pic:nvPicPr>
                   <pic:blipFill>
-                    <a:blip r:embed="rId48" cstate="print">
+                    <a:blip r:embed="rId47" cstate="print">
                       <a:extLst>
                         <a:ext uri="{28A0092B-C50C-407E-A947-70E740481C1C}">
                           <a14:useLocalDpi xmlns:a14="http://schemas.microsoft.com/office/drawing/2010/main" val="0"/>
@@ -19708,7 +20168,7 @@
                     <pic:cNvPicPr/>
                   </pic:nvPicPr>
                   <pic:blipFill>
-                    <a:blip r:embed="rId49"/>
+                    <a:blip r:embed="rId48"/>
                     <a:stretch>
                       <a:fillRect/>
                     </a:stretch>
@@ -19749,7 +20209,7 @@
       <w:r>
         <w:t>: Test Case for</w:t>
       </w:r>
-      <w:bookmarkEnd w:id="114"/>
+      <w:bookmarkEnd w:id="113"/>
       <w:r>
         <w:t xml:space="preserve"> Solution and Solution Visualization</w:t>
       </w:r>
@@ -19779,7 +20239,7 @@
                     <pic:cNvPicPr/>
                   </pic:nvPicPr>
                   <pic:blipFill rotWithShape="1">
-                    <a:blip r:embed="rId50"/>
+                    <a:blip r:embed="rId49"/>
                     <a:srcRect l="12852"/>
                     <a:stretch/>
                   </pic:blipFill>
@@ -19812,7 +20272,7 @@
         <w:spacing w:line="360" w:lineRule="auto"/>
         <w:jc w:val="center"/>
       </w:pPr>
-      <w:bookmarkStart w:id="115" w:name="_Toc143166112"/>
+      <w:bookmarkStart w:id="114" w:name="_Toc143166112"/>
       <w:r>
         <w:rPr>
           <w:noProof/>
@@ -19834,7 +20294,7 @@
                     <pic:cNvPicPr/>
                   </pic:nvPicPr>
                   <pic:blipFill>
-                    <a:blip r:embed="rId51"/>
+                    <a:blip r:embed="rId50"/>
                     <a:stretch>
                       <a:fillRect/>
                     </a:stretch>
@@ -19873,7 +20333,7 @@
       <w:r>
         <w:t xml:space="preserve">: Test Case for </w:t>
       </w:r>
-      <w:bookmarkEnd w:id="115"/>
+      <w:bookmarkEnd w:id="114"/>
       <w:r>
         <w:t xml:space="preserve">Data Transfer </w:t>
       </w:r>
@@ -19886,7 +20346,7 @@
     </w:p>
     <w:p/>
     <w:sectPr>
-      <w:footerReference w:type="default" r:id="rId52"/>
+      <w:footerReference w:type="default" r:id="rId51"/>
       <w:pgSz w:w="11906" w:h="16838" w:code="9"/>
       <w:pgMar w:top="1440" w:right="1440" w:bottom="1440" w:left="1800" w:header="720" w:footer="720" w:gutter="0"/>
       <w:pgNumType w:start="1"/>
@@ -19898,7 +20358,7 @@
 </file>
 
 <file path=word/endnotes.xml><?xml version="1.0" encoding="utf-8"?>
-<w:endnotes xmlns:wpc="http://schemas.microsoft.com/office/word/2010/wordprocessingCanvas" xmlns:cx="http://schemas.microsoft.com/office/drawing/2014/chartex" xmlns:cx1="http://schemas.microsoft.com/office/drawing/2015/9/8/chartex" xmlns:cx2="http://schemas.microsoft.com/office/drawing/2015/10/21/chartex" xmlns:cx3="http://schemas.microsoft.com/office/drawing/2016/5/9/chartex" xmlns:cx4="http://schemas.microsoft.com/office/drawing/2016/5/10/chartex" xmlns:cx5="http://schemas.microsoft.com/office/drawing/2016/5/11/chartex" xmlns:cx6="http://schemas.microsoft.com/office/drawing/2016/5/12/chartex" xmlns:cx7="http://schemas.microsoft.com/office/drawing/2016/5/13/chartex" xmlns:cx8="http://schemas.microsoft.com/office/drawing/2016/5/14/chartex" xmlns:mc="http://schemas.openxmlformats.org/markup-compatibility/2006" xmlns:aink="http://schemas.microsoft.com/office/drawing/2016/ink" xmlns:am3d="http://schemas.microsoft.com/office/drawing/2017/model3d" xmlns:o="urn:schemas-microsoft-com:office:office" xmlns:oel="http://schemas.microsoft.com/office/2019/extlst" xmlns:r="http://schemas.openxmlformats.org/officeDocument/2006/relationships" xmlns:m="http://schemas.openxmlformats.org/officeDocument/2006/math" xmlns:v="urn:schemas-microsoft-com:vml" xmlns:wp14="http://schemas.microsoft.com/office/word/2010/wordprocessingDrawing" xmlns:wp="http://schemas.openxmlformats.org/drawingml/2006/wordprocessingDrawing" xmlns:w10="urn:schemas-microsoft-com:office:word" xmlns:w="http://schemas.openxmlformats.org/wordprocessingml/2006/main" xmlns:w14="http://schemas.microsoft.com/office/word/2010/wordml" xmlns:w15="http://schemas.microsoft.com/office/word/2012/wordml" xmlns:w16cex="http://schemas.microsoft.com/office/word/2018/wordml/cex" xmlns:w16cid="http://schemas.microsoft.com/office/word/2016/wordml/cid" xmlns:w16="http://schemas.microsoft.com/office/word/2018/wordml" xmlns:w16du="http://schemas.microsoft.com/office/word/2023/wordml/word16du" xmlns:w16sdtdh="http://schemas.microsoft.com/office/word/2020/wordml/sdtdatahash" xmlns:w16se="http://schemas.microsoft.com/office/word/2015/wordml/symex" xmlns:wpg="http://schemas.microsoft.com/office/word/2010/wordprocessingGroup" xmlns:wpi="http://schemas.microsoft.com/office/word/2010/wordprocessingInk" xmlns:wne="http://schemas.microsoft.com/office/word/2006/wordml" xmlns:wps="http://schemas.microsoft.com/office/word/2010/wordprocessingShape" mc:Ignorable="w14 w15 w16se w16cid w16 w16cex w16sdtdh w16du wp14">
+<w:endnotes xmlns:wpc="http://schemas.microsoft.com/office/word/2010/wordprocessingCanvas" xmlns:cx="http://schemas.microsoft.com/office/drawing/2014/chartex" xmlns:cx1="http://schemas.microsoft.com/office/drawing/2015/9/8/chartex" xmlns:cx2="http://schemas.microsoft.com/office/drawing/2015/10/21/chartex" xmlns:cx3="http://schemas.microsoft.com/office/drawing/2016/5/9/chartex" xmlns:cx4="http://schemas.microsoft.com/office/drawing/2016/5/10/chartex" xmlns:cx5="http://schemas.microsoft.com/office/drawing/2016/5/11/chartex" xmlns:cx6="http://schemas.microsoft.com/office/drawing/2016/5/12/chartex" xmlns:cx7="http://schemas.microsoft.com/office/drawing/2016/5/13/chartex" xmlns:cx8="http://schemas.microsoft.com/office/drawing/2016/5/14/chartex" xmlns:mc="http://schemas.openxmlformats.org/markup-compatibility/2006" xmlns:m="http://schemas.openxmlformats.org/officeDocument/2006/math" xmlns:aink="http://schemas.microsoft.com/office/drawing/2016/ink" xmlns:am3d="http://schemas.microsoft.com/office/drawing/2017/model3d" xmlns:oel="http://schemas.microsoft.com/office/2019/extlst" xmlns:r="http://schemas.openxmlformats.org/officeDocument/2006/relationships" xmlns:wp14="http://schemas.microsoft.com/office/word/2010/wordprocessingDrawing" xmlns:wp="http://schemas.openxmlformats.org/drawingml/2006/wordprocessingDrawing" xmlns:wpg="http://schemas.microsoft.com/office/word/2010/wordprocessingGroup" xmlns:wpi="http://schemas.microsoft.com/office/word/2010/wordprocessingInk" xmlns:wps="http://schemas.microsoft.com/office/word/2010/wordprocessingShape" xmlns:o="urn:schemas-microsoft-com:office:office" xmlns:v="urn:schemas-microsoft-com:vml" xmlns:w10="urn:schemas-microsoft-com:office:word" xmlns:w="http://schemas.openxmlformats.org/wordprocessingml/2006/main" xmlns:w14="http://schemas.microsoft.com/office/word/2010/wordml" xmlns:w15="http://schemas.microsoft.com/office/word/2012/wordml" xmlns:w16cei="http://schemas.microsoft.com/office/word/2026/wordml/cei" xmlns:w16cex="http://schemas.microsoft.com/office/word/2018/wordml/cex" xmlns:w16cid="http://schemas.microsoft.com/office/word/2016/wordml/cid" xmlns:w16="http://schemas.microsoft.com/office/word/2018/wordml" xmlns:w16sdtdh="http://schemas.microsoft.com/office/word/2020/wordml/sdtdatahash" xmlns:w16sdtfl="http://schemas.microsoft.com/office/word/2024/wordml/sdtformatlock" xmlns:w16se="http://schemas.microsoft.com/office/word/2015/wordml/symex" xmlns:w16du="http://schemas.microsoft.com/office/word/2023/wordml/word16du" xmlns:wne="http://schemas.microsoft.com/office/word/2006/wordml" mc:Ignorable="w14 w15 w16se w16cid w16 w16cex w16sdtdh w16sdtfl w16du wp14">
   <w:endnote w:type="separator" w:id="-1">
     <w:p>
       <w:pPr>
@@ -19923,17 +20383,7 @@
 </file>
 
 <file path=word/footer1.xml><?xml version="1.0" encoding="utf-8"?>
-<w:ftr xmlns:wpc="http://schemas.microsoft.com/office/word/2010/wordprocessingCanvas" xmlns:cx="http://schemas.microsoft.com/office/drawing/2014/chartex" xmlns:cx1="http://schemas.microsoft.com/office/drawing/2015/9/8/chartex" xmlns:cx2="http://schemas.microsoft.com/office/drawing/2015/10/21/chartex" xmlns:cx3="http://schemas.microsoft.com/office/drawing/2016/5/9/chartex" xmlns:cx4="http://schemas.microsoft.com/office/drawing/2016/5/10/chartex" xmlns:cx5="http://schemas.microsoft.com/office/drawing/2016/5/11/chartex" xmlns:cx6="http://schemas.microsoft.com/office/drawing/2016/5/12/chartex" xmlns:cx7="http://schemas.microsoft.com/office/drawing/2016/5/13/chartex" xmlns:cx8="http://schemas.microsoft.com/office/drawing/2016/5/14/chartex" xmlns:mc="http://schemas.openxmlformats.org/markup-compatibility/2006" xmlns:aink="http://schemas.microsoft.com/office/drawing/2016/ink" xmlns:am3d="http://schemas.microsoft.com/office/drawing/2017/model3d" xmlns:o="urn:schemas-microsoft-com:office:office" xmlns:oel="http://schemas.microsoft.com/office/2019/extlst" xmlns:r="http://schemas.openxmlformats.org/officeDocument/2006/relationships" xmlns:m="http://schemas.openxmlformats.org/officeDocument/2006/math" xmlns:v="urn:schemas-microsoft-com:vml" xmlns:wp14="http://schemas.microsoft.com/office/word/2010/wordprocessingDrawing" xmlns:wp="http://schemas.openxmlformats.org/drawingml/2006/wordprocessingDrawing" xmlns:w10="urn:schemas-microsoft-com:office:word" xmlns:w="http://schemas.openxmlformats.org/wordprocessingml/2006/main" xmlns:w14="http://schemas.microsoft.com/office/word/2010/wordml" xmlns:w15="http://schemas.microsoft.com/office/word/2012/wordml" xmlns:w16cex="http://schemas.microsoft.com/office/word/2018/wordml/cex" xmlns:w16cid="http://schemas.microsoft.com/office/word/2016/wordml/cid" xmlns:w16="http://schemas.microsoft.com/office/word/2018/wordml" xmlns:w16du="http://schemas.microsoft.com/office/word/2023/wordml/word16du" xmlns:w16sdtdh="http://schemas.microsoft.com/office/word/2020/wordml/sdtdatahash" xmlns:w16se="http://schemas.microsoft.com/office/word/2015/wordml/symex" xmlns:wpg="http://schemas.microsoft.com/office/word/2010/wordprocessingGroup" xmlns:wpi="http://schemas.microsoft.com/office/word/2010/wordprocessingInk" xmlns:wne="http://schemas.microsoft.com/office/word/2006/wordml" xmlns:wps="http://schemas.microsoft.com/office/word/2010/wordprocessingShape" mc:Ignorable="w14 w15 w16se w16cid w16 w16cex w16sdtdh w16du wp14">
-  <w:p>
-    <w:pPr>
-      <w:pStyle w:val="Footer"/>
-    </w:pPr>
-  </w:p>
-</w:ftr>
-</file>
-
-<file path=word/footer2.xml><?xml version="1.0" encoding="utf-8"?>
-<w:ftr xmlns:wpc="http://schemas.microsoft.com/office/word/2010/wordprocessingCanvas" xmlns:cx="http://schemas.microsoft.com/office/drawing/2014/chartex" xmlns:cx1="http://schemas.microsoft.com/office/drawing/2015/9/8/chartex" xmlns:cx2="http://schemas.microsoft.com/office/drawing/2015/10/21/chartex" xmlns:cx3="http://schemas.microsoft.com/office/drawing/2016/5/9/chartex" xmlns:cx4="http://schemas.microsoft.com/office/drawing/2016/5/10/chartex" xmlns:cx5="http://schemas.microsoft.com/office/drawing/2016/5/11/chartex" xmlns:cx6="http://schemas.microsoft.com/office/drawing/2016/5/12/chartex" xmlns:cx7="http://schemas.microsoft.com/office/drawing/2016/5/13/chartex" xmlns:cx8="http://schemas.microsoft.com/office/drawing/2016/5/14/chartex" xmlns:mc="http://schemas.openxmlformats.org/markup-compatibility/2006" xmlns:aink="http://schemas.microsoft.com/office/drawing/2016/ink" xmlns:am3d="http://schemas.microsoft.com/office/drawing/2017/model3d" xmlns:o="urn:schemas-microsoft-com:office:office" xmlns:oel="http://schemas.microsoft.com/office/2019/extlst" xmlns:r="http://schemas.openxmlformats.org/officeDocument/2006/relationships" xmlns:m="http://schemas.openxmlformats.org/officeDocument/2006/math" xmlns:v="urn:schemas-microsoft-com:vml" xmlns:wp14="http://schemas.microsoft.com/office/word/2010/wordprocessingDrawing" xmlns:wp="http://schemas.openxmlformats.org/drawingml/2006/wordprocessingDrawing" xmlns:w10="urn:schemas-microsoft-com:office:word" xmlns:w="http://schemas.openxmlformats.org/wordprocessingml/2006/main" xmlns:w14="http://schemas.microsoft.com/office/word/2010/wordml" xmlns:w15="http://schemas.microsoft.com/office/word/2012/wordml" xmlns:w16cex="http://schemas.microsoft.com/office/word/2018/wordml/cex" xmlns:w16cid="http://schemas.microsoft.com/office/word/2016/wordml/cid" xmlns:w16="http://schemas.microsoft.com/office/word/2018/wordml" xmlns:w16du="http://schemas.microsoft.com/office/word/2023/wordml/word16du" xmlns:w16sdtdh="http://schemas.microsoft.com/office/word/2020/wordml/sdtdatahash" xmlns:w16se="http://schemas.microsoft.com/office/word/2015/wordml/symex" xmlns:wpg="http://schemas.microsoft.com/office/word/2010/wordprocessingGroup" xmlns:wpi="http://schemas.microsoft.com/office/word/2010/wordprocessingInk" xmlns:wne="http://schemas.microsoft.com/office/word/2006/wordml" xmlns:wps="http://schemas.microsoft.com/office/word/2010/wordprocessingShape" mc:Ignorable="w14 w15 w16se w16cid w16 w16cex w16sdtdh w16du wp14">
+<w:ftr xmlns:wpc="http://schemas.microsoft.com/office/word/2010/wordprocessingCanvas" xmlns:cx="http://schemas.microsoft.com/office/drawing/2014/chartex" xmlns:cx1="http://schemas.microsoft.com/office/drawing/2015/9/8/chartex" xmlns:cx2="http://schemas.microsoft.com/office/drawing/2015/10/21/chartex" xmlns:cx3="http://schemas.microsoft.com/office/drawing/2016/5/9/chartex" xmlns:cx4="http://schemas.microsoft.com/office/drawing/2016/5/10/chartex" xmlns:cx5="http://schemas.microsoft.com/office/drawing/2016/5/11/chartex" xmlns:cx6="http://schemas.microsoft.com/office/drawing/2016/5/12/chartex" xmlns:cx7="http://schemas.microsoft.com/office/drawing/2016/5/13/chartex" xmlns:cx8="http://schemas.microsoft.com/office/drawing/2016/5/14/chartex" xmlns:mc="http://schemas.openxmlformats.org/markup-compatibility/2006" xmlns:m="http://schemas.openxmlformats.org/officeDocument/2006/math" xmlns:aink="http://schemas.microsoft.com/office/drawing/2016/ink" xmlns:am3d="http://schemas.microsoft.com/office/drawing/2017/model3d" xmlns:oel="http://schemas.microsoft.com/office/2019/extlst" xmlns:r="http://schemas.openxmlformats.org/officeDocument/2006/relationships" xmlns:wp14="http://schemas.microsoft.com/office/word/2010/wordprocessingDrawing" xmlns:wp="http://schemas.openxmlformats.org/drawingml/2006/wordprocessingDrawing" xmlns:wpg="http://schemas.microsoft.com/office/word/2010/wordprocessingGroup" xmlns:wpi="http://schemas.microsoft.com/office/word/2010/wordprocessingInk" xmlns:wps="http://schemas.microsoft.com/office/word/2010/wordprocessingShape" xmlns:o="urn:schemas-microsoft-com:office:office" xmlns:v="urn:schemas-microsoft-com:vml" xmlns:w10="urn:schemas-microsoft-com:office:word" xmlns:w="http://schemas.openxmlformats.org/wordprocessingml/2006/main" xmlns:w14="http://schemas.microsoft.com/office/word/2010/wordml" xmlns:w15="http://schemas.microsoft.com/office/word/2012/wordml" xmlns:w16cei="http://schemas.microsoft.com/office/word/2026/wordml/cei" xmlns:w16cex="http://schemas.microsoft.com/office/word/2018/wordml/cex" xmlns:w16cid="http://schemas.microsoft.com/office/word/2016/wordml/cid" xmlns:w16="http://schemas.microsoft.com/office/word/2018/wordml" xmlns:w16sdtdh="http://schemas.microsoft.com/office/word/2020/wordml/sdtdatahash" xmlns:w16sdtfl="http://schemas.microsoft.com/office/word/2024/wordml/sdtformatlock" xmlns:w16se="http://schemas.microsoft.com/office/word/2015/wordml/symex" xmlns:w16du="http://schemas.microsoft.com/office/word/2023/wordml/word16du" xmlns:wne="http://schemas.microsoft.com/office/word/2006/wordml" mc:Ignorable="w14 w15 w16se w16cid w16 w16cex w16sdtdh w16sdtfl w16du wp14">
   <w:sdt>
     <w:sdtPr>
       <w:id w:val="234210832"/>
@@ -19985,8 +20435,8 @@
 </w:ftr>
 </file>
 
-<file path=word/footer3.xml><?xml version="1.0" encoding="utf-8"?>
-<w:ftr xmlns:wpc="http://schemas.microsoft.com/office/word/2010/wordprocessingCanvas" xmlns:cx="http://schemas.microsoft.com/office/drawing/2014/chartex" xmlns:cx1="http://schemas.microsoft.com/office/drawing/2015/9/8/chartex" xmlns:cx2="http://schemas.microsoft.com/office/drawing/2015/10/21/chartex" xmlns:cx3="http://schemas.microsoft.com/office/drawing/2016/5/9/chartex" xmlns:cx4="http://schemas.microsoft.com/office/drawing/2016/5/10/chartex" xmlns:cx5="http://schemas.microsoft.com/office/drawing/2016/5/11/chartex" xmlns:cx6="http://schemas.microsoft.com/office/drawing/2016/5/12/chartex" xmlns:cx7="http://schemas.microsoft.com/office/drawing/2016/5/13/chartex" xmlns:cx8="http://schemas.microsoft.com/office/drawing/2016/5/14/chartex" xmlns:mc="http://schemas.openxmlformats.org/markup-compatibility/2006" xmlns:aink="http://schemas.microsoft.com/office/drawing/2016/ink" xmlns:am3d="http://schemas.microsoft.com/office/drawing/2017/model3d" xmlns:o="urn:schemas-microsoft-com:office:office" xmlns:oel="http://schemas.microsoft.com/office/2019/extlst" xmlns:r="http://schemas.openxmlformats.org/officeDocument/2006/relationships" xmlns:m="http://schemas.openxmlformats.org/officeDocument/2006/math" xmlns:v="urn:schemas-microsoft-com:vml" xmlns:wp14="http://schemas.microsoft.com/office/word/2010/wordprocessingDrawing" xmlns:wp="http://schemas.openxmlformats.org/drawingml/2006/wordprocessingDrawing" xmlns:w10="urn:schemas-microsoft-com:office:word" xmlns:w="http://schemas.openxmlformats.org/wordprocessingml/2006/main" xmlns:w14="http://schemas.microsoft.com/office/word/2010/wordml" xmlns:w15="http://schemas.microsoft.com/office/word/2012/wordml" xmlns:w16cex="http://schemas.microsoft.com/office/word/2018/wordml/cex" xmlns:w16cid="http://schemas.microsoft.com/office/word/2016/wordml/cid" xmlns:w16="http://schemas.microsoft.com/office/word/2018/wordml" xmlns:w16du="http://schemas.microsoft.com/office/word/2023/wordml/word16du" xmlns:w16sdtdh="http://schemas.microsoft.com/office/word/2020/wordml/sdtdatahash" xmlns:w16se="http://schemas.microsoft.com/office/word/2015/wordml/symex" xmlns:wpg="http://schemas.microsoft.com/office/word/2010/wordprocessingGroup" xmlns:wpi="http://schemas.microsoft.com/office/word/2010/wordprocessingInk" xmlns:wne="http://schemas.microsoft.com/office/word/2006/wordml" xmlns:wps="http://schemas.microsoft.com/office/word/2010/wordprocessingShape" mc:Ignorable="w14 w15 w16se w16cid w16 w16cex w16sdtdh w16du wp14">
+<file path=word/footer2.xml><?xml version="1.0" encoding="utf-8"?>
+<w:ftr xmlns:wpc="http://schemas.microsoft.com/office/word/2010/wordprocessingCanvas" xmlns:cx="http://schemas.microsoft.com/office/drawing/2014/chartex" xmlns:cx1="http://schemas.microsoft.com/office/drawing/2015/9/8/chartex" xmlns:cx2="http://schemas.microsoft.com/office/drawing/2015/10/21/chartex" xmlns:cx3="http://schemas.microsoft.com/office/drawing/2016/5/9/chartex" xmlns:cx4="http://schemas.microsoft.com/office/drawing/2016/5/10/chartex" xmlns:cx5="http://schemas.microsoft.com/office/drawing/2016/5/11/chartex" xmlns:cx6="http://schemas.microsoft.com/office/drawing/2016/5/12/chartex" xmlns:cx7="http://schemas.microsoft.com/office/drawing/2016/5/13/chartex" xmlns:cx8="http://schemas.microsoft.com/office/drawing/2016/5/14/chartex" xmlns:mc="http://schemas.openxmlformats.org/markup-compatibility/2006" xmlns:m="http://schemas.openxmlformats.org/officeDocument/2006/math" xmlns:aink="http://schemas.microsoft.com/office/drawing/2016/ink" xmlns:am3d="http://schemas.microsoft.com/office/drawing/2017/model3d" xmlns:oel="http://schemas.microsoft.com/office/2019/extlst" xmlns:r="http://schemas.openxmlformats.org/officeDocument/2006/relationships" xmlns:wp14="http://schemas.microsoft.com/office/word/2010/wordprocessingDrawing" xmlns:wp="http://schemas.openxmlformats.org/drawingml/2006/wordprocessingDrawing" xmlns:wpg="http://schemas.microsoft.com/office/word/2010/wordprocessingGroup" xmlns:wpi="http://schemas.microsoft.com/office/word/2010/wordprocessingInk" xmlns:wps="http://schemas.microsoft.com/office/word/2010/wordprocessingShape" xmlns:o="urn:schemas-microsoft-com:office:office" xmlns:v="urn:schemas-microsoft-com:vml" xmlns:w10="urn:schemas-microsoft-com:office:word" xmlns:w="http://schemas.openxmlformats.org/wordprocessingml/2006/main" xmlns:w14="http://schemas.microsoft.com/office/word/2010/wordml" xmlns:w15="http://schemas.microsoft.com/office/word/2012/wordml" xmlns:w16cei="http://schemas.microsoft.com/office/word/2026/wordml/cei" xmlns:w16cex="http://schemas.microsoft.com/office/word/2018/wordml/cex" xmlns:w16cid="http://schemas.microsoft.com/office/word/2016/wordml/cid" xmlns:w16="http://schemas.microsoft.com/office/word/2018/wordml" xmlns:w16sdtdh="http://schemas.microsoft.com/office/word/2020/wordml/sdtdatahash" xmlns:w16sdtfl="http://schemas.microsoft.com/office/word/2024/wordml/sdtformatlock" xmlns:w16se="http://schemas.microsoft.com/office/word/2015/wordml/symex" xmlns:w16du="http://schemas.microsoft.com/office/word/2023/wordml/word16du" xmlns:wne="http://schemas.microsoft.com/office/word/2006/wordml" mc:Ignorable="w14 w15 w16se w16cid w16 w16cex w16sdtdh w16sdtfl w16du wp14">
   <w:sdt>
     <w:sdtPr>
       <w:id w:val="-1553467919"/>
@@ -20039,7 +20489,7 @@
 </file>
 
 <file path=word/footnotes.xml><?xml version="1.0" encoding="utf-8"?>
-<w:footnotes xmlns:wpc="http://schemas.microsoft.com/office/word/2010/wordprocessingCanvas" xmlns:cx="http://schemas.microsoft.com/office/drawing/2014/chartex" xmlns:cx1="http://schemas.microsoft.com/office/drawing/2015/9/8/chartex" xmlns:cx2="http://schemas.microsoft.com/office/drawing/2015/10/21/chartex" xmlns:cx3="http://schemas.microsoft.com/office/drawing/2016/5/9/chartex" xmlns:cx4="http://schemas.microsoft.com/office/drawing/2016/5/10/chartex" xmlns:cx5="http://schemas.microsoft.com/office/drawing/2016/5/11/chartex" xmlns:cx6="http://schemas.microsoft.com/office/drawing/2016/5/12/chartex" xmlns:cx7="http://schemas.microsoft.com/office/drawing/2016/5/13/chartex" xmlns:cx8="http://schemas.microsoft.com/office/drawing/2016/5/14/chartex" xmlns:mc="http://schemas.openxmlformats.org/markup-compatibility/2006" xmlns:aink="http://schemas.microsoft.com/office/drawing/2016/ink" xmlns:am3d="http://schemas.microsoft.com/office/drawing/2017/model3d" xmlns:o="urn:schemas-microsoft-com:office:office" xmlns:oel="http://schemas.microsoft.com/office/2019/extlst" xmlns:r="http://schemas.openxmlformats.org/officeDocument/2006/relationships" xmlns:m="http://schemas.openxmlformats.org/officeDocument/2006/math" xmlns:v="urn:schemas-microsoft-com:vml" xmlns:wp14="http://schemas.microsoft.com/office/word/2010/wordprocessingDrawing" xmlns:wp="http://schemas.openxmlformats.org/drawingml/2006/wordprocessingDrawing" xmlns:w10="urn:schemas-microsoft-com:office:word" xmlns:w="http://schemas.openxmlformats.org/wordprocessingml/2006/main" xmlns:w14="http://schemas.microsoft.com/office/word/2010/wordml" xmlns:w15="http://schemas.microsoft.com/office/word/2012/wordml" xmlns:w16cex="http://schemas.microsoft.com/office/word/2018/wordml/cex" xmlns:w16cid="http://schemas.microsoft.com/office/word/2016/wordml/cid" xmlns:w16="http://schemas.microsoft.com/office/word/2018/wordml" xmlns:w16du="http://schemas.microsoft.com/office/word/2023/wordml/word16du" xmlns:w16sdtdh="http://schemas.microsoft.com/office/word/2020/wordml/sdtdatahash" xmlns:w16se="http://schemas.microsoft.com/office/word/2015/wordml/symex" xmlns:wpg="http://schemas.microsoft.com/office/word/2010/wordprocessingGroup" xmlns:wpi="http://schemas.microsoft.com/office/word/2010/wordprocessingInk" xmlns:wne="http://schemas.microsoft.com/office/word/2006/wordml" xmlns:wps="http://schemas.microsoft.com/office/word/2010/wordprocessingShape" mc:Ignorable="w14 w15 w16se w16cid w16 w16cex w16sdtdh w16du wp14">
+<w:footnotes xmlns:wpc="http://schemas.microsoft.com/office/word/2010/wordprocessingCanvas" xmlns:cx="http://schemas.microsoft.com/office/drawing/2014/chartex" xmlns:cx1="http://schemas.microsoft.com/office/drawing/2015/9/8/chartex" xmlns:cx2="http://schemas.microsoft.com/office/drawing/2015/10/21/chartex" xmlns:cx3="http://schemas.microsoft.com/office/drawing/2016/5/9/chartex" xmlns:cx4="http://schemas.microsoft.com/office/drawing/2016/5/10/chartex" xmlns:cx5="http://schemas.microsoft.com/office/drawing/2016/5/11/chartex" xmlns:cx6="http://schemas.microsoft.com/office/drawing/2016/5/12/chartex" xmlns:cx7="http://schemas.microsoft.com/office/drawing/2016/5/13/chartex" xmlns:cx8="http://schemas.microsoft.com/office/drawing/2016/5/14/chartex" xmlns:mc="http://schemas.openxmlformats.org/markup-compatibility/2006" xmlns:m="http://schemas.openxmlformats.org/officeDocument/2006/math" xmlns:aink="http://schemas.microsoft.com/office/drawing/2016/ink" xmlns:am3d="http://schemas.microsoft.com/office/drawing/2017/model3d" xmlns:oel="http://schemas.microsoft.com/office/2019/extlst" xmlns:r="http://schemas.openxmlformats.org/officeDocument/2006/relationships" xmlns:wp14="http://schemas.microsoft.com/office/word/2010/wordprocessingDrawing" xmlns:wp="http://schemas.openxmlformats.org/drawingml/2006/wordprocessingDrawing" xmlns:wpg="http://schemas.microsoft.com/office/word/2010/wordprocessingGroup" xmlns:wpi="http://schemas.microsoft.com/office/word/2010/wordprocessingInk" xmlns:wps="http://schemas.microsoft.com/office/word/2010/wordprocessingShape" xmlns:o="urn:schemas-microsoft-com:office:office" xmlns:v="urn:schemas-microsoft-com:vml" xmlns:w10="urn:schemas-microsoft-com:office:word" xmlns:w="http://schemas.openxmlformats.org/wordprocessingml/2006/main" xmlns:w14="http://schemas.microsoft.com/office/word/2010/wordml" xmlns:w15="http://schemas.microsoft.com/office/word/2012/wordml" xmlns:w16cei="http://schemas.microsoft.com/office/word/2026/wordml/cei" xmlns:w16cex="http://schemas.microsoft.com/office/word/2018/wordml/cex" xmlns:w16cid="http://schemas.microsoft.com/office/word/2016/wordml/cid" xmlns:w16="http://schemas.microsoft.com/office/word/2018/wordml" xmlns:w16sdtdh="http://schemas.microsoft.com/office/word/2020/wordml/sdtdatahash" xmlns:w16sdtfl="http://schemas.microsoft.com/office/word/2024/wordml/sdtformatlock" xmlns:w16se="http://schemas.microsoft.com/office/word/2015/wordml/symex" xmlns:w16du="http://schemas.microsoft.com/office/word/2023/wordml/word16du" xmlns:wne="http://schemas.microsoft.com/office/word/2006/wordml" mc:Ignorable="w14 w15 w16se w16cid w16 w16cex w16sdtdh w16sdtfl w16du wp14">
   <w:footnote w:type="separator" w:id="-1">
     <w:p>
       <w:pPr>
@@ -20064,7 +20514,7 @@
 </file>
 
 <file path=word/numbering.xml><?xml version="1.0" encoding="utf-8"?>
-<w:numbering xmlns:wpc="http://schemas.microsoft.com/office/word/2010/wordprocessingCanvas" xmlns:cx="http://schemas.microsoft.com/office/drawing/2014/chartex" xmlns:cx1="http://schemas.microsoft.com/office/drawing/2015/9/8/chartex" xmlns:cx2="http://schemas.microsoft.com/office/drawing/2015/10/21/chartex" xmlns:cx3="http://schemas.microsoft.com/office/drawing/2016/5/9/chartex" xmlns:cx4="http://schemas.microsoft.com/office/drawing/2016/5/10/chartex" xmlns:cx5="http://schemas.microsoft.com/office/drawing/2016/5/11/chartex" xmlns:cx6="http://schemas.microsoft.com/office/drawing/2016/5/12/chartex" xmlns:cx7="http://schemas.microsoft.com/office/drawing/2016/5/13/chartex" xmlns:cx8="http://schemas.microsoft.com/office/drawing/2016/5/14/chartex" xmlns:mc="http://schemas.openxmlformats.org/markup-compatibility/2006" xmlns:aink="http://schemas.microsoft.com/office/drawing/2016/ink" xmlns:am3d="http://schemas.microsoft.com/office/drawing/2017/model3d" xmlns:o="urn:schemas-microsoft-com:office:office" xmlns:oel="http://schemas.microsoft.com/office/2019/extlst" xmlns:r="http://schemas.openxmlformats.org/officeDocument/2006/relationships" xmlns:m="http://schemas.openxmlformats.org/officeDocument/2006/math" xmlns:v="urn:schemas-microsoft-com:vml" xmlns:wp14="http://schemas.microsoft.com/office/word/2010/wordprocessingDrawing" xmlns:wp="http://schemas.openxmlformats.org/drawingml/2006/wordprocessingDrawing" xmlns:w10="urn:schemas-microsoft-com:office:word" xmlns:w="http://schemas.openxmlformats.org/wordprocessingml/2006/main" xmlns:w14="http://schemas.microsoft.com/office/word/2010/wordml" xmlns:w15="http://schemas.microsoft.com/office/word/2012/wordml" xmlns:w16cex="http://schemas.microsoft.com/office/word/2018/wordml/cex" xmlns:w16cid="http://schemas.microsoft.com/office/word/2016/wordml/cid" xmlns:w16="http://schemas.microsoft.com/office/word/2018/wordml" xmlns:w16du="http://schemas.microsoft.com/office/word/2023/wordml/word16du" xmlns:w16sdtdh="http://schemas.microsoft.com/office/word/2020/wordml/sdtdatahash" xmlns:w16se="http://schemas.microsoft.com/office/word/2015/wordml/symex" xmlns:wpg="http://schemas.microsoft.com/office/word/2010/wordprocessingGroup" xmlns:wpi="http://schemas.microsoft.com/office/word/2010/wordprocessingInk" xmlns:wne="http://schemas.microsoft.com/office/word/2006/wordml" xmlns:wps="http://schemas.microsoft.com/office/word/2010/wordprocessingShape" mc:Ignorable="w14 w15 w16se w16cid w16 w16cex w16sdtdh w16du wp14">
+<w:numbering xmlns:wpc="http://schemas.microsoft.com/office/word/2010/wordprocessingCanvas" xmlns:cx="http://schemas.microsoft.com/office/drawing/2014/chartex" xmlns:cx1="http://schemas.microsoft.com/office/drawing/2015/9/8/chartex" xmlns:cx2="http://schemas.microsoft.com/office/drawing/2015/10/21/chartex" xmlns:cx3="http://schemas.microsoft.com/office/drawing/2016/5/9/chartex" xmlns:cx4="http://schemas.microsoft.com/office/drawing/2016/5/10/chartex" xmlns:cx5="http://schemas.microsoft.com/office/drawing/2016/5/11/chartex" xmlns:cx6="http://schemas.microsoft.com/office/drawing/2016/5/12/chartex" xmlns:cx7="http://schemas.microsoft.com/office/drawing/2016/5/13/chartex" xmlns:cx8="http://schemas.microsoft.com/office/drawing/2016/5/14/chartex" xmlns:mc="http://schemas.openxmlformats.org/markup-compatibility/2006" xmlns:m="http://schemas.openxmlformats.org/officeDocument/2006/math" xmlns:aink="http://schemas.microsoft.com/office/drawing/2016/ink" xmlns:am3d="http://schemas.microsoft.com/office/drawing/2017/model3d" xmlns:oel="http://schemas.microsoft.com/office/2019/extlst" xmlns:r="http://schemas.openxmlformats.org/officeDocument/2006/relationships" xmlns:wp14="http://schemas.microsoft.com/office/word/2010/wordprocessingDrawing" xmlns:wp="http://schemas.openxmlformats.org/drawingml/2006/wordprocessingDrawing" xmlns:wpg="http://schemas.microsoft.com/office/word/2010/wordprocessingGroup" xmlns:wpi="http://schemas.microsoft.com/office/word/2010/wordprocessingInk" xmlns:wps="http://schemas.microsoft.com/office/word/2010/wordprocessingShape" xmlns:o="urn:schemas-microsoft-com:office:office" xmlns:v="urn:schemas-microsoft-com:vml" xmlns:w10="urn:schemas-microsoft-com:office:word" xmlns:w="http://schemas.openxmlformats.org/wordprocessingml/2006/main" xmlns:w14="http://schemas.microsoft.com/office/word/2010/wordml" xmlns:w15="http://schemas.microsoft.com/office/word/2012/wordml" xmlns:w16cei="http://schemas.microsoft.com/office/word/2026/wordml/cei" xmlns:w16cex="http://schemas.microsoft.com/office/word/2018/wordml/cex" xmlns:w16cid="http://schemas.microsoft.com/office/word/2016/wordml/cid" xmlns:w16="http://schemas.microsoft.com/office/word/2018/wordml" xmlns:w16sdtdh="http://schemas.microsoft.com/office/word/2020/wordml/sdtdatahash" xmlns:w16sdtfl="http://schemas.microsoft.com/office/word/2024/wordml/sdtformatlock" xmlns:w16se="http://schemas.microsoft.com/office/word/2015/wordml/symex" xmlns:w16du="http://schemas.microsoft.com/office/word/2023/wordml/word16du" xmlns:wne="http://schemas.microsoft.com/office/word/2006/wordml" mc:Ignorable="w14 w15 w16se w16cid w16 w16cex w16sdtdh w16sdtfl w16du wp14">
   <w:abstractNum w:abstractNumId="0" w15:restartNumberingAfterBreak="0">
     <w:nsid w:val="0D56420F"/>
     <w:multiLevelType w:val="multilevel"/>
@@ -23027,7 +23477,7 @@
 </file>
 
 <file path=word/styles.xml><?xml version="1.0" encoding="utf-8"?>
-<w:styles xmlns:mc="http://schemas.openxmlformats.org/markup-compatibility/2006" xmlns:r="http://schemas.openxmlformats.org/officeDocument/2006/relationships" xmlns:w="http://schemas.openxmlformats.org/wordprocessingml/2006/main" xmlns:w14="http://schemas.microsoft.com/office/word/2010/wordml" xmlns:w15="http://schemas.microsoft.com/office/word/2012/wordml" xmlns:w16cex="http://schemas.microsoft.com/office/word/2018/wordml/cex" xmlns:w16cid="http://schemas.microsoft.com/office/word/2016/wordml/cid" xmlns:w16="http://schemas.microsoft.com/office/word/2018/wordml" xmlns:w16du="http://schemas.microsoft.com/office/word/2023/wordml/word16du" xmlns:w16sdtdh="http://schemas.microsoft.com/office/word/2020/wordml/sdtdatahash" xmlns:w16se="http://schemas.microsoft.com/office/word/2015/wordml/symex" mc:Ignorable="w14 w15 w16se w16cid w16 w16cex w16sdtdh w16du">
+<w:styles xmlns:mc="http://schemas.openxmlformats.org/markup-compatibility/2006" xmlns:r="http://schemas.openxmlformats.org/officeDocument/2006/relationships" xmlns:w="http://schemas.openxmlformats.org/wordprocessingml/2006/main" xmlns:w14="http://schemas.microsoft.com/office/word/2010/wordml" xmlns:w15="http://schemas.microsoft.com/office/word/2012/wordml" xmlns:w16cex="http://schemas.microsoft.com/office/word/2018/wordml/cex" xmlns:w16cid="http://schemas.microsoft.com/office/word/2016/wordml/cid" xmlns:w16="http://schemas.microsoft.com/office/word/2018/wordml" xmlns:w16sdtdh="http://schemas.microsoft.com/office/word/2020/wordml/sdtdatahash" xmlns:w16sdtfl="http://schemas.microsoft.com/office/word/2024/wordml/sdtformatlock" xmlns:w16se="http://schemas.microsoft.com/office/word/2015/wordml/symex" xmlns:w16du="http://schemas.microsoft.com/office/word/2023/wordml/word16du" mc:Ignorable="w14 w15 w16se w16cid w16 w16cex w16sdtdh w16sdtfl w16du">
   <w:docDefaults>
     <w:rPrDefault>
       <w:rPr>
@@ -23811,7 +24261,6 @@
     <w:name w:val="Normal (Web)"/>
     <w:basedOn w:val="Normal"/>
     <w:uiPriority w:val="99"/>
-    <w:semiHidden/>
     <w:unhideWhenUsed/>
     <w:rsid w:val="00A305A5"/>
     <w:pPr>
@@ -23887,6 +24336,42 @@
     <w:rPr>
       <w:b/>
       <w:bCs/>
+    </w:rPr>
+  </w:style>
+  <w:style w:type="character" w:styleId="HTMLCode">
+    <w:name w:val="HTML Code"/>
+    <w:basedOn w:val="DefaultParagraphFont"/>
+    <w:uiPriority w:val="99"/>
+    <w:semiHidden/>
+    <w:unhideWhenUsed/>
+    <w:rsid w:val="00037201"/>
+    <w:rPr>
+      <w:rFonts w:ascii="Courier New" w:eastAsia="Times New Roman" w:hAnsi="Courier New" w:cs="Courier New"/>
+      <w:sz w:val="20"/>
+      <w:szCs w:val="20"/>
+    </w:rPr>
+  </w:style>
+  <w:style w:type="paragraph" w:customStyle="1" w:styleId="pdq2pgselectionanchorcontainer">
+    <w:name w:val="pdq2pg_selectionanchorcontainer"/>
+    <w:basedOn w:val="Normal"/>
+    <w:rsid w:val="00501F93"/>
+    <w:pPr>
+      <w:spacing w:before="100" w:beforeAutospacing="1" w:after="100" w:afterAutospacing="1" w:line="240" w:lineRule="auto"/>
+    </w:pPr>
+    <w:rPr>
+      <w:rFonts w:eastAsia="Times New Roman"/>
+      <w:lang w:val="en-NP"/>
+    </w:rPr>
+  </w:style>
+  <w:style w:type="character" w:styleId="Emphasis">
+    <w:name w:val="Emphasis"/>
+    <w:basedOn w:val="DefaultParagraphFont"/>
+    <w:uiPriority w:val="20"/>
+    <w:qFormat/>
+    <w:rsid w:val="00592EE5"/>
+    <w:rPr>
+      <w:i/>
+      <w:iCs/>
     </w:rPr>
   </w:style>
 </w:styles>
@@ -24188,20 +24673,39 @@
 </file>
 
 <file path=customXml/item1.xml><?xml version="1.0" encoding="utf-8"?>
-<b:Sources xmlns:b="http://schemas.openxmlformats.org/officeDocument/2006/bibliography" xmlns="http://schemas.openxmlformats.org/officeDocument/2006/bibliography" SelectedStyle="\IEEE2006OfficeOnline.xsl" StyleName="IEEE" Version="2006">
+<b:Sources xmlns:b="http://schemas.openxmlformats.org/officeDocument/2006/bibliography" xmlns="http://schemas.openxmlformats.org/officeDocument/2006/bibliography" SelectedStyle="/IEEE2006OfficeOnline.xsl" StyleName="IEEE" Version="2006">
   <b:Source>
     <b:Tag>Che23</b:Tag>
-    <b:SourceType>InternetSite</b:SourceType>
-    <b:Guid>{2FA6540D-21DF-4D5E-A982-D52E0602F5C4}</b:Guid>
+    <b:SourceType>JournalArticle</b:SourceType>
+    <b:Guid>{815625A0-C684-9E41-B8C2-24ECE53D2B01}</b:Guid>
     <b:Title>Solver of 8-Puzzle with Genetic Algorithm</b:Title>
     <b:Year>2023</b:Year>
     <b:Author>
       <b:Author>
         <b:NameList>
           <b:Person>
-            <b:Last>Cheng Min Yang</b:Last>
+            <b:Last>Yang</b:Last>
+            <b:Middle>Min</b:Middle>
+            <b:First>Cheng</b:First>
+          </b:Person>
+          <b:Person>
+            <b:Last>Pek</b:Last>
             <b:First>Vincent</b:First>
-            <b:Middle>Pek, Sim Hui Ling, Tan Choon wei, Zailan Arabee Abdul Salam</b:Middle>
+          </b:Person>
+          <b:Person>
+            <b:Last>Ling</b:Last>
+            <b:Middle>Hui</b:Middle>
+            <b:First>Sim</b:First>
+          </b:Person>
+          <b:Person>
+            <b:Last>Wei</b:Last>
+            <b:Middle>Choon</b:Middle>
+            <b:First>Tan</b:First>
+          </b:Person>
+          <b:Person>
+            <b:Last>Salam</b:Last>
+            <b:Middle>Arabee Abdul</b:Middle>
+            <b:First>Zailan</b:First>
           </b:Person>
         </b:NameList>
       </b:Author>
@@ -24211,12 +24715,18 @@
     <b:MonthAccessed>August</b:MonthAccessed>
     <b:DayAccessed>1</b:DayAccessed>
     <b:URL>https://jati.sites.apiit.edu.my/files/2022/12/Volume7_Issue1_Paper6_2023.pdf</b:URL>
+    <b:Month>March</b:Month>
+    <b:Day>1</b:Day>
+    <b:JournalName>Journal of Applied Technology and Innovation</b:JournalName>
+    <b:Volume>7</b:Volume>
+    <b:Issue>1</b:Issue>
+    <b:Pages>28-32</b:Pages>
     <b:RefOrder>1</b:RefOrder>
   </b:Source>
   <b:Source>
     <b:Tag>Rei24</b:Tag>
-    <b:SourceType>InternetSite</b:SourceType>
-    <b:Guid>{D164B1B0-12AF-41BC-A79B-BB2FB1DD0673}</b:Guid>
+    <b:SourceType>ConferenceProceedings</b:SourceType>
+    <b:Guid>{E29D0FF1-343B-794D-8A91-32BB9E021A35}</b:Guid>
     <b:Author>
       <b:Author>
         <b:NameList>
@@ -24226,25 +24736,54 @@
           </b:Person>
         </b:NameList>
       </b:Author>
+      <b:Editor>
+        <b:NameList>
+          <b:Person>
+            <b:Last>Bajcsy</b:Last>
+            <b:First>Ruzena</b:First>
+          </b:Person>
+        </b:NameList>
+      </b:Editor>
     </b:Author>
     <b:ProductionCompany>Paderborn Center for Parallel Computing</b:ProductionCompany>
     <b:YearAccessed>2024</b:YearAccessed>
     <b:MonthAccessed>August</b:MonthAccessed>
     <b:DayAccessed>1</b:DayAccessed>
     <b:URL>https://citeseerx.ist.psu.edu/document?repid=rep1&amp;type=pdf&amp;doi=f74460d8130a5e580e16f671d4fcf227d26790ab</b:URL>
+    <b:Title>Complete Solution of the Eight-Puzzle and the Benefit of Node Ordering in IDA*</b:Title>
+    <b:Year>1993</b:Year>
+    <b:Pages>248-253</b:Pages>
+    <b:Publisher>Morgan Kaufmann</b:Publisher>
+    <b:City>Chambéry, France</b:City>
+    <b:ConferenceName>Thirteenth International Joint Conference on Artificial Intelligence</b:ConferenceName>
     <b:RefOrder>2</b:RefOrder>
   </b:Source>
   <b:Source>
     <b:Tag>Vin24</b:Tag>
-    <b:SourceType>InternetSite</b:SourceType>
-    <b:Guid>{8B445608-3AF5-439F-98EF-93AC2E4CD7F5}</b:Guid>
+    <b:SourceType>JournalArticle</b:SourceType>
+    <b:Guid>{676A6EF6-A146-C84B-9C02-49FD383B929F}</b:Guid>
     <b:Author>
       <b:Author>
         <b:NameList>
           <b:Person>
-            <b:Last>Vinay Menon</b:Last>
-            <b:First>Geraldine</b:First>
-            <b:Middle>Bessie Amali.D,Gopichand G,Santhi H,Gayatri P</b:Middle>
+            <b:Last>Menon</b:Last>
+            <b:First>Vinay</b:First>
+          </b:Person>
+          <b:Person>
+            <b:Last>Amali.D</b:Last>
+            <b:First>Geraldine Bessie</b:First>
+          </b:Person>
+          <b:Person>
+            <b:Last>Gopichand</b:Last>
+            <b:First>G</b:First>
+          </b:Person>
+          <b:Person>
+            <b:Last>Santhi</b:Last>
+            <b:First>H</b:First>
+          </b:Person>
+          <b:Person>
+            <b:Last>Gayatri</b:Last>
+            <b:First>P</b:First>
           </b:Person>
         </b:NameList>
       </b:Author>
@@ -24254,13 +24793,19 @@
     <b:MonthAccessed>August</b:MonthAccessed>
     <b:DayAccessed>1</b:DayAccessed>
     <b:URL>https://wwjmrd.com/upload/performance-analysis-of-various-uninformed-and-informed-search-strategies-on-8-puzzle-problems---a-case-study_1546243350.pdf</b:URL>
+    <b:Year>2018</b:Year>
+    <b:JournalName>World Wide Journal of Multidisciplinary Research and Development</b:JournalName>
+    <b:Volume>4</b:Volume>
+    <b:Issue>12</b:Issue>
+    <b:Pages>96-99</b:Pages>
+    <b:Title>Performance Analysis of Various Uninformed and Informed Search Strategies on 8 Puzzle Problems - A Case Study</b:Title>
     <b:RefOrder>3</b:RefOrder>
   </b:Source>
 </b:Sources>
 </file>
 
 <file path=customXml/itemProps1.xml><?xml version="1.0" encoding="utf-8"?>
-<ds:datastoreItem xmlns:ds="http://schemas.openxmlformats.org/officeDocument/2006/customXml" ds:itemID="{7A6229F5-85DE-4265-BBC9-B5491CCC3BD1}">
+<ds:datastoreItem xmlns:ds="http://schemas.openxmlformats.org/officeDocument/2006/customXml" ds:itemID="{A5460F84-6FC5-F341-9F15-90AAEC60F639}">
   <ds:schemaRefs>
     <ds:schemaRef ds:uri="http://schemas.openxmlformats.org/officeDocument/2006/bibliography"/>
   </ds:schemaRefs>

</xml_diff>

<commit_message>
docs: update 8-puzzle documentation
</commit_message>
<xml_diff>
--- a/8-PuzzleGameandSolver/Documentation/8-Puzzle Project.docx
+++ b/8-PuzzleGameandSolver/Documentation/8-Puzzle Project.docx
@@ -7,26 +7,14 @@
         <w:widowControl w:val="0"/>
         <w:autoSpaceDE w:val="0"/>
         <w:autoSpaceDN w:val="0"/>
-        <w:spacing w:after="0" w:line="240" w:lineRule="auto"/>
+        <w:spacing w:before="9" w:after="0" w:line="240" w:lineRule="auto"/>
         <w:rPr>
           <w:rFonts w:eastAsia="Times New Roman"/>
-          <w:sz w:val="20"/>
+          <w:sz w:val="19"/>
         </w:rPr>
       </w:pPr>
       <w:bookmarkStart w:id="0" w:name="_Hlk178930283"/>
       <w:bookmarkStart w:id="1" w:name="_Toc138931405"/>
-    </w:p>
-    <w:p>
-      <w:pPr>
-        <w:widowControl w:val="0"/>
-        <w:autoSpaceDE w:val="0"/>
-        <w:autoSpaceDN w:val="0"/>
-        <w:spacing w:before="9" w:after="0" w:line="240" w:lineRule="auto"/>
-        <w:rPr>
-          <w:rFonts w:eastAsia="Times New Roman"/>
-          <w:sz w:val="19"/>
-        </w:rPr>
-      </w:pPr>
       <w:r>
         <w:rPr>
           <w:rFonts w:eastAsia="Times New Roman"/>
@@ -2472,11 +2460,11 @@
         <w:jc w:val="left"/>
       </w:pPr>
       <w:bookmarkStart w:id="2" w:name="_Toc143245086"/>
-      <w:bookmarkStart w:id="3" w:name="_Toc178930660"/>
       <w:r>
         <w:lastRenderedPageBreak/>
         <w:tab/>
       </w:r>
+      <w:bookmarkStart w:id="3" w:name="_Toc238668792"/>
       <w:r>
         <w:t>ACKNOWLEDGEMENT</w:t>
       </w:r>
@@ -2657,7 +2645,7 @@
         <w:pStyle w:val="Heading1"/>
         <w:spacing w:before="0" w:after="200"/>
       </w:pPr>
-      <w:bookmarkStart w:id="4" w:name="_Toc178930661"/>
+      <w:bookmarkStart w:id="4" w:name="_Toc238668793"/>
       <w:r>
         <w:lastRenderedPageBreak/>
         <w:t>ABSTRACT</w:t>
@@ -2719,7 +2707,7 @@
         <w:pStyle w:val="Heading1"/>
         <w:spacing w:before="0" w:after="200"/>
       </w:pPr>
-      <w:bookmarkStart w:id="5" w:name="_Toc178930662"/>
+      <w:bookmarkStart w:id="5" w:name="_Toc238668794"/>
       <w:r>
         <w:lastRenderedPageBreak/>
         <w:t>TABLE OF CONTENTS</w:t>
@@ -2751,8 +2739,7 @@
               <w:rFonts w:asciiTheme="minorHAnsi" w:eastAsiaTheme="minorEastAsia" w:hAnsiTheme="minorHAnsi" w:cstheme="minorBidi"/>
               <w:noProof/>
               <w:kern w:val="2"/>
-              <w:sz w:val="22"/>
-              <w:szCs w:val="22"/>
+              <w:lang w:val="en-NP"/>
               <w14:ligatures w14:val="standardContextual"/>
             </w:rPr>
           </w:pPr>
@@ -2765,7 +2752,7 @@
           <w:r>
             <w:fldChar w:fldCharType="separate"/>
           </w:r>
-          <w:hyperlink w:anchor="_Toc178930660" w:history="1">
+          <w:hyperlink w:anchor="_Toc238668792" w:history="1">
             <w:r>
               <w:rPr>
                 <w:rStyle w:val="Hyperlink"/>
@@ -2792,7 +2779,7 @@
                 <w:noProof/>
                 <w:webHidden/>
               </w:rPr>
-              <w:instrText xml:space="preserve"> PAGEREF _Toc178930660 \h </w:instrText>
+              <w:instrText xml:space="preserve"> PAGEREF _Toc238668792 \h </w:instrText>
             </w:r>
             <w:r>
               <w:rPr>
@@ -2830,12 +2817,11 @@
               <w:rFonts w:asciiTheme="minorHAnsi" w:eastAsiaTheme="minorEastAsia" w:hAnsiTheme="minorHAnsi" w:cstheme="minorBidi"/>
               <w:noProof/>
               <w:kern w:val="2"/>
-              <w:sz w:val="22"/>
-              <w:szCs w:val="22"/>
+              <w:lang w:val="en-NP"/>
               <w14:ligatures w14:val="standardContextual"/>
             </w:rPr>
           </w:pPr>
-          <w:hyperlink w:anchor="_Toc178930661" w:history="1">
+          <w:hyperlink w:anchor="_Toc238668793" w:history="1">
             <w:r>
               <w:rPr>
                 <w:rStyle w:val="Hyperlink"/>
@@ -2862,7 +2848,7 @@
                 <w:noProof/>
                 <w:webHidden/>
               </w:rPr>
-              <w:instrText xml:space="preserve"> PAGEREF _Toc178930661 \h </w:instrText>
+              <w:instrText xml:space="preserve"> PAGEREF _Toc238668793 \h </w:instrText>
             </w:r>
             <w:r>
               <w:rPr>
@@ -2900,12 +2886,11 @@
               <w:rFonts w:asciiTheme="minorHAnsi" w:eastAsiaTheme="minorEastAsia" w:hAnsiTheme="minorHAnsi" w:cstheme="minorBidi"/>
               <w:noProof/>
               <w:kern w:val="2"/>
-              <w:sz w:val="22"/>
-              <w:szCs w:val="22"/>
+              <w:lang w:val="en-NP"/>
               <w14:ligatures w14:val="standardContextual"/>
             </w:rPr>
           </w:pPr>
-          <w:hyperlink w:anchor="_Toc178930662" w:history="1">
+          <w:hyperlink w:anchor="_Toc238668794" w:history="1">
             <w:r>
               <w:rPr>
                 <w:rStyle w:val="Hyperlink"/>
@@ -2932,7 +2917,7 @@
                 <w:noProof/>
                 <w:webHidden/>
               </w:rPr>
-              <w:instrText xml:space="preserve"> PAGEREF _Toc178930662 \h </w:instrText>
+              <w:instrText xml:space="preserve"> PAGEREF _Toc238668794 \h </w:instrText>
             </w:r>
             <w:r>
               <w:rPr>
@@ -2970,12 +2955,11 @@
               <w:rFonts w:asciiTheme="minorHAnsi" w:eastAsiaTheme="minorEastAsia" w:hAnsiTheme="minorHAnsi" w:cstheme="minorBidi"/>
               <w:noProof/>
               <w:kern w:val="2"/>
-              <w:sz w:val="22"/>
-              <w:szCs w:val="22"/>
+              <w:lang w:val="en-NP"/>
               <w14:ligatures w14:val="standardContextual"/>
             </w:rPr>
           </w:pPr>
-          <w:hyperlink w:anchor="_Toc178930663" w:history="1">
+          <w:hyperlink w:anchor="_Toc238668795" w:history="1">
             <w:r>
               <w:rPr>
                 <w:rStyle w:val="Hyperlink"/>
@@ -3002,7 +2986,7 @@
                 <w:noProof/>
                 <w:webHidden/>
               </w:rPr>
-              <w:instrText xml:space="preserve"> PAGEREF _Toc178930663 \h </w:instrText>
+              <w:instrText xml:space="preserve"> PAGEREF _Toc238668795 \h </w:instrText>
             </w:r>
             <w:r>
               <w:rPr>
@@ -3040,12 +3024,11 @@
               <w:rFonts w:asciiTheme="minorHAnsi" w:eastAsiaTheme="minorEastAsia" w:hAnsiTheme="minorHAnsi" w:cstheme="minorBidi"/>
               <w:noProof/>
               <w:kern w:val="2"/>
-              <w:sz w:val="22"/>
-              <w:szCs w:val="22"/>
+              <w:lang w:val="en-NP"/>
               <w14:ligatures w14:val="standardContextual"/>
             </w:rPr>
           </w:pPr>
-          <w:hyperlink w:anchor="_Toc178930664" w:history="1">
+          <w:hyperlink w:anchor="_Toc238668796" w:history="1">
             <w:r>
               <w:rPr>
                 <w:rStyle w:val="Hyperlink"/>
@@ -3072,7 +3055,7 @@
                 <w:noProof/>
                 <w:webHidden/>
               </w:rPr>
-              <w:instrText xml:space="preserve"> PAGEREF _Toc178930664 \h </w:instrText>
+              <w:instrText xml:space="preserve"> PAGEREF _Toc238668796 \h </w:instrText>
             </w:r>
             <w:r>
               <w:rPr>
@@ -3110,12 +3093,11 @@
               <w:rFonts w:asciiTheme="minorHAnsi" w:eastAsiaTheme="minorEastAsia" w:hAnsiTheme="minorHAnsi" w:cstheme="minorBidi"/>
               <w:noProof/>
               <w:kern w:val="2"/>
-              <w:sz w:val="22"/>
-              <w:szCs w:val="22"/>
+              <w:lang w:val="en-NP"/>
               <w14:ligatures w14:val="standardContextual"/>
             </w:rPr>
           </w:pPr>
-          <w:hyperlink w:anchor="_Toc178930665" w:history="1">
+          <w:hyperlink w:anchor="_Toc238668797" w:history="1">
             <w:r>
               <w:rPr>
                 <w:rStyle w:val="Hyperlink"/>
@@ -3142,7 +3124,7 @@
                 <w:noProof/>
                 <w:webHidden/>
               </w:rPr>
-              <w:instrText xml:space="preserve"> PAGEREF _Toc178930665 \h </w:instrText>
+              <w:instrText xml:space="preserve"> PAGEREF _Toc238668797 \h </w:instrText>
             </w:r>
             <w:r>
               <w:rPr>
@@ -3180,12 +3162,11 @@
               <w:rFonts w:asciiTheme="minorHAnsi" w:eastAsiaTheme="minorEastAsia" w:hAnsiTheme="minorHAnsi" w:cstheme="minorBidi"/>
               <w:noProof/>
               <w:kern w:val="2"/>
-              <w:sz w:val="22"/>
-              <w:szCs w:val="22"/>
+              <w:lang w:val="en-NP"/>
               <w14:ligatures w14:val="standardContextual"/>
             </w:rPr>
           </w:pPr>
-          <w:hyperlink w:anchor="_Toc178930666" w:history="1">
+          <w:hyperlink w:anchor="_Toc238668798" w:history="1">
             <w:r>
               <w:rPr>
                 <w:rStyle w:val="Hyperlink"/>
@@ -3212,7 +3193,7 @@
                 <w:noProof/>
                 <w:webHidden/>
               </w:rPr>
-              <w:instrText xml:space="preserve"> PAGEREF _Toc178930666 \h </w:instrText>
+              <w:instrText xml:space="preserve"> PAGEREF _Toc238668798 \h </w:instrText>
             </w:r>
             <w:r>
               <w:rPr>
@@ -3254,12 +3235,11 @@
               <w:rFonts w:asciiTheme="minorHAnsi" w:eastAsiaTheme="minorEastAsia" w:hAnsiTheme="minorHAnsi" w:cstheme="minorBidi"/>
               <w:noProof/>
               <w:kern w:val="2"/>
-              <w:sz w:val="22"/>
-              <w:szCs w:val="22"/>
+              <w:lang w:val="en-NP"/>
               <w14:ligatures w14:val="standardContextual"/>
             </w:rPr>
           </w:pPr>
-          <w:hyperlink w:anchor="_Toc178930667" w:history="1">
+          <w:hyperlink w:anchor="_Toc238668799" w:history="1">
             <w:r>
               <w:rPr>
                 <w:rStyle w:val="Hyperlink"/>
@@ -3286,7 +3266,7 @@
                 <w:noProof/>
                 <w:webHidden/>
               </w:rPr>
-              <w:instrText xml:space="preserve"> PAGEREF _Toc178930667 \h </w:instrText>
+              <w:instrText xml:space="preserve"> PAGEREF _Toc238668799 \h </w:instrText>
             </w:r>
             <w:r>
               <w:rPr>
@@ -3328,12 +3308,11 @@
               <w:rFonts w:asciiTheme="minorHAnsi" w:eastAsiaTheme="minorEastAsia" w:hAnsiTheme="minorHAnsi" w:cstheme="minorBidi"/>
               <w:noProof/>
               <w:kern w:val="2"/>
-              <w:sz w:val="22"/>
-              <w:szCs w:val="22"/>
+              <w:lang w:val="en-NP"/>
               <w14:ligatures w14:val="standardContextual"/>
             </w:rPr>
           </w:pPr>
-          <w:hyperlink w:anchor="_Toc178930668" w:history="1">
+          <w:hyperlink w:anchor="_Toc238668800" w:history="1">
             <w:r>
               <w:rPr>
                 <w:rStyle w:val="Hyperlink"/>
@@ -3360,7 +3339,7 @@
                 <w:noProof/>
                 <w:webHidden/>
               </w:rPr>
-              <w:instrText xml:space="preserve"> PAGEREF _Toc178930668 \h </w:instrText>
+              <w:instrText xml:space="preserve"> PAGEREF _Toc238668800 \h </w:instrText>
             </w:r>
             <w:r>
               <w:rPr>
@@ -3402,12 +3381,11 @@
               <w:rFonts w:asciiTheme="minorHAnsi" w:eastAsiaTheme="minorEastAsia" w:hAnsiTheme="minorHAnsi" w:cstheme="minorBidi"/>
               <w:noProof/>
               <w:kern w:val="2"/>
-              <w:sz w:val="22"/>
-              <w:szCs w:val="22"/>
+              <w:lang w:val="en-NP"/>
               <w14:ligatures w14:val="standardContextual"/>
             </w:rPr>
           </w:pPr>
-          <w:hyperlink w:anchor="_Toc178930669" w:history="1">
+          <w:hyperlink w:anchor="_Toc238668801" w:history="1">
             <w:r>
               <w:rPr>
                 <w:rStyle w:val="Hyperlink"/>
@@ -3434,7 +3412,7 @@
                 <w:noProof/>
                 <w:webHidden/>
               </w:rPr>
-              <w:instrText xml:space="preserve"> PAGEREF _Toc178930669 \h </w:instrText>
+              <w:instrText xml:space="preserve"> PAGEREF _Toc238668801 \h </w:instrText>
             </w:r>
             <w:r>
               <w:rPr>
@@ -3476,12 +3454,11 @@
               <w:rFonts w:asciiTheme="minorHAnsi" w:eastAsiaTheme="minorEastAsia" w:hAnsiTheme="minorHAnsi" w:cstheme="minorBidi"/>
               <w:noProof/>
               <w:kern w:val="2"/>
-              <w:sz w:val="22"/>
-              <w:szCs w:val="22"/>
+              <w:lang w:val="en-NP"/>
               <w14:ligatures w14:val="standardContextual"/>
             </w:rPr>
           </w:pPr>
-          <w:hyperlink w:anchor="_Toc178930670" w:history="1">
+          <w:hyperlink w:anchor="_Toc238668802" w:history="1">
             <w:r>
               <w:rPr>
                 <w:rStyle w:val="Hyperlink"/>
@@ -3508,7 +3485,7 @@
                 <w:noProof/>
                 <w:webHidden/>
               </w:rPr>
-              <w:instrText xml:space="preserve"> PAGEREF _Toc178930670 \h </w:instrText>
+              <w:instrText xml:space="preserve"> PAGEREF _Toc238668802 \h </w:instrText>
             </w:r>
             <w:r>
               <w:rPr>
@@ -3550,12 +3527,11 @@
               <w:rFonts w:asciiTheme="minorHAnsi" w:eastAsiaTheme="minorEastAsia" w:hAnsiTheme="minorHAnsi" w:cstheme="minorBidi"/>
               <w:noProof/>
               <w:kern w:val="2"/>
-              <w:sz w:val="22"/>
-              <w:szCs w:val="22"/>
+              <w:lang w:val="en-NP"/>
               <w14:ligatures w14:val="standardContextual"/>
             </w:rPr>
           </w:pPr>
-          <w:hyperlink w:anchor="_Toc178930671" w:history="1">
+          <w:hyperlink w:anchor="_Toc238668803" w:history="1">
             <w:r>
               <w:rPr>
                 <w:rStyle w:val="Hyperlink"/>
@@ -3582,7 +3558,7 @@
                 <w:noProof/>
                 <w:webHidden/>
               </w:rPr>
-              <w:instrText xml:space="preserve"> PAGEREF _Toc178930671 \h </w:instrText>
+              <w:instrText xml:space="preserve"> PAGEREF _Toc238668803 \h </w:instrText>
             </w:r>
             <w:r>
               <w:rPr>
@@ -3620,12 +3596,11 @@
               <w:rFonts w:asciiTheme="minorHAnsi" w:eastAsiaTheme="minorEastAsia" w:hAnsiTheme="minorHAnsi" w:cstheme="minorBidi"/>
               <w:noProof/>
               <w:kern w:val="2"/>
-              <w:sz w:val="22"/>
-              <w:szCs w:val="22"/>
+              <w:lang w:val="en-NP"/>
               <w14:ligatures w14:val="standardContextual"/>
             </w:rPr>
           </w:pPr>
-          <w:hyperlink w:anchor="_Toc178930672" w:history="1">
+          <w:hyperlink w:anchor="_Toc238668804" w:history="1">
             <w:r>
               <w:rPr>
                 <w:rStyle w:val="Hyperlink"/>
@@ -3652,7 +3627,7 @@
                 <w:noProof/>
                 <w:webHidden/>
               </w:rPr>
-              <w:instrText xml:space="preserve"> PAGEREF _Toc178930672 \h </w:instrText>
+              <w:instrText xml:space="preserve"> PAGEREF _Toc238668804 \h </w:instrText>
             </w:r>
             <w:r>
               <w:rPr>
@@ -3694,12 +3669,11 @@
               <w:rFonts w:asciiTheme="minorHAnsi" w:eastAsiaTheme="minorEastAsia" w:hAnsiTheme="minorHAnsi" w:cstheme="minorBidi"/>
               <w:noProof/>
               <w:kern w:val="2"/>
-              <w:sz w:val="22"/>
-              <w:szCs w:val="22"/>
+              <w:lang w:val="en-NP"/>
               <w14:ligatures w14:val="standardContextual"/>
             </w:rPr>
           </w:pPr>
-          <w:hyperlink w:anchor="_Toc178930673" w:history="1">
+          <w:hyperlink w:anchor="_Toc238668805" w:history="1">
             <w:r>
               <w:rPr>
                 <w:rStyle w:val="Hyperlink"/>
@@ -3726,7 +3700,7 @@
                 <w:noProof/>
                 <w:webHidden/>
               </w:rPr>
-              <w:instrText xml:space="preserve"> PAGEREF _Toc178930673 \h </w:instrText>
+              <w:instrText xml:space="preserve"> PAGEREF _Toc238668805 \h </w:instrText>
             </w:r>
             <w:r>
               <w:rPr>
@@ -3768,12 +3742,11 @@
               <w:rFonts w:asciiTheme="minorHAnsi" w:eastAsiaTheme="minorEastAsia" w:hAnsiTheme="minorHAnsi" w:cstheme="minorBidi"/>
               <w:noProof/>
               <w:kern w:val="2"/>
-              <w:sz w:val="22"/>
-              <w:szCs w:val="22"/>
+              <w:lang w:val="en-NP"/>
               <w14:ligatures w14:val="standardContextual"/>
             </w:rPr>
           </w:pPr>
-          <w:hyperlink w:anchor="_Toc178930674" w:history="1">
+          <w:hyperlink w:anchor="_Toc238668806" w:history="1">
             <w:r>
               <w:rPr>
                 <w:rStyle w:val="Hyperlink"/>
@@ -3800,7 +3773,7 @@
                 <w:noProof/>
                 <w:webHidden/>
               </w:rPr>
-              <w:instrText xml:space="preserve"> PAGEREF _Toc178930674 \h </w:instrText>
+              <w:instrText xml:space="preserve"> PAGEREF _Toc238668806 \h </w:instrText>
             </w:r>
             <w:r>
               <w:rPr>
@@ -3838,12 +3811,11 @@
               <w:rFonts w:asciiTheme="minorHAnsi" w:eastAsiaTheme="minorEastAsia" w:hAnsiTheme="minorHAnsi" w:cstheme="minorBidi"/>
               <w:noProof/>
               <w:kern w:val="2"/>
-              <w:sz w:val="22"/>
-              <w:szCs w:val="22"/>
+              <w:lang w:val="en-NP"/>
               <w14:ligatures w14:val="standardContextual"/>
             </w:rPr>
           </w:pPr>
-          <w:hyperlink w:anchor="_Toc178930675" w:history="1">
+          <w:hyperlink w:anchor="_Toc238668807" w:history="1">
             <w:r>
               <w:rPr>
                 <w:rStyle w:val="Hyperlink"/>
@@ -3870,7 +3842,7 @@
                 <w:noProof/>
                 <w:webHidden/>
               </w:rPr>
-              <w:instrText xml:space="preserve"> PAGEREF _Toc178930675 \h </w:instrText>
+              <w:instrText xml:space="preserve"> PAGEREF _Toc238668807 \h </w:instrText>
             </w:r>
             <w:r>
               <w:rPr>
@@ -3912,12 +3884,11 @@
               <w:rFonts w:asciiTheme="minorHAnsi" w:eastAsiaTheme="minorEastAsia" w:hAnsiTheme="minorHAnsi" w:cstheme="minorBidi"/>
               <w:noProof/>
               <w:kern w:val="2"/>
-              <w:sz w:val="22"/>
-              <w:szCs w:val="22"/>
+              <w:lang w:val="en-NP"/>
               <w14:ligatures w14:val="standardContextual"/>
             </w:rPr>
           </w:pPr>
-          <w:hyperlink w:anchor="_Toc178930676" w:history="1">
+          <w:hyperlink w:anchor="_Toc238668808" w:history="1">
             <w:r>
               <w:rPr>
                 <w:rStyle w:val="Hyperlink"/>
@@ -3944,7 +3915,7 @@
                 <w:noProof/>
                 <w:webHidden/>
               </w:rPr>
-              <w:instrText xml:space="preserve"> PAGEREF _Toc178930676 \h </w:instrText>
+              <w:instrText xml:space="preserve"> PAGEREF _Toc238668808 \h </w:instrText>
             </w:r>
             <w:r>
               <w:rPr>
@@ -3986,12 +3957,11 @@
               <w:rFonts w:asciiTheme="minorHAnsi" w:eastAsiaTheme="minorEastAsia" w:hAnsiTheme="minorHAnsi" w:cstheme="minorBidi"/>
               <w:noProof/>
               <w:kern w:val="2"/>
-              <w:sz w:val="22"/>
-              <w:szCs w:val="22"/>
+              <w:lang w:val="en-NP"/>
               <w14:ligatures w14:val="standardContextual"/>
             </w:rPr>
           </w:pPr>
-          <w:hyperlink w:anchor="_Toc178930677" w:history="1">
+          <w:hyperlink w:anchor="_Toc238668809" w:history="1">
             <w:r>
               <w:rPr>
                 <w:rStyle w:val="Hyperlink"/>
@@ -4018,7 +3988,7 @@
                 <w:noProof/>
                 <w:webHidden/>
               </w:rPr>
-              <w:instrText xml:space="preserve"> PAGEREF _Toc178930677 \h </w:instrText>
+              <w:instrText xml:space="preserve"> PAGEREF _Toc238668809 \h </w:instrText>
             </w:r>
             <w:r>
               <w:rPr>
@@ -4060,18 +4030,17 @@
               <w:rFonts w:asciiTheme="minorHAnsi" w:eastAsiaTheme="minorEastAsia" w:hAnsiTheme="minorHAnsi" w:cstheme="minorBidi"/>
               <w:noProof/>
               <w:kern w:val="2"/>
-              <w:sz w:val="22"/>
-              <w:szCs w:val="22"/>
+              <w:lang w:val="en-NP"/>
               <w14:ligatures w14:val="standardContextual"/>
             </w:rPr>
           </w:pPr>
-          <w:hyperlink w:anchor="_Toc178930678" w:history="1">
+          <w:hyperlink w:anchor="_Toc238668810" w:history="1">
             <w:r>
               <w:rPr>
                 <w:rStyle w:val="Hyperlink"/>
                 <w:noProof/>
               </w:rPr>
-              <w:t>3.1.2 Feasibility Analysis:</w:t>
+              <w:t>3.1.2 Feasibility Analysis</w:t>
             </w:r>
             <w:r>
               <w:rPr>
@@ -4092,7 +4061,7 @@
                 <w:noProof/>
                 <w:webHidden/>
               </w:rPr>
-              <w:instrText xml:space="preserve"> PAGEREF _Toc178930678 \h </w:instrText>
+              <w:instrText xml:space="preserve"> PAGEREF _Toc238668810 \h </w:instrText>
             </w:r>
             <w:r>
               <w:rPr>
@@ -4134,21 +4103,17 @@
               <w:rFonts w:asciiTheme="minorHAnsi" w:eastAsiaTheme="minorEastAsia" w:hAnsiTheme="minorHAnsi" w:cstheme="minorBidi"/>
               <w:noProof/>
               <w:kern w:val="2"/>
-              <w:sz w:val="22"/>
-              <w:szCs w:val="22"/>
+              <w:lang w:val="en-NP"/>
               <w14:ligatures w14:val="standardContextual"/>
             </w:rPr>
           </w:pPr>
-          <w:hyperlink w:anchor="_Toc178930679" w:history="1">
+          <w:hyperlink w:anchor="_Toc238668811" w:history="1">
             <w:r>
               <w:rPr>
                 <w:rStyle w:val="Hyperlink"/>
                 <w:noProof/>
               </w:rPr>
-              <w:t xml:space="preserve">3.1.3 </w:t>
-            </w:r>
-            <w:r>
-              <w:t>System Flow</w:t>
+              <w:t>3.1.3 System Flow</w:t>
             </w:r>
             <w:r>
               <w:rPr>
@@ -4169,7 +4134,7 @@
                 <w:noProof/>
                 <w:webHidden/>
               </w:rPr>
-              <w:instrText xml:space="preserve"> PAGEREF _Toc178930679 \h </w:instrText>
+              <w:instrText xml:space="preserve"> PAGEREF _Toc238668811 \h </w:instrText>
             </w:r>
             <w:r>
               <w:rPr>
@@ -4211,18 +4176,17 @@
               <w:rFonts w:asciiTheme="minorHAnsi" w:eastAsiaTheme="minorEastAsia" w:hAnsiTheme="minorHAnsi" w:cstheme="minorBidi"/>
               <w:noProof/>
               <w:kern w:val="2"/>
-              <w:sz w:val="22"/>
-              <w:szCs w:val="22"/>
+              <w:lang w:val="en-NP"/>
               <w14:ligatures w14:val="standardContextual"/>
             </w:rPr>
           </w:pPr>
-          <w:hyperlink w:anchor="_Toc178930680" w:history="1">
+          <w:hyperlink w:anchor="_Toc238668812" w:history="1">
             <w:r>
               <w:rPr>
                 <w:rStyle w:val="Hyperlink"/>
                 <w:noProof/>
               </w:rPr>
-              <w:t>3.1.4 Process Modeling:</w:t>
+              <w:t>3.1.4 Process Modeling</w:t>
             </w:r>
             <w:r>
               <w:rPr>
@@ -4243,7 +4207,7 @@
                 <w:noProof/>
                 <w:webHidden/>
               </w:rPr>
-              <w:instrText xml:space="preserve"> PAGEREF _Toc178930680 \h </w:instrText>
+              <w:instrText xml:space="preserve"> PAGEREF _Toc238668812 \h </w:instrText>
             </w:r>
             <w:r>
               <w:rPr>
@@ -4285,18 +4249,17 @@
               <w:rFonts w:asciiTheme="minorHAnsi" w:eastAsiaTheme="minorEastAsia" w:hAnsiTheme="minorHAnsi" w:cstheme="minorBidi"/>
               <w:noProof/>
               <w:kern w:val="2"/>
-              <w:sz w:val="22"/>
-              <w:szCs w:val="22"/>
+              <w:lang w:val="en-NP"/>
               <w14:ligatures w14:val="standardContextual"/>
             </w:rPr>
           </w:pPr>
-          <w:hyperlink w:anchor="_Toc178930681" w:history="1">
+          <w:hyperlink w:anchor="_Toc238668813" w:history="1">
             <w:r>
               <w:rPr>
                 <w:rStyle w:val="Hyperlink"/>
                 <w:noProof/>
               </w:rPr>
-              <w:t>3.2 SYSTEM DESIGN:</w:t>
+              <w:t>3.2 SYSTEM DESIGN</w:t>
             </w:r>
             <w:r>
               <w:rPr>
@@ -4317,7 +4280,7 @@
                 <w:noProof/>
                 <w:webHidden/>
               </w:rPr>
-              <w:instrText xml:space="preserve"> PAGEREF _Toc178930681 \h </w:instrText>
+              <w:instrText xml:space="preserve"> PAGEREF _Toc238668813 \h </w:instrText>
             </w:r>
             <w:r>
               <w:rPr>
@@ -4359,18 +4322,17 @@
               <w:rFonts w:asciiTheme="minorHAnsi" w:eastAsiaTheme="minorEastAsia" w:hAnsiTheme="minorHAnsi" w:cstheme="minorBidi"/>
               <w:noProof/>
               <w:kern w:val="2"/>
-              <w:sz w:val="22"/>
-              <w:szCs w:val="22"/>
+              <w:lang w:val="en-NP"/>
               <w14:ligatures w14:val="standardContextual"/>
             </w:rPr>
           </w:pPr>
-          <w:hyperlink w:anchor="_Toc178930682" w:history="1">
+          <w:hyperlink w:anchor="_Toc238668814" w:history="1">
             <w:r>
               <w:rPr>
                 <w:rStyle w:val="Hyperlink"/>
                 <w:noProof/>
               </w:rPr>
-              <w:t>3.2.1 Architecture Design:</w:t>
+              <w:t>3.2.1 Architecture Design</w:t>
             </w:r>
             <w:r>
               <w:rPr>
@@ -4391,7 +4353,7 @@
                 <w:noProof/>
                 <w:webHidden/>
               </w:rPr>
-              <w:instrText xml:space="preserve"> PAGEREF _Toc178930682 \h </w:instrText>
+              <w:instrText xml:space="preserve"> PAGEREF _Toc238668814 \h </w:instrText>
             </w:r>
             <w:r>
               <w:rPr>
@@ -4433,12 +4395,11 @@
               <w:rFonts w:asciiTheme="minorHAnsi" w:eastAsiaTheme="minorEastAsia" w:hAnsiTheme="minorHAnsi" w:cstheme="minorBidi"/>
               <w:noProof/>
               <w:kern w:val="2"/>
-              <w:sz w:val="22"/>
-              <w:szCs w:val="22"/>
+              <w:lang w:val="en-NP"/>
               <w14:ligatures w14:val="standardContextual"/>
             </w:rPr>
           </w:pPr>
-          <w:hyperlink w:anchor="_Toc178930683" w:history="1">
+          <w:hyperlink w:anchor="_Toc238668815" w:history="1">
             <w:r>
               <w:rPr>
                 <w:rStyle w:val="Hyperlink"/>
@@ -4465,7 +4426,7 @@
                 <w:noProof/>
                 <w:webHidden/>
               </w:rPr>
-              <w:instrText xml:space="preserve"> PAGEREF _Toc178930683 \h </w:instrText>
+              <w:instrText xml:space="preserve"> PAGEREF _Toc238668815 \h </w:instrText>
             </w:r>
             <w:r>
               <w:rPr>
@@ -4507,18 +4468,17 @@
               <w:rFonts w:asciiTheme="minorHAnsi" w:eastAsiaTheme="minorEastAsia" w:hAnsiTheme="minorHAnsi" w:cstheme="minorBidi"/>
               <w:noProof/>
               <w:kern w:val="2"/>
-              <w:sz w:val="22"/>
-              <w:szCs w:val="22"/>
+              <w:lang w:val="en-NP"/>
               <w14:ligatures w14:val="standardContextual"/>
             </w:rPr>
           </w:pPr>
-          <w:hyperlink w:anchor="_Toc178930684" w:history="1">
+          <w:hyperlink w:anchor="_Toc238668816" w:history="1">
             <w:r>
               <w:rPr>
                 <w:rStyle w:val="Hyperlink"/>
                 <w:noProof/>
               </w:rPr>
-              <w:t>3.2.3 Interface Design:</w:t>
+              <w:t>3.2.3 Interface Design</w:t>
             </w:r>
             <w:r>
               <w:rPr>
@@ -4539,7 +4499,7 @@
                 <w:noProof/>
                 <w:webHidden/>
               </w:rPr>
-              <w:instrText xml:space="preserve"> PAGEREF _Toc178930684 \h </w:instrText>
+              <w:instrText xml:space="preserve"> PAGEREF _Toc238668816 \h </w:instrText>
             </w:r>
             <w:r>
               <w:rPr>
@@ -4581,12 +4541,11 @@
               <w:rFonts w:asciiTheme="minorHAnsi" w:eastAsiaTheme="minorEastAsia" w:hAnsiTheme="minorHAnsi" w:cstheme="minorBidi"/>
               <w:noProof/>
               <w:kern w:val="2"/>
-              <w:sz w:val="22"/>
-              <w:szCs w:val="22"/>
+              <w:lang w:val="en-NP"/>
               <w14:ligatures w14:val="standardContextual"/>
             </w:rPr>
           </w:pPr>
-          <w:hyperlink w:anchor="_Toc178930685" w:history="1">
+          <w:hyperlink w:anchor="_Toc238668817" w:history="1">
             <w:r>
               <w:rPr>
                 <w:rStyle w:val="Hyperlink"/>
@@ -4613,7 +4572,7 @@
                 <w:noProof/>
                 <w:webHidden/>
               </w:rPr>
-              <w:instrText xml:space="preserve"> PAGEREF _Toc178930685 \h </w:instrText>
+              <w:instrText xml:space="preserve"> PAGEREF _Toc238668817 \h </w:instrText>
             </w:r>
             <w:r>
               <w:rPr>
@@ -4651,12 +4610,11 @@
               <w:rFonts w:asciiTheme="minorHAnsi" w:eastAsiaTheme="minorEastAsia" w:hAnsiTheme="minorHAnsi" w:cstheme="minorBidi"/>
               <w:noProof/>
               <w:kern w:val="2"/>
-              <w:sz w:val="22"/>
-              <w:szCs w:val="22"/>
+              <w:lang w:val="en-NP"/>
               <w14:ligatures w14:val="standardContextual"/>
             </w:rPr>
           </w:pPr>
-          <w:hyperlink w:anchor="_Toc178930686" w:history="1">
+          <w:hyperlink w:anchor="_Toc238668818" w:history="1">
             <w:r>
               <w:rPr>
                 <w:rStyle w:val="Hyperlink"/>
@@ -4683,7 +4641,7 @@
                 <w:noProof/>
                 <w:webHidden/>
               </w:rPr>
-              <w:instrText xml:space="preserve"> PAGEREF _Toc178930686 \h </w:instrText>
+              <w:instrText xml:space="preserve"> PAGEREF _Toc238668818 \h </w:instrText>
             </w:r>
             <w:r>
               <w:rPr>
@@ -4725,12 +4683,11 @@
               <w:rFonts w:asciiTheme="minorHAnsi" w:eastAsiaTheme="minorEastAsia" w:hAnsiTheme="minorHAnsi" w:cstheme="minorBidi"/>
               <w:noProof/>
               <w:kern w:val="2"/>
-              <w:sz w:val="22"/>
-              <w:szCs w:val="22"/>
+              <w:lang w:val="en-NP"/>
               <w14:ligatures w14:val="standardContextual"/>
             </w:rPr>
           </w:pPr>
-          <w:hyperlink w:anchor="_Toc178930687" w:history="1">
+          <w:hyperlink w:anchor="_Toc238668819" w:history="1">
             <w:r>
               <w:rPr>
                 <w:rStyle w:val="Hyperlink"/>
@@ -4757,7 +4714,7 @@
                 <w:noProof/>
                 <w:webHidden/>
               </w:rPr>
-              <w:instrText xml:space="preserve"> PAGEREF _Toc178930687 \h </w:instrText>
+              <w:instrText xml:space="preserve"> PAGEREF _Toc238668819 \h </w:instrText>
             </w:r>
             <w:r>
               <w:rPr>
@@ -4799,12 +4756,11 @@
               <w:rFonts w:asciiTheme="minorHAnsi" w:eastAsiaTheme="minorEastAsia" w:hAnsiTheme="minorHAnsi" w:cstheme="minorBidi"/>
               <w:noProof/>
               <w:kern w:val="2"/>
-              <w:sz w:val="22"/>
-              <w:szCs w:val="22"/>
+              <w:lang w:val="en-NP"/>
               <w14:ligatures w14:val="standardContextual"/>
             </w:rPr>
           </w:pPr>
-          <w:hyperlink w:anchor="_Toc178930688" w:history="1">
+          <w:hyperlink w:anchor="_Toc238668820" w:history="1">
             <w:r>
               <w:rPr>
                 <w:rStyle w:val="Hyperlink"/>
@@ -4831,7 +4787,7 @@
                 <w:noProof/>
                 <w:webHidden/>
               </w:rPr>
-              <w:instrText xml:space="preserve"> PAGEREF _Toc178930688 \h </w:instrText>
+              <w:instrText xml:space="preserve"> PAGEREF _Toc238668820 \h </w:instrText>
             </w:r>
             <w:r>
               <w:rPr>
@@ -4873,12 +4829,11 @@
               <w:rFonts w:asciiTheme="minorHAnsi" w:eastAsiaTheme="minorEastAsia" w:hAnsiTheme="minorHAnsi" w:cstheme="minorBidi"/>
               <w:noProof/>
               <w:kern w:val="2"/>
-              <w:sz w:val="22"/>
-              <w:szCs w:val="22"/>
+              <w:lang w:val="en-NP"/>
               <w14:ligatures w14:val="standardContextual"/>
             </w:rPr>
           </w:pPr>
-          <w:hyperlink w:anchor="_Toc178930689" w:history="1">
+          <w:hyperlink w:anchor="_Toc238668821" w:history="1">
             <w:r>
               <w:rPr>
                 <w:rStyle w:val="Hyperlink"/>
@@ -4905,7 +4860,7 @@
                 <w:noProof/>
                 <w:webHidden/>
               </w:rPr>
-              <w:instrText xml:space="preserve"> PAGEREF _Toc178930689 \h </w:instrText>
+              <w:instrText xml:space="preserve"> PAGEREF _Toc238668821 \h </w:instrText>
             </w:r>
             <w:r>
               <w:rPr>
@@ -4947,12 +4902,11 @@
               <w:rFonts w:asciiTheme="minorHAnsi" w:eastAsiaTheme="minorEastAsia" w:hAnsiTheme="minorHAnsi" w:cstheme="minorBidi"/>
               <w:noProof/>
               <w:kern w:val="2"/>
-              <w:sz w:val="22"/>
-              <w:szCs w:val="22"/>
+              <w:lang w:val="en-NP"/>
               <w14:ligatures w14:val="standardContextual"/>
             </w:rPr>
           </w:pPr>
-          <w:hyperlink w:anchor="_Toc178930690" w:history="1">
+          <w:hyperlink w:anchor="_Toc238668822" w:history="1">
             <w:r>
               <w:rPr>
                 <w:rStyle w:val="Hyperlink"/>
@@ -4979,7 +4933,7 @@
                 <w:noProof/>
                 <w:webHidden/>
               </w:rPr>
-              <w:instrText xml:space="preserve"> PAGEREF _Toc178930690 \h </w:instrText>
+              <w:instrText xml:space="preserve"> PAGEREF _Toc238668822 \h </w:instrText>
             </w:r>
             <w:r>
               <w:rPr>
@@ -5021,12 +4975,11 @@
               <w:rFonts w:asciiTheme="minorHAnsi" w:eastAsiaTheme="minorEastAsia" w:hAnsiTheme="minorHAnsi" w:cstheme="minorBidi"/>
               <w:noProof/>
               <w:kern w:val="2"/>
-              <w:sz w:val="22"/>
-              <w:szCs w:val="22"/>
+              <w:lang w:val="en-NP"/>
               <w14:ligatures w14:val="standardContextual"/>
             </w:rPr>
           </w:pPr>
-          <w:hyperlink w:anchor="_Toc178930691" w:history="1">
+          <w:hyperlink w:anchor="_Toc238668823" w:history="1">
             <w:r>
               <w:rPr>
                 <w:rStyle w:val="Hyperlink"/>
@@ -5053,7 +5006,7 @@
                 <w:noProof/>
                 <w:webHidden/>
               </w:rPr>
-              <w:instrText xml:space="preserve"> PAGEREF _Toc178930691 \h </w:instrText>
+              <w:instrText xml:space="preserve"> PAGEREF _Toc238668823 \h </w:instrText>
             </w:r>
             <w:r>
               <w:rPr>
@@ -5095,12 +5048,11 @@
               <w:rFonts w:asciiTheme="minorHAnsi" w:eastAsiaTheme="minorEastAsia" w:hAnsiTheme="minorHAnsi" w:cstheme="minorBidi"/>
               <w:noProof/>
               <w:kern w:val="2"/>
-              <w:sz w:val="22"/>
-              <w:szCs w:val="22"/>
+              <w:lang w:val="en-NP"/>
               <w14:ligatures w14:val="standardContextual"/>
             </w:rPr>
           </w:pPr>
-          <w:hyperlink w:anchor="_Toc178930692" w:history="1">
+          <w:hyperlink w:anchor="_Toc238668824" w:history="1">
             <w:r>
               <w:rPr>
                 <w:rStyle w:val="Hyperlink"/>
@@ -5127,7 +5079,7 @@
                 <w:noProof/>
                 <w:webHidden/>
               </w:rPr>
-              <w:instrText xml:space="preserve"> PAGEREF _Toc178930692 \h </w:instrText>
+              <w:instrText xml:space="preserve"> PAGEREF _Toc238668824 \h </w:instrText>
             </w:r>
             <w:r>
               <w:rPr>
@@ -5165,43 +5117,18 @@
               <w:rFonts w:asciiTheme="minorHAnsi" w:eastAsiaTheme="minorEastAsia" w:hAnsiTheme="minorHAnsi" w:cstheme="minorBidi"/>
               <w:noProof/>
               <w:kern w:val="2"/>
-              <w:sz w:val="22"/>
-              <w:szCs w:val="22"/>
+              <w:lang w:val="en-NP"/>
               <w14:ligatures w14:val="standardContextual"/>
             </w:rPr>
           </w:pPr>
-          <w:hyperlink w:anchor="_Toc178930693" w:history="1">
+          <w:hyperlink w:anchor="_Toc238668825" w:history="1">
             <w:r>
               <w:rPr>
                 <w:rStyle w:val="Hyperlink"/>
                 <w:rFonts w:eastAsia="Times New Roman"/>
                 <w:noProof/>
               </w:rPr>
-              <w:t>CHAP</w:t>
-            </w:r>
-            <w:r>
-              <w:rPr>
-                <w:rStyle w:val="Hyperlink"/>
-                <w:rFonts w:eastAsia="Times New Roman"/>
-                <w:noProof/>
-              </w:rPr>
-              <w:t>T</w:t>
-            </w:r>
-            <w:r>
-              <w:rPr>
-                <w:rStyle w:val="Hyperlink"/>
-                <w:rFonts w:eastAsia="Times New Roman"/>
-                <w:noProof/>
-              </w:rPr>
-              <w:t>ER 5: CONCLUSION AND FUTURE RECOMMENDATION</w:t>
-            </w:r>
-            <w:r>
-              <w:rPr>
-                <w:rStyle w:val="Hyperlink"/>
-                <w:rFonts w:eastAsia="Times New Roman"/>
-                <w:noProof/>
-              </w:rPr>
-              <w:t>S</w:t>
+              <w:t>CHAPTER 5: CONCLUSION AND FUTURE RECOMMENDATIONS</w:t>
             </w:r>
             <w:r>
               <w:rPr>
@@ -5222,7 +5149,7 @@
                 <w:noProof/>
                 <w:webHidden/>
               </w:rPr>
-              <w:instrText xml:space="preserve"> PAGEREF _Toc178930693 \h </w:instrText>
+              <w:instrText xml:space="preserve"> PAGEREF _Toc238668825 \h </w:instrText>
             </w:r>
             <w:r>
               <w:rPr>
@@ -5264,12 +5191,11 @@
               <w:rFonts w:asciiTheme="minorHAnsi" w:eastAsiaTheme="minorEastAsia" w:hAnsiTheme="minorHAnsi" w:cstheme="minorBidi"/>
               <w:noProof/>
               <w:kern w:val="2"/>
-              <w:sz w:val="22"/>
-              <w:szCs w:val="22"/>
+              <w:lang w:val="en-NP"/>
               <w14:ligatures w14:val="standardContextual"/>
             </w:rPr>
           </w:pPr>
-          <w:hyperlink w:anchor="_Toc178930694" w:history="1">
+          <w:hyperlink w:anchor="_Toc238668826" w:history="1">
             <w:r>
               <w:rPr>
                 <w:rStyle w:val="Hyperlink"/>
@@ -5296,7 +5222,7 @@
                 <w:noProof/>
                 <w:webHidden/>
               </w:rPr>
-              <w:instrText xml:space="preserve"> PAGEREF _Toc178930694 \h </w:instrText>
+              <w:instrText xml:space="preserve"> PAGEREF _Toc238668826 \h </w:instrText>
             </w:r>
             <w:r>
               <w:rPr>
@@ -5338,25 +5264,17 @@
               <w:rFonts w:asciiTheme="minorHAnsi" w:eastAsiaTheme="minorEastAsia" w:hAnsiTheme="minorHAnsi" w:cstheme="minorBidi"/>
               <w:noProof/>
               <w:kern w:val="2"/>
-              <w:sz w:val="22"/>
-              <w:szCs w:val="22"/>
+              <w:lang w:val="en-NP"/>
               <w14:ligatures w14:val="standardContextual"/>
             </w:rPr>
           </w:pPr>
-          <w:hyperlink w:anchor="_Toc178930695" w:history="1">
+          <w:hyperlink w:anchor="_Toc238668827" w:history="1">
             <w:r>
               <w:rPr>
                 <w:rStyle w:val="Hyperlink"/>
                 <w:noProof/>
               </w:rPr>
-              <w:t>5.2 Lesson Learn</w:t>
-            </w:r>
-            <w:r>
-              <w:rPr>
-                <w:rStyle w:val="Hyperlink"/>
-                <w:noProof/>
-              </w:rPr>
-              <w:t>ed</w:t>
+              <w:t>5.2 Lesson Learned</w:t>
             </w:r>
             <w:r>
               <w:rPr>
@@ -5377,7 +5295,13 @@
                 <w:noProof/>
                 <w:webHidden/>
               </w:rPr>
-              <w:instrText xml:space="preserve"> PAGEREF _Toc178930695 \h </w:instrText>
+              <w:instrText xml:space="preserve"> PAGEREF _Toc238668827 \h </w:instrText>
+            </w:r>
+            <w:r>
+              <w:rPr>
+                <w:noProof/>
+                <w:webHidden/>
+              </w:rPr>
             </w:r>
             <w:r>
               <w:rPr>
@@ -5388,12 +5312,10 @@
             </w:r>
             <w:r>
               <w:rPr>
-                <w:b/>
-                <w:bCs/>
-                <w:noProof/>
-                <w:webHidden/>
-              </w:rPr>
-              <w:t>Error! Bookmark not defined.</w:t>
+                <w:noProof/>
+                <w:webHidden/>
+              </w:rPr>
+              <w:t>28</w:t>
             </w:r>
             <w:r>
               <w:rPr>
@@ -5415,25 +5337,17 @@
               <w:rFonts w:asciiTheme="minorHAnsi" w:eastAsiaTheme="minorEastAsia" w:hAnsiTheme="minorHAnsi" w:cstheme="minorBidi"/>
               <w:noProof/>
               <w:kern w:val="2"/>
-              <w:sz w:val="22"/>
-              <w:szCs w:val="22"/>
+              <w:lang w:val="en-NP"/>
               <w14:ligatures w14:val="standardContextual"/>
             </w:rPr>
           </w:pPr>
-          <w:hyperlink w:anchor="_Toc178930696" w:history="1">
+          <w:hyperlink w:anchor="_Toc238668828" w:history="1">
             <w:r>
               <w:rPr>
                 <w:rStyle w:val="Hyperlink"/>
                 <w:noProof/>
               </w:rPr>
-              <w:t>5.3 Future Recommendation</w:t>
-            </w:r>
-            <w:r>
-              <w:rPr>
-                <w:rStyle w:val="Hyperlink"/>
-                <w:noProof/>
-              </w:rPr>
-              <w:t>s</w:t>
+              <w:t>5.3 Future Recommendations</w:t>
             </w:r>
             <w:r>
               <w:rPr>
@@ -5454,7 +5368,7 @@
                 <w:noProof/>
                 <w:webHidden/>
               </w:rPr>
-              <w:instrText xml:space="preserve"> PAGEREF _Toc178930696 \h </w:instrText>
+              <w:instrText xml:space="preserve"> PAGEREF _Toc238668828 \h </w:instrText>
             </w:r>
             <w:r>
               <w:rPr>
@@ -5492,12 +5406,11 @@
               <w:rFonts w:asciiTheme="minorHAnsi" w:eastAsiaTheme="minorEastAsia" w:hAnsiTheme="minorHAnsi" w:cstheme="minorBidi"/>
               <w:noProof/>
               <w:kern w:val="2"/>
-              <w:sz w:val="22"/>
-              <w:szCs w:val="22"/>
+              <w:lang w:val="en-NP"/>
               <w14:ligatures w14:val="standardContextual"/>
             </w:rPr>
           </w:pPr>
-          <w:hyperlink w:anchor="_Toc178930697" w:history="1">
+          <w:hyperlink w:anchor="_Toc238668829" w:history="1">
             <w:r>
               <w:rPr>
                 <w:rStyle w:val="Hyperlink"/>
@@ -5524,7 +5437,7 @@
                 <w:noProof/>
                 <w:webHidden/>
               </w:rPr>
-              <w:instrText xml:space="preserve"> PAGEREF _Toc178930697 \h </w:instrText>
+              <w:instrText xml:space="preserve"> PAGEREF _Toc238668829 \h </w:instrText>
             </w:r>
             <w:r>
               <w:rPr>
@@ -5562,12 +5475,11 @@
               <w:rFonts w:asciiTheme="minorHAnsi" w:eastAsiaTheme="minorEastAsia" w:hAnsiTheme="minorHAnsi" w:cstheme="minorBidi"/>
               <w:noProof/>
               <w:kern w:val="2"/>
-              <w:sz w:val="22"/>
-              <w:szCs w:val="22"/>
+              <w:lang w:val="en-NP"/>
               <w14:ligatures w14:val="standardContextual"/>
             </w:rPr>
           </w:pPr>
-          <w:hyperlink w:anchor="_Toc178930698" w:history="1">
+          <w:hyperlink w:anchor="_Toc238668830" w:history="1">
             <w:r>
               <w:rPr>
                 <w:rStyle w:val="Hyperlink"/>
@@ -5594,7 +5506,7 @@
                 <w:noProof/>
                 <w:webHidden/>
               </w:rPr>
-              <w:instrText xml:space="preserve"> PAGEREF _Toc178930698 \h </w:instrText>
+              <w:instrText xml:space="preserve"> PAGEREF _Toc238668830 \h </w:instrText>
             </w:r>
             <w:r>
               <w:rPr>
@@ -5661,7 +5573,7 @@
         <w:pStyle w:val="Heading1"/>
         <w:spacing w:before="0" w:after="200"/>
       </w:pPr>
-      <w:bookmarkStart w:id="7" w:name="_Toc178930663"/>
+      <w:bookmarkStart w:id="7" w:name="_Toc238668795"/>
       <w:r>
         <w:lastRenderedPageBreak/>
         <w:t>LIST OF ABBREVIATIONS</w:t>
@@ -5889,7 +5801,7 @@
         <w:pStyle w:val="Heading1"/>
         <w:spacing w:before="0" w:after="200"/>
       </w:pPr>
-      <w:bookmarkStart w:id="8" w:name="_Toc178930664"/>
+      <w:bookmarkStart w:id="8" w:name="_Toc238668796"/>
       <w:r>
         <w:lastRenderedPageBreak/>
         <w:t>LIST OF FIGURES</w:t>
@@ -6913,7 +6825,7 @@
         <w:pStyle w:val="Heading1"/>
         <w:spacing w:before="0" w:after="200"/>
       </w:pPr>
-      <w:bookmarkStart w:id="9" w:name="_Toc178930665"/>
+      <w:bookmarkStart w:id="9" w:name="_Toc238668797"/>
       <w:r>
         <w:lastRenderedPageBreak/>
         <w:t>LIST OF TABLES</w:t>
@@ -7394,7 +7306,7 @@
         <w:pStyle w:val="Heading1"/>
         <w:spacing w:before="0" w:after="200"/>
       </w:pPr>
-      <w:bookmarkStart w:id="10" w:name="_Toc178930666"/>
+      <w:bookmarkStart w:id="10" w:name="_Toc238668798"/>
       <w:r>
         <w:lastRenderedPageBreak/>
         <w:t xml:space="preserve">CHAPTER-1 </w:t>
@@ -7416,7 +7328,7 @@
         <w:spacing w:before="0" w:after="200" w:line="360" w:lineRule="auto"/>
       </w:pPr>
       <w:bookmarkStart w:id="11" w:name="_Toc139172959"/>
-      <w:bookmarkStart w:id="12" w:name="_Toc178930667"/>
+      <w:bookmarkStart w:id="12" w:name="_Toc238668799"/>
       <w:r>
         <w:t>1.1</w:t>
       </w:r>
@@ -7444,7 +7356,7 @@
         <w:pStyle w:val="Heading2"/>
         <w:spacing w:before="0" w:after="200" w:line="360" w:lineRule="auto"/>
       </w:pPr>
-      <w:bookmarkStart w:id="14" w:name="_Toc178930668"/>
+      <w:bookmarkStart w:id="14" w:name="_Toc238668800"/>
       <w:r>
         <w:t xml:space="preserve">1.2 </w:t>
       </w:r>
@@ -7501,7 +7413,7 @@
         <w:spacing w:before="0" w:after="200" w:line="360" w:lineRule="auto"/>
       </w:pPr>
       <w:bookmarkStart w:id="16" w:name="_Toc139172961"/>
-      <w:bookmarkStart w:id="17" w:name="_Toc178930669"/>
+      <w:bookmarkStart w:id="17" w:name="_Toc238668801"/>
       <w:r>
         <w:lastRenderedPageBreak/>
         <w:t>1.</w:t>
@@ -7588,7 +7500,7 @@
         <w:spacing w:before="0" w:after="200" w:line="360" w:lineRule="auto"/>
       </w:pPr>
       <w:bookmarkStart w:id="18" w:name="_Toc139172962"/>
-      <w:bookmarkStart w:id="19" w:name="_Toc178930670"/>
+      <w:bookmarkStart w:id="19" w:name="_Toc238668802"/>
       <w:r>
         <w:t>1.</w:t>
       </w:r>
@@ -7642,7 +7554,7 @@
         <w:spacing w:before="0" w:after="200" w:line="360" w:lineRule="auto"/>
       </w:pPr>
       <w:bookmarkStart w:id="20" w:name="_Toc139172963"/>
-      <w:bookmarkStart w:id="21" w:name="_Toc178930671"/>
+      <w:bookmarkStart w:id="21" w:name="_Toc238668803"/>
       <w:r>
         <w:t>1.5 Report Organization</w:t>
       </w:r>
@@ -7733,7 +7645,7 @@
         <w:spacing w:before="0" w:after="200"/>
       </w:pPr>
       <w:bookmarkStart w:id="22" w:name="_Toc139172964"/>
-      <w:bookmarkStart w:id="23" w:name="_Toc178930672"/>
+      <w:bookmarkStart w:id="23" w:name="_Toc238668804"/>
       <w:r>
         <w:lastRenderedPageBreak/>
         <w:t xml:space="preserve">CHAPTER 2: </w:t>
@@ -7755,7 +7667,7 @@
         <w:spacing w:before="0" w:after="200" w:line="360" w:lineRule="auto"/>
       </w:pPr>
       <w:bookmarkStart w:id="24" w:name="_Toc139172965"/>
-      <w:bookmarkStart w:id="25" w:name="_Toc178930673"/>
+      <w:bookmarkStart w:id="25" w:name="_Toc238668805"/>
       <w:r>
         <w:t xml:space="preserve">2.1 </w:t>
       </w:r>
@@ -7798,7 +7710,7 @@
         <w:spacing w:before="0" w:after="200" w:line="360" w:lineRule="auto"/>
       </w:pPr>
       <w:bookmarkStart w:id="26" w:name="_Toc139172966"/>
-      <w:bookmarkStart w:id="27" w:name="_Toc178930674"/>
+      <w:bookmarkStart w:id="27" w:name="_Toc238668806"/>
       <w:r>
         <w:t>2.2</w:t>
       </w:r>
@@ -8006,7 +7918,7 @@
         <w:pStyle w:val="Heading1"/>
         <w:spacing w:before="0" w:after="200"/>
       </w:pPr>
-      <w:bookmarkStart w:id="29" w:name="_Toc178930675"/>
+      <w:bookmarkStart w:id="29" w:name="_Toc238668807"/>
       <w:r>
         <w:lastRenderedPageBreak/>
         <w:t xml:space="preserve">CHAPTER 3: </w:t>
@@ -8028,7 +7940,7 @@
         <w:spacing w:before="0" w:after="200" w:line="360" w:lineRule="auto"/>
       </w:pPr>
       <w:bookmarkStart w:id="30" w:name="_Toc139172969"/>
-      <w:bookmarkStart w:id="31" w:name="_Toc178930676"/>
+      <w:bookmarkStart w:id="31" w:name="_Toc238668808"/>
       <w:r>
         <w:t>3.1 S</w:t>
       </w:r>
@@ -8061,7 +7973,7 @@
         <w:pStyle w:val="Heading3"/>
       </w:pPr>
       <w:bookmarkStart w:id="32" w:name="_Toc139172970"/>
-      <w:bookmarkStart w:id="33" w:name="_Toc178930677"/>
+      <w:bookmarkStart w:id="33" w:name="_Toc238668809"/>
       <w:r>
         <w:t>3.1.1</w:t>
       </w:r>
@@ -8583,7 +8495,7 @@
         <w:pStyle w:val="Heading3"/>
       </w:pPr>
       <w:bookmarkStart w:id="40" w:name="_Toc139172973"/>
-      <w:bookmarkStart w:id="41" w:name="_Toc178930678"/>
+      <w:bookmarkStart w:id="41" w:name="_Toc238668810"/>
       <w:r>
         <w:lastRenderedPageBreak/>
         <w:t>3.1.2 Feasibility Analysis</w:t>
@@ -9476,7 +9388,7 @@
         <w:br w:type="page"/>
       </w:r>
       <w:bookmarkStart w:id="53" w:name="_Toc139172979"/>
-      <w:bookmarkStart w:id="54" w:name="_Toc178930679"/>
+      <w:bookmarkStart w:id="54" w:name="_Toc238668811"/>
       <w:r>
         <w:rPr>
           <w:noProof/>
@@ -9571,10 +9483,10 @@
         <w:t xml:space="preserve">3.1.3 </w:t>
       </w:r>
       <w:bookmarkEnd w:id="53"/>
+      <w:r>
+        <w:t>System Flow</w:t>
+      </w:r>
       <w:bookmarkEnd w:id="54"/>
-      <w:r>
-        <w:t>System Flow</w:t>
-      </w:r>
     </w:p>
     <w:p>
       <w:pPr>
@@ -10290,7 +10202,7 @@
       <w:pPr>
         <w:pStyle w:val="Heading3"/>
       </w:pPr>
-      <w:bookmarkStart w:id="62" w:name="_Toc178930680"/>
+      <w:bookmarkStart w:id="62" w:name="_Toc238668812"/>
       <w:r>
         <w:lastRenderedPageBreak/>
         <w:t>3.1.4 Process Modeling</w:t>
@@ -10590,7 +10502,7 @@
         </w:rPr>
         <w:lastRenderedPageBreak/>
         <w:drawing>
-          <wp:inline distT="0" distB="0" distL="0" distR="0" wp14:anchorId="6CE558B6" wp14:editId="64D33A94">
+          <wp:inline distT="0" distB="0" distL="0" distR="0" wp14:anchorId="6CE558B6" wp14:editId="740ACBB0">
             <wp:extent cx="5502910" cy="4636135"/>
             <wp:effectExtent l="0" t="0" r="0" b="0"/>
             <wp:docPr id="888746300" name="Picture 8"/>
@@ -10823,7 +10735,7 @@
         <w:spacing w:before="0" w:after="200" w:line="360" w:lineRule="auto"/>
       </w:pPr>
       <w:bookmarkStart w:id="69" w:name="_Toc139172981"/>
-      <w:bookmarkStart w:id="70" w:name="_Toc178930681"/>
+      <w:bookmarkStart w:id="70" w:name="_Toc238668813"/>
       <w:r>
         <w:lastRenderedPageBreak/>
         <w:t>3.2 SYSTEM DESIGN</w:t>
@@ -11036,7 +10948,7 @@
       <w:pPr>
         <w:pStyle w:val="Heading3"/>
       </w:pPr>
-      <w:bookmarkStart w:id="74" w:name="_Toc178930682"/>
+      <w:bookmarkStart w:id="74" w:name="_Toc238668814"/>
       <w:r>
         <w:lastRenderedPageBreak/>
         <w:t>3.2.1 Architecture Design</w:t>
@@ -11259,16 +11171,18 @@
       <w:pPr>
         <w:pStyle w:val="Heading3"/>
       </w:pPr>
-      <w:bookmarkStart w:id="78" w:name="_Toc178930683"/>
+      <w:bookmarkStart w:id="78" w:name="_Toc238668815"/>
       <w:r>
         <w:lastRenderedPageBreak/>
         <w:t>3.2.2 Database Schema Desig</w:t>
       </w:r>
       <w:bookmarkEnd w:id="77"/>
+      <w:r>
+        <w:t>n</w:t>
+      </w:r>
       <w:bookmarkEnd w:id="78"/>
-      <w:r>
-        <w:t>n</w:t>
-      </w:r>
+    </w:p>
+    <w:p>
       <w:r>
         <w:rPr>
           <w:noProof/>
@@ -11502,7 +11416,7 @@
         <w:pStyle w:val="Heading3"/>
       </w:pPr>
       <w:bookmarkStart w:id="81" w:name="_Toc139172984"/>
-      <w:bookmarkStart w:id="82" w:name="_Toc178930684"/>
+      <w:bookmarkStart w:id="82" w:name="_Toc238668816"/>
       <w:r>
         <w:lastRenderedPageBreak/>
         <w:t>3.2.3 Interface Design</w:t>
@@ -11938,7 +11852,7 @@
         <w:pStyle w:val="Heading2"/>
         <w:spacing w:line="360" w:lineRule="auto"/>
       </w:pPr>
-      <w:bookmarkStart w:id="91" w:name="_Toc178930685"/>
+      <w:bookmarkStart w:id="91" w:name="_Toc238668817"/>
       <w:r>
         <w:lastRenderedPageBreak/>
         <w:t xml:space="preserve">3.3 </w:t>
@@ -12271,7 +12185,7 @@
         <w:pStyle w:val="Heading1"/>
         <w:spacing w:before="0" w:after="200"/>
       </w:pPr>
-      <w:bookmarkStart w:id="92" w:name="_Toc178930686"/>
+      <w:bookmarkStart w:id="92" w:name="_Toc238668818"/>
       <w:r>
         <w:lastRenderedPageBreak/>
         <w:t>CHAPTER 4: IMPLEMENTATION AND TESTING</w:t>
@@ -12289,7 +12203,7 @@
         <w:spacing w:before="0" w:after="200" w:line="360" w:lineRule="auto"/>
       </w:pPr>
       <w:bookmarkStart w:id="93" w:name="_Toc139172986"/>
-      <w:bookmarkStart w:id="94" w:name="_Toc178930687"/>
+      <w:bookmarkStart w:id="94" w:name="_Toc238668819"/>
       <w:r>
         <w:t>4.1 I</w:t>
       </w:r>
@@ -12304,7 +12218,7 @@
         <w:pStyle w:val="Heading3"/>
       </w:pPr>
       <w:bookmarkStart w:id="95" w:name="_Toc139172987"/>
-      <w:bookmarkStart w:id="96" w:name="_Toc178930688"/>
+      <w:bookmarkStart w:id="96" w:name="_Toc238668820"/>
       <w:r>
         <w:t>4.1.1 Tools Used</w:t>
       </w:r>
@@ -12445,7 +12359,7 @@
       <w:pPr>
         <w:pStyle w:val="Heading3"/>
       </w:pPr>
-      <w:bookmarkStart w:id="98" w:name="_Toc178930689"/>
+      <w:bookmarkStart w:id="98" w:name="_Toc238668821"/>
       <w:r>
         <w:t>4.1.2 Implementation Details of Modules</w:t>
       </w:r>
@@ -12868,7 +12782,7 @@
         <w:pStyle w:val="Heading2"/>
         <w:spacing w:before="0" w:after="200" w:line="360" w:lineRule="auto"/>
       </w:pPr>
-      <w:bookmarkStart w:id="99" w:name="_Toc178930690"/>
+      <w:bookmarkStart w:id="99" w:name="_Toc238668822"/>
       <w:r>
         <w:lastRenderedPageBreak/>
         <w:t>4.2 Testin</w:t>
@@ -12891,7 +12805,7 @@
       <w:pPr>
         <w:pStyle w:val="Heading3"/>
       </w:pPr>
-      <w:bookmarkStart w:id="100" w:name="_Toc178930691"/>
+      <w:bookmarkStart w:id="100" w:name="_Toc238668823"/>
       <w:r>
         <w:t xml:space="preserve">4.2.1 Test Case </w:t>
       </w:r>
@@ -16441,7 +16355,7 @@
           <w:noProof/>
         </w:rPr>
       </w:pPr>
-      <w:bookmarkStart w:id="105" w:name="_Toc178930692"/>
+      <w:bookmarkStart w:id="105" w:name="_Toc238668824"/>
       <w:r>
         <w:rPr>
           <w:noProof/>
@@ -16935,7 +16849,7 @@
           <w:rFonts w:eastAsia="Times New Roman"/>
         </w:rPr>
       </w:pPr>
-      <w:bookmarkStart w:id="106" w:name="_Toc178930693"/>
+      <w:bookmarkStart w:id="106" w:name="_Toc238668825"/>
       <w:r>
         <w:rPr>
           <w:rFonts w:eastAsia="Times New Roman"/>
@@ -16961,13 +16875,13 @@
         </w:rPr>
         <w:t>CONCLUSION AND FUTURE RECOMMENDATION</w:t>
       </w:r>
+      <w:r>
+        <w:rPr>
+          <w:rFonts w:eastAsia="Times New Roman"/>
+        </w:rPr>
+        <w:t>S</w:t>
+      </w:r>
       <w:bookmarkEnd w:id="106"/>
-      <w:r>
-        <w:rPr>
-          <w:rFonts w:eastAsia="Times New Roman"/>
-        </w:rPr>
-        <w:t>S</w:t>
-      </w:r>
     </w:p>
     <w:p/>
     <w:p>
@@ -16975,7 +16889,7 @@
         <w:pStyle w:val="Heading2"/>
         <w:spacing w:before="0" w:after="200" w:line="360" w:lineRule="auto"/>
       </w:pPr>
-      <w:bookmarkStart w:id="107" w:name="_Toc178930694"/>
+      <w:bookmarkStart w:id="107" w:name="_Toc238668826"/>
       <w:r>
         <w:t>5.</w:t>
       </w:r>
@@ -17004,6 +16918,7 @@
         <w:pStyle w:val="Heading2"/>
         <w:spacing w:before="0" w:after="200" w:line="360" w:lineRule="auto"/>
       </w:pPr>
+      <w:bookmarkStart w:id="108" w:name="_Toc238668827"/>
       <w:r>
         <w:t>5.</w:t>
       </w:r>
@@ -17016,6 +16931,7 @@
       <w:r>
         <w:t>ed</w:t>
       </w:r>
+      <w:bookmarkEnd w:id="108"/>
     </w:p>
     <w:p>
       <w:pPr>
@@ -17140,15 +17056,15 @@
         <w:pStyle w:val="Heading2"/>
         <w:spacing w:before="0" w:after="200" w:line="360" w:lineRule="auto"/>
       </w:pPr>
-      <w:bookmarkStart w:id="108" w:name="_Toc178930696"/>
+      <w:bookmarkStart w:id="109" w:name="_Toc238668828"/>
       <w:r>
         <w:lastRenderedPageBreak/>
         <w:t>5.3 Future Recommendation</w:t>
       </w:r>
-      <w:bookmarkEnd w:id="108"/>
       <w:r>
         <w:t>s</w:t>
       </w:r>
+      <w:bookmarkEnd w:id="109"/>
     </w:p>
     <w:p>
       <w:pPr>
@@ -17283,7 +17199,7 @@
         <w:br w:type="page"/>
       </w:r>
     </w:p>
-    <w:bookmarkStart w:id="109" w:name="_Toc178930697" w:displacedByCustomXml="next"/>
+    <w:bookmarkStart w:id="110" w:name="_Toc238668829" w:displacedByCustomXml="next"/>
     <w:sdt>
       <w:sdtPr>
         <w:rPr>
@@ -17308,7 +17224,7 @@
           <w:r>
             <w:t>REFERENCE</w:t>
           </w:r>
-          <w:bookmarkEnd w:id="109"/>
+          <w:bookmarkEnd w:id="110"/>
         </w:p>
         <w:sdt>
           <w:sdtPr>
@@ -17582,7 +17498,6 @@
           <w:szCs w:val="32"/>
         </w:rPr>
       </w:pPr>
-      <w:bookmarkStart w:id="110" w:name="_Toc178930698"/>
       <w:r>
         <w:br w:type="page"/>
       </w:r>
@@ -17592,6 +17507,7 @@
         <w:pStyle w:val="Heading1"/>
         <w:spacing w:before="0" w:after="200"/>
       </w:pPr>
+      <w:bookmarkStart w:id="111" w:name="_Toc238668830"/>
       <w:r>
         <w:lastRenderedPageBreak/>
         <w:t>A</w:t>
@@ -17599,7 +17515,7 @@
       <w:r>
         <w:t>PPENDICES</w:t>
       </w:r>
-      <w:bookmarkEnd w:id="110"/>
+      <w:bookmarkEnd w:id="111"/>
     </w:p>
     <w:p>
       <w:r>
@@ -17607,7 +17523,7 @@
           <w:noProof/>
         </w:rPr>
         <w:drawing>
-          <wp:anchor distT="0" distB="0" distL="114300" distR="114300" simplePos="0" relativeHeight="251689984" behindDoc="1" locked="0" layoutInCell="1" allowOverlap="1" wp14:anchorId="4FBC15E0" wp14:editId="32C9050B">
+          <wp:anchor distT="0" distB="0" distL="114300" distR="114300" simplePos="0" relativeHeight="251689984" behindDoc="1" locked="0" layoutInCell="1" allowOverlap="1" wp14:anchorId="4FBC15E0" wp14:editId="0BA5D5E1">
             <wp:simplePos x="0" y="0"/>
             <wp:positionH relativeFrom="margin">
               <wp:align>center</wp:align>
@@ -17823,7 +17739,7 @@
           <w:noProof/>
         </w:rPr>
         <w:drawing>
-          <wp:anchor distT="0" distB="0" distL="114300" distR="114300" simplePos="0" relativeHeight="251691008" behindDoc="1" locked="0" layoutInCell="1" allowOverlap="1" wp14:anchorId="0B601700" wp14:editId="2A484D44">
+          <wp:anchor distT="0" distB="0" distL="114300" distR="114300" simplePos="0" relativeHeight="251691008" behindDoc="1" locked="0" layoutInCell="1" allowOverlap="1" wp14:anchorId="0B601700" wp14:editId="459BF8D5">
             <wp:simplePos x="0" y="0"/>
             <wp:positionH relativeFrom="margin">
               <wp:align>center</wp:align>
@@ -18845,7 +18761,7 @@
         </w:rPr>
         <w:lastRenderedPageBreak/>
         <w:drawing>
-          <wp:anchor distT="0" distB="0" distL="114300" distR="114300" simplePos="0" relativeHeight="251693056" behindDoc="1" locked="0" layoutInCell="1" allowOverlap="1" wp14:anchorId="6681BA2E" wp14:editId="6879F8BD">
+          <wp:anchor distT="0" distB="0" distL="114300" distR="114300" simplePos="0" relativeHeight="251693056" behindDoc="1" locked="0" layoutInCell="1" allowOverlap="1" wp14:anchorId="6681BA2E" wp14:editId="62C5495A">
             <wp:simplePos x="0" y="0"/>
             <wp:positionH relativeFrom="margin">
               <wp:posOffset>1280160</wp:posOffset>
@@ -19001,7 +18917,7 @@
         </w:rPr>
         <w:lastRenderedPageBreak/>
         <w:drawing>
-          <wp:anchor distT="0" distB="0" distL="114300" distR="114300" simplePos="0" relativeHeight="251694080" behindDoc="1" locked="0" layoutInCell="1" allowOverlap="1" wp14:anchorId="15B59A6A" wp14:editId="1247D318">
+          <wp:anchor distT="0" distB="0" distL="114300" distR="114300" simplePos="0" relativeHeight="251694080" behindDoc="1" locked="0" layoutInCell="1" allowOverlap="1" wp14:anchorId="15B59A6A" wp14:editId="04D46221">
             <wp:simplePos x="0" y="0"/>
             <wp:positionH relativeFrom="column">
               <wp:posOffset>1082040</wp:posOffset>
@@ -19700,7 +19616,7 @@
         <w:spacing w:line="360" w:lineRule="auto"/>
         <w:jc w:val="center"/>
       </w:pPr>
-      <w:bookmarkStart w:id="111" w:name="_Toc143166109"/>
+      <w:bookmarkStart w:id="112" w:name="_Toc143166109"/>
     </w:p>
     <w:p>
       <w:pPr>
@@ -19713,7 +19629,7 @@
         </w:rPr>
         <w:lastRenderedPageBreak/>
         <w:drawing>
-          <wp:anchor distT="0" distB="0" distL="114300" distR="114300" simplePos="0" relativeHeight="251695104" behindDoc="1" locked="0" layoutInCell="1" allowOverlap="1" wp14:anchorId="7CE6C7D0" wp14:editId="78D80514">
+          <wp:anchor distT="0" distB="0" distL="114300" distR="114300" simplePos="0" relativeHeight="251695104" behindDoc="1" locked="0" layoutInCell="1" allowOverlap="1" wp14:anchorId="7CE6C7D0" wp14:editId="0A4143D8">
             <wp:simplePos x="0" y="0"/>
             <wp:positionH relativeFrom="column">
               <wp:posOffset>1554480</wp:posOffset>
@@ -19842,7 +19758,7 @@
       <w:r>
         <w:t xml:space="preserve">: Test Case for </w:t>
       </w:r>
-      <w:bookmarkEnd w:id="111"/>
+      <w:bookmarkEnd w:id="112"/>
       <w:r>
         <w:t>Invalid and Duplicate input</w:t>
       </w:r>
@@ -19926,7 +19842,7 @@
         <w:spacing w:line="360" w:lineRule="auto"/>
         <w:jc w:val="center"/>
       </w:pPr>
-      <w:bookmarkStart w:id="112" w:name="_Toc143166110"/>
+      <w:bookmarkStart w:id="113" w:name="_Toc143166110"/>
     </w:p>
     <w:p>
       <w:pPr>
@@ -19993,7 +19909,7 @@
       <w:r>
         <w:t xml:space="preserve">: Test Case for </w:t>
       </w:r>
-      <w:bookmarkEnd w:id="112"/>
+      <w:bookmarkEnd w:id="113"/>
       <w:r>
         <w:t>Reset Button</w:t>
       </w:r>
@@ -20009,7 +19925,7 @@
         </w:rPr>
         <w:lastRenderedPageBreak/>
         <w:drawing>
-          <wp:anchor distT="0" distB="0" distL="114300" distR="114300" simplePos="0" relativeHeight="251697152" behindDoc="1" locked="0" layoutInCell="1" allowOverlap="1" wp14:anchorId="1E7F54BA" wp14:editId="5F8E802C">
+          <wp:anchor distT="0" distB="0" distL="114300" distR="114300" simplePos="0" relativeHeight="251697152" behindDoc="1" locked="0" layoutInCell="1" allowOverlap="1" wp14:anchorId="1E7F54BA" wp14:editId="4F9E62CD">
             <wp:simplePos x="0" y="0"/>
             <wp:positionH relativeFrom="page">
               <wp:posOffset>2709545</wp:posOffset>
@@ -20072,7 +19988,7 @@
           </wp:anchor>
         </w:drawing>
       </w:r>
-      <w:bookmarkStart w:id="113" w:name="_Toc143166111"/>
+      <w:bookmarkStart w:id="114" w:name="_Toc143166111"/>
     </w:p>
     <w:p>
       <w:pPr>
@@ -20209,7 +20125,7 @@
       <w:r>
         <w:t>: Test Case for</w:t>
       </w:r>
-      <w:bookmarkEnd w:id="113"/>
+      <w:bookmarkEnd w:id="114"/>
       <w:r>
         <w:t xml:space="preserve"> Solution and Solution Visualization</w:t>
       </w:r>
@@ -20272,7 +20188,7 @@
         <w:spacing w:line="360" w:lineRule="auto"/>
         <w:jc w:val="center"/>
       </w:pPr>
-      <w:bookmarkStart w:id="114" w:name="_Toc143166112"/>
+      <w:bookmarkStart w:id="115" w:name="_Toc143166112"/>
       <w:r>
         <w:rPr>
           <w:noProof/>
@@ -20333,7 +20249,7 @@
       <w:r>
         <w:t xml:space="preserve">: Test Case for </w:t>
       </w:r>
-      <w:bookmarkEnd w:id="114"/>
+      <w:bookmarkEnd w:id="115"/>
       <w:r>
         <w:t xml:space="preserve">Data Transfer </w:t>
       </w:r>
@@ -24096,12 +24012,12 @@
     <w:autoRedefine/>
     <w:uiPriority w:val="39"/>
     <w:unhideWhenUsed/>
-    <w:rsid w:val="00DA5CE8"/>
+    <w:rsid w:val="003A1EFF"/>
     <w:pPr>
       <w:tabs>
         <w:tab w:val="right" w:leader="dot" w:pos="8656"/>
       </w:tabs>
-      <w:spacing w:after="100" w:line="360" w:lineRule="auto"/>
+      <w:spacing w:after="101" w:line="360" w:lineRule="auto"/>
     </w:pPr>
   </w:style>
   <w:style w:type="paragraph" w:styleId="TOC2">

</xml_diff>